<commit_message>
Ajout du document officiel Microsoft Word DOSSIER_STRATEGIQUE_18_EITHING.docx
Co-authored-by: hosongwen2014-netizen <307543822+hosongwen2014-netizen@users.noreply.github.com>
</commit_message>
<xml_diff>
--- a/DOSSIER_STRATEGIQUE_18_EITHING.docx
+++ b/DOSSIER_STRATEGIQUE_18_EITHING.docx
@@ -2,66 +2,167 @@
 <file path=word/document.xml><?xml version="1.0" encoding="utf-8"?>
 <w:document xmlns:wpc="http://schemas.microsoft.com/office/word/2010/wordprocessingCanvas" xmlns:mo="http://schemas.microsoft.com/office/mac/office/2008/main" xmlns:mc="http://schemas.openxmlformats.org/markup-compatibility/2006" xmlns:mv="urn:schemas-microsoft-com:mac:vml" xmlns:o="urn:schemas-microsoft-com:office:office" xmlns:r="http://schemas.openxmlformats.org/officeDocument/2006/relationships" xmlns:m="http://schemas.openxmlformats.org/officeDocument/2006/math" xmlns:v="urn:schemas-microsoft-com:vml" xmlns:wp14="http://schemas.microsoft.com/office/word/2010/wordprocessingDrawing" xmlns:wp="http://schemas.openxmlformats.org/drawingml/2006/wordprocessingDrawing" xmlns:w10="urn:schemas-microsoft-com:office:word" xmlns:w="http://schemas.openxmlformats.org/wordprocessingml/2006/main" xmlns:w14="http://schemas.microsoft.com/office/word/2010/wordml" xmlns:wpg="http://schemas.microsoft.com/office/word/2010/wordprocessingGroup" xmlns:wpi="http://schemas.microsoft.com/office/word/2010/wordprocessingInk" xmlns:wne="http://schemas.microsoft.com/office/word/2006/wordml" xmlns:wps="http://schemas.microsoft.com/office/word/2010/wordprocessingShape" mc:Ignorable="w14 wp14">
   <w:body>
+    <w:tbl>
+      <w:tblPr>
+        <w:tblW w:type="auto" w:w="0"/>
+        <w:jc w:val="center"/>
+        <w:tblLook w:firstColumn="1" w:firstRow="1" w:lastColumn="0" w:lastRow="0" w:noHBand="0" w:noVBand="1" w:val="04A0"/>
+      </w:tblPr>
+      <w:tblGrid>
+        <w:gridCol w:w="9360"/>
+      </w:tblGrid>
+      <w:tr>
+        <w:tc>
+          <w:tcPr>
+            <w:tcW w:type="dxa" w:w="9360"/>
+            <w:shd w:fill="0E2C43"/>
+            <w:tcMar>
+              <w:top w:w="280" w:type="dxa"/>
+              <w:bottom w:w="280" w:type="dxa"/>
+              <w:left w:w="280" w:type="dxa"/>
+              <w:right w:w="280" w:type="dxa"/>
+            </w:tcMar>
+          </w:tcPr>
+          <w:p>
+            <w:pPr>
+              <w:spacing w:after="120"/>
+              <w:jc w:val="center"/>
+            </w:pPr>
+            <w:r>
+              <w:rPr>
+                <w:rFonts w:ascii="Arial" w:hAnsi="Arial"/>
+                <w:b/>
+                <w:color w:val="FFFFFF"/>
+                <w:sz w:val="36"/>
+              </w:rPr>
+              <w:t>DOSSIER STRATÉGIQUE D'INVESTISSEMENT</w:t>
+              <w:br/>
+              <w:t>ET PLAN D'AFFAIRES INDUSTRIEL</w:t>
+            </w:r>
+          </w:p>
+          <w:p>
+            <w:pPr>
+              <w:spacing w:after="0"/>
+              <w:jc w:val="center"/>
+            </w:pPr>
+            <w:r>
+              <w:rPr>
+                <w:rFonts w:ascii="Calibri" w:hAnsi="Calibri"/>
+                <w:i/>
+                <w:color w:val="D9B677"/>
+                <w:sz w:val="24"/>
+              </w:rPr>
+              <w:t>18 EITHING SARL — Kétou, Bénin</w:t>
+              <w:br/>
+              <w:t>Unité Industrielle de Recyclage et Broyage des Déchets Plastiques (PP &amp; PEHD)</w:t>
+            </w:r>
+          </w:p>
+        </w:tc>
+      </w:tr>
+    </w:tbl>
     <w:p>
       <w:pPr>
+        <w:spacing w:after="240"/>
+      </w:pPr>
+    </w:p>
+    <w:tbl>
+      <w:tblPr>
+        <w:tblW w:type="auto" w:w="0"/>
         <w:jc w:val="center"/>
+        <w:tblLook w:firstColumn="1" w:firstRow="1" w:lastColumn="0" w:lastRow="0" w:noHBand="0" w:noVBand="1" w:val="04A0"/>
+      </w:tblPr>
+      <w:tblGrid>
+        <w:gridCol w:w="9360"/>
+      </w:tblGrid>
+      <w:tr>
+        <w:tc>
+          <w:tcPr>
+            <w:tcW w:type="dxa" w:w="9360"/>
+            <w:shd w:fill="F4EFE9"/>
+            <w:tcMar>
+              <w:top w:w="180" w:type="dxa"/>
+              <w:bottom w:w="180" w:type="dxa"/>
+              <w:left w:w="240" w:type="dxa"/>
+              <w:right w:w="240" w:type="dxa"/>
+            </w:tcMar>
+            <w:tcBorders>
+              <w:left w:val="single" w:sz="24" w:space="0" w:color="C99B5B"/>
+              <w:top w:val="none"/>
+              <w:right w:val="none"/>
+              <w:bottom w:val="none"/>
+            </w:tcBorders>
+          </w:tcPr>
+          <w:p>
+            <w:pPr>
+              <w:spacing w:before="0" w:after="80"/>
+            </w:pPr>
+            <w:r>
+              <w:rPr>
+                <w:rFonts w:ascii="Arial" w:hAnsi="Arial"/>
+                <w:b/>
+                <w:color w:val="0E2C43"/>
+                <w:sz w:val="22"/>
+              </w:rPr>
+              <w:t>SYNTHÈSE DU PROJET &amp; DIRECTION GÉNÉRALE</w:t>
+            </w:r>
+          </w:p>
+          <w:p>
+            <w:pPr>
+              <w:spacing w:before="40" w:after="0"/>
+            </w:pPr>
+            <w:r>
+              <w:rPr>
+                <w:rFonts w:ascii="Calibri" w:hAnsi="Calibri"/>
+                <w:i/>
+                <w:color w:val="333333"/>
+                <w:sz w:val="21"/>
+              </w:rPr>
+              <w:t>• Implantation : Kétou (Département du Plateau, République du Bénin)</w:t>
+              <w:br/>
+              <w:t>• Dirigeants : M. Hubert C. TOKPANOU (DG - Finance &amp; Supply Chain) &amp; M. Pedro S. KPONON (Gérant - SST &amp; Ergonomie)</w:t>
+              <w:br/>
+              <w:t>• Besoin de financement : 28 000 000 FCFA (CAPEX &amp; BFR de démarrage)</w:t>
+              <w:br/>
+              <w:t>• Capacité industrielle : 52,8 Tonnes/mois de plastique rigide (45 Tonnes de broyat marchand PP/PEHD)</w:t>
+            </w:r>
+          </w:p>
+        </w:tc>
+      </w:tr>
+    </w:tbl>
+    <w:p>
+      <w:pPr>
+        <w:spacing w:after="120"/>
+      </w:pPr>
+    </w:p>
+    <w:p>
+      <w:pPr>
+        <w:keepNext/>
+        <w:spacing w:before="360" w:after="120"/>
+        <w:pBdr>
+          <w:bottom w:val="single" w:sz="12" w:space="4" w:color="C99B5B"/>
+        </w:pBdr>
       </w:pPr>
       <w:r>
         <w:rPr>
           <w:rFonts w:ascii="Arial" w:hAnsi="Arial"/>
           <w:b/>
           <w:color w:val="0E2C43"/>
-          <w:sz w:val="40"/>
-        </w:rPr>
-        <w:t>DOSSIER STRATÉGIQUE D'INVESTISSEMENT</w:t>
-        <w:br/>
-        <w:t>ET PLAN D'AFFAIRES INDUSTRIEL</w:t>
-      </w:r>
-    </w:p>
-    <w:p>
-      <w:pPr>
-        <w:jc w:val="center"/>
-      </w:pPr>
-      <w:r>
-        <w:rPr>
-          <w:i/>
-          <w:color w:val="555555"/>
-          <w:sz w:val="24"/>
-        </w:rPr>
-        <w:t>ENTREPRISE : 18 EITHING SARL</w:t>
-        <w:br/>
-        <w:t>Kétou, Département du Plateau, République du Bénin</w:t>
-        <w:br/>
-        <w:t>Secteur : Recyclage, Broyage et Valorisation des Déchets Plastiques (PP &amp; PEHD)</w:t>
-      </w:r>
-    </w:p>
-    <w:p/>
-    <w:p>
-      <w:pPr>
-        <w:pStyle w:val="Heading1"/>
-        <w:spacing w:before="280" w:after="120"/>
-      </w:pPr>
-      <w:r>
-        <w:rPr>
-          <w:rFonts w:ascii="Arial" w:hAnsi="Arial"/>
-          <w:b/>
-          <w:color w:val="0E2C43"/>
-          <w:sz w:val="30"/>
+          <w:sz w:val="28"/>
         </w:rPr>
         <w:t>1. RÉSUMÉ EXÉCUTIF &amp; THÈSE D'INVESTISSEMENT</w:t>
       </w:r>
     </w:p>
     <w:p>
       <w:pPr>
-        <w:pStyle w:val="Heading2"/>
-        <w:spacing w:before="240" w:after="80"/>
+        <w:keepNext/>
+        <w:spacing w:before="280" w:after="80"/>
       </w:pPr>
       <w:r>
         <w:rPr>
           <w:rFonts w:ascii="Arial" w:hAnsi="Arial"/>
           <w:b/>
           <w:color w:val="B66A3F"/>
-          <w:sz w:val="26"/>
+          <w:sz w:val="24"/>
         </w:rPr>
         <w:t>1.1 Problématique environnementale et opportunité industrielle au Bénin</w:t>
       </w:r>
@@ -92,15 +193,15 @@
     </w:p>
     <w:p>
       <w:pPr>
-        <w:pStyle w:val="Heading2"/>
-        <w:spacing w:before="240" w:after="80"/>
+        <w:keepNext/>
+        <w:spacing w:before="280" w:after="80"/>
       </w:pPr>
       <w:r>
         <w:rPr>
           <w:rFonts w:ascii="Arial" w:hAnsi="Arial"/>
           <w:b/>
           <w:color w:val="B66A3F"/>
-          <w:sz w:val="26"/>
+          <w:sz w:val="24"/>
         </w:rPr>
         <w:t>1.2 Proposition de valeur unique : Positionnement Kétou vs Littoral/Cotonou</w:t>
       </w:r>
@@ -110,21 +211,12 @@
         <w:spacing w:after="120"/>
       </w:pPr>
       <w:r>
-        <w:t xml:space="preserve">Contrairement aux rares initiatives concentrées dans la zone saturée du Littoral (Cotonou, Akpakpa) caractérisée par un coût du foncier exorbitant, des coûts salariaux élevés et une concurrence acharnée sur le gisement local de déchets, </w:t>
-      </w:r>
-      <w:r>
-        <w:rPr>
-          <w:b/>
-        </w:rPr>
-        <w:t>18 EITHING SARL positionne son unité industrielle de broyage à Kétou (Plateau)</w:t>
-      </w:r>
-      <w:r>
-        <w:t>.</w:t>
+        <w:t>Contrairement aux rares initiatives concentrées dans la zone saturée du Littoral (Cotonou, Akpakpa) caractérisée par un coût du foncier exorbitant, des coûts salariaux élevés et une concurrence acharnée sur le gisement local de déchets, 18 EITHING SARL positionne son unité industrielle de broyage à Kétou (Plateau).</w:t>
       </w:r>
     </w:p>
     <w:p>
       <w:pPr>
-        <w:spacing w:after="120"/>
+        <w:spacing w:after="80"/>
       </w:pPr>
       <w:r>
         <w:t>Ce choix d'implantation stratégique offre des avantages comparatifs déterminants :</w:t>
@@ -133,59 +225,62 @@
     <w:p>
       <w:pPr>
         <w:pStyle w:val="ListBullet"/>
+        <w:spacing w:after="60"/>
       </w:pPr>
-      <w:r/>
       <w:r>
         <w:rPr>
           <w:b/>
+          <w:color w:val="0E2C43"/>
         </w:rPr>
-        <w:t>Gisement transfrontalier et territorial massif :</w:t>
+        <w:t xml:space="preserve">Gisement transfrontalier et territorial massif : </w:t>
       </w:r>
       <w:r>
-        <w:t xml:space="preserve"> Accès direct aux flux de plastiques rigides ménagers et agricoles des départements du Plateau, de Zou, de la Colline, ainsi qu'aux flux informels de la frontière nigériane (à proximité immédiate d'Ihara et d'Igangan).</w:t>
+        <w:t>Accès direct aux flux de plastiques rigides ménagers et agricoles des départements du Plateau, de Zou, de la Colline, ainsi qu'aux flux informels de la frontière nigériane (à proximité immédiate d'Ihara et d'Igangan).</w:t>
       </w:r>
     </w:p>
     <w:p>
       <w:pPr>
         <w:pStyle w:val="ListBullet"/>
+        <w:spacing w:after="60"/>
       </w:pPr>
-      <w:r/>
       <w:r>
         <w:rPr>
           <w:b/>
+          <w:color w:val="0E2C43"/>
         </w:rPr>
-        <w:t>Coût d'exploitation et foncier compétitif :</w:t>
+        <w:t xml:space="preserve">Coût d'exploitation et foncier compétitif : </w:t>
       </w:r>
       <w:r>
-        <w:t xml:space="preserve"> Optimisation majeure du CAPEX d'implantation et des charges fixes d'exploitation (loyer industriel et main-d'œuvre locale qualifiée).</w:t>
+        <w:t>Optimisation majeure du CAPEX d'implantation et des charges fixes d'exploitation (loyer industriel et main-d'œuvre locale qualifiée).</w:t>
       </w:r>
     </w:p>
     <w:p>
       <w:pPr>
         <w:pStyle w:val="ListBullet"/>
+        <w:spacing w:after="60"/>
       </w:pPr>
-      <w:r/>
       <w:r>
         <w:rPr>
           <w:b/>
+          <w:color w:val="0E2C43"/>
         </w:rPr>
-        <w:t>Nœud logistique stratégique :</w:t>
+        <w:t xml:space="preserve">Nœud logistique stratégique : </w:t>
       </w:r>
       <w:r>
-        <w:t xml:space="preserve"> Proximité des grands axes routiers RNIE 4 et RN3 permettant de desservir à la fois le marché du Littoral (Cotonou) et les marchés d'exportation sous-régionaux.</w:t>
+        <w:t>Proximité des grands axes routiers RNIE 4 et RN3 permettant de desservir à la fois le marché du Littoral (Cotonou) et les marchés d'exportation sous-régionaux.</w:t>
       </w:r>
     </w:p>
     <w:p>
       <w:pPr>
-        <w:pStyle w:val="Heading2"/>
-        <w:spacing w:before="240" w:after="80"/>
+        <w:keepNext/>
+        <w:spacing w:before="280" w:after="80"/>
       </w:pPr>
       <w:r>
         <w:rPr>
           <w:rFonts w:ascii="Arial" w:hAnsi="Arial"/>
           <w:b/>
           <w:color w:val="B66A3F"/>
-          <w:sz w:val="26"/>
+          <w:sz w:val="24"/>
         </w:rPr>
         <w:t>1.3 Gouvernance et synergie d'expertises des fondateurs</w:t>
       </w:r>
@@ -200,20 +295,26 @@
     </w:p>
     <w:p>
       <w:pPr>
-        <w:pStyle w:val="ListBullet"/>
+        <w:spacing w:before="80" w:after="40"/>
       </w:pPr>
-      <w:r/>
       <w:r>
         <w:rPr>
           <w:b/>
+          <w:color w:val="0E2C43"/>
         </w:rPr>
-        <w:t>M. Hubert C. TOKPANOU – Directeur Général (Pôle Logistique, Supply Chain &amp; Finance)</w:t>
+        <w:t xml:space="preserve">• M. Hubert C. TOKPANOU </w:t>
       </w:r>
-      <w:r/>
+      <w:r>
+        <w:rPr>
+          <w:i/>
+        </w:rPr>
+        <w:t>– Directeur Général (Pôle Logistique, Supply Chain &amp; Finance)</w:t>
+      </w:r>
     </w:p>
     <w:p>
       <w:pPr>
-        <w:pStyle w:val="ListBullet"/>
+        <w:pStyle w:val="ListBullet2"/>
+        <w:spacing w:after="40"/>
       </w:pPr>
       <w:r>
         <w:t>Expertise approfondie en ingénierie logistique, négociation commerciale, gestion financière et structuration de flux d'approvisionnement complexes.</w:t>
@@ -221,7 +322,8 @@
     </w:p>
     <w:p>
       <w:pPr>
-        <w:pStyle w:val="ListBullet"/>
+        <w:pStyle w:val="ListBullet2"/>
+        <w:spacing w:after="40"/>
       </w:pPr>
       <w:r>
         <w:t>En charge du pilotage de la rentabilité, des relations bancaires et investisseurs, de l'optimisation des coûts de transport et de la sécurisation des contrats d'approvisionnement et de vente.</w:t>
@@ -229,20 +331,26 @@
     </w:p>
     <w:p>
       <w:pPr>
-        <w:pStyle w:val="ListBullet"/>
+        <w:spacing w:before="80" w:after="40"/>
       </w:pPr>
-      <w:r/>
       <w:r>
         <w:rPr>
           <w:b/>
+          <w:color w:val="0E2C43"/>
         </w:rPr>
-        <w:t>M. Pedro S. KPONON – Gérant (Pôle SST, Ergonomie &amp; Santé/Psychologie du Travail)</w:t>
+        <w:t xml:space="preserve">• M. Pedro S. KPONON </w:t>
       </w:r>
-      <w:r/>
+      <w:r>
+        <w:rPr>
+          <w:i/>
+        </w:rPr>
+        <w:t>– Gérant (Pôle SST, Ergonomie &amp; Santé/Psychologie du Travail)</w:t>
+      </w:r>
     </w:p>
     <w:p>
       <w:pPr>
-        <w:pStyle w:val="ListBullet"/>
+        <w:pStyle w:val="ListBullet2"/>
+        <w:spacing w:after="40"/>
       </w:pPr>
       <w:r>
         <w:t>Expert en Santé et Sécurité au Travail (SST), organisation ergonomique des postes et santé mentale/psychologie industrielle.</w:t>
@@ -250,7 +358,8 @@
     </w:p>
     <w:p>
       <w:pPr>
-        <w:pStyle w:val="ListBullet"/>
+        <w:pStyle w:val="ListBullet2"/>
+        <w:spacing w:after="40"/>
       </w:pPr>
       <w:r>
         <w:t>En charge de la conception ergonomique du site, de la réduction de la pénibilité physique sur la chaîne de tri/broyage, de la conformité environnementale et de la politique Zéro Accident.</w:t>
@@ -258,38 +367,41 @@
     </w:p>
     <w:p>
       <w:pPr>
-        <w:pStyle w:val="Heading1"/>
-        <w:spacing w:before="280" w:after="120"/>
+        <w:keepNext/>
+        <w:spacing w:before="360" w:after="120"/>
+        <w:pBdr>
+          <w:bottom w:val="single" w:sz="12" w:space="4" w:color="C99B5B"/>
+        </w:pBdr>
       </w:pPr>
       <w:r>
         <w:rPr>
           <w:rFonts w:ascii="Arial" w:hAnsi="Arial"/>
           <w:b/>
           <w:color w:val="0E2C43"/>
-          <w:sz w:val="30"/>
+          <w:sz w:val="28"/>
         </w:rPr>
         <w:t>2. INGÉNIERIE STRATÉGIQUE &amp; MODÈLE D'AFFAIRES (BUSINESS MODEL CANVAS)</w:t>
       </w:r>
     </w:p>
     <w:p>
       <w:pPr>
-        <w:pStyle w:val="Heading2"/>
-        <w:spacing w:before="240" w:after="80"/>
+        <w:keepNext/>
+        <w:spacing w:before="280" w:after="80"/>
       </w:pPr>
       <w:r>
         <w:rPr>
           <w:rFonts w:ascii="Arial" w:hAnsi="Arial"/>
           <w:b/>
           <w:color w:val="B66A3F"/>
-          <w:sz w:val="26"/>
+          <w:sz w:val="24"/>
         </w:rPr>
-        <w:t>2.1 Analyse synthétique du Business Model Canvas</w:t>
+        <w:t>2.1 Analyse synthétique du Business Model Canvas (BMC)</w:t>
       </w:r>
     </w:p>
     <w:p>
       <w:pPr>
-        <w:pStyle w:val="Heading3"/>
-        <w:spacing w:before="160" w:after="40"/>
+        <w:keepNext/>
+        <w:spacing w:before="200" w:after="40"/>
       </w:pPr>
       <w:r>
         <w:rPr>
@@ -304,30 +416,34 @@
     <w:p>
       <w:pPr>
         <w:pStyle w:val="ListBullet"/>
+        <w:spacing w:after="40"/>
       </w:pPr>
       <w:r>
-        <w:t>Associations de collecteurs informels et grossistes de déchets de la région du Plateau et du Zou.</w:t>
+        <w:t>Associations de collecteurs informels et grossistes de déchets (Plateau/Zou).</w:t>
       </w:r>
     </w:p>
     <w:p>
       <w:pPr>
         <w:pStyle w:val="ListBullet"/>
+        <w:spacing w:after="40"/>
       </w:pPr>
       <w:r>
-        <w:t>Municipalités de Kétou, Pobè et Sakété (concessions de tri sélectif).</w:t>
+        <w:t>Municipalités de Kétou, Pobè et Sakété (concessions de tri).</w:t>
       </w:r>
     </w:p>
     <w:p>
       <w:pPr>
         <w:pStyle w:val="ListBullet"/>
+        <w:spacing w:after="40"/>
       </w:pPr>
       <w:r>
-        <w:t>Fournisseurs d'équipements industriels et sous-traitants de maintenance mécanique.</w:t>
+        <w:t>Fournisseurs d'équipements industriels et sous-traitants de maintenance.</w:t>
       </w:r>
     </w:p>
     <w:p>
       <w:pPr>
         <w:pStyle w:val="ListBullet"/>
+        <w:spacing w:after="40"/>
       </w:pPr>
       <w:r>
         <w:t>Industriels plasturgistes locaux et régionaux (acheteurs de broyat PP/PEHD).</w:t>
@@ -335,16 +451,8 @@
     </w:p>
     <w:p>
       <w:pPr>
-        <w:pStyle w:val="ListBullet"/>
-      </w:pPr>
-      <w:r>
-        <w:t>Banques partenaires et institutions de financement de la transition écologique.</w:t>
-      </w:r>
-    </w:p>
-    <w:p>
-      <w:pPr>
-        <w:pStyle w:val="Heading3"/>
-        <w:spacing w:before="160" w:after="40"/>
+        <w:keepNext/>
+        <w:spacing w:before="200" w:after="40"/>
       </w:pPr>
       <w:r>
         <w:rPr>
@@ -359,14 +467,16 @@
     <w:p>
       <w:pPr>
         <w:pStyle w:val="ListBullet"/>
+        <w:spacing w:after="40"/>
       </w:pPr>
       <w:r>
-        <w:t>Sourcing, pesée et achat des déchets plastiques rigides (bidons, bassines, caisses, casiers, tuyaux).</w:t>
+        <w:t>Sourcing, pesée et achat des déchets plastiques rigides.</w:t>
       </w:r>
     </w:p>
     <w:p>
       <w:pPr>
         <w:pStyle w:val="ListBullet"/>
+        <w:spacing w:after="40"/>
       </w:pPr>
       <w:r>
         <w:t>Tri qualitatif par résine (PP vs PEHD) et par couleur.</w:t>
@@ -375,39 +485,34 @@
     <w:p>
       <w:pPr>
         <w:pStyle w:val="ListBullet"/>
+        <w:spacing w:after="40"/>
       </w:pPr>
       <w:r>
-        <w:t>Lavage, décontamination primaire et séchage solaire/mécanique.</w:t>
+        <w:t>Lavage, décontamination primaire et séchage.</w:t>
       </w:r>
     </w:p>
     <w:p>
       <w:pPr>
         <w:pStyle w:val="ListBullet"/>
+        <w:spacing w:after="40"/>
       </w:pPr>
       <w:r>
-        <w:t>Broyage industriel et calibrage (grilles de 8 à 10 mm).</w:t>
+        <w:t>Broyage industriel et calibrage (grilles 8-10 mm).</w:t>
       </w:r>
     </w:p>
     <w:p>
       <w:pPr>
         <w:pStyle w:val="ListBullet"/>
+        <w:spacing w:after="40"/>
       </w:pPr>
       <w:r>
-        <w:t>Contrôle qualité, conditionnement en sacs Big Bag de 25-50 kg.</w:t>
+        <w:t>Conditionnement en Big Bags (25-50 kg) et livraison.</w:t>
       </w:r>
     </w:p>
     <w:p>
       <w:pPr>
-        <w:pStyle w:val="ListBullet"/>
-      </w:pPr>
-      <w:r>
-        <w:t>Commercialisation et livraison aux usines de transformation.</w:t>
-      </w:r>
-    </w:p>
-    <w:p>
-      <w:pPr>
-        <w:pStyle w:val="Heading3"/>
-        <w:spacing w:before="160" w:after="40"/>
+        <w:keepNext/>
+        <w:spacing w:before="200" w:after="40"/>
       </w:pPr>
       <w:r>
         <w:rPr>
@@ -422,14 +527,16 @@
     <w:p>
       <w:pPr>
         <w:pStyle w:val="ListBullet"/>
+        <w:spacing w:after="40"/>
       </w:pPr>
       <w:r>
-        <w:t>Ligne industrielle de broyage 15 HP robuste et bacs de lavage à recirculation.</w:t>
+        <w:t>Ligne industrielle de broyage 15 HP et bacs de lavage à recirculation.</w:t>
       </w:r>
     </w:p>
     <w:p>
       <w:pPr>
         <w:pStyle w:val="ListBullet"/>
+        <w:spacing w:after="40"/>
       </w:pPr>
       <w:r>
         <w:t>Terrain industriel sécurisé de 1 500 m² à Kétou.</w:t>
@@ -438,23 +545,16 @@
     <w:p>
       <w:pPr>
         <w:pStyle w:val="ListBullet"/>
+        <w:spacing w:after="40"/>
       </w:pPr>
       <w:r>
-        <w:t>Réseau logistique de collecte (camion benne / bâché et points d'apport volontaire).</w:t>
+        <w:t>Réseau logistique de collecte et capital humain formé aux règles SST.</w:t>
       </w:r>
     </w:p>
     <w:p>
       <w:pPr>
-        <w:pStyle w:val="ListBullet"/>
-      </w:pPr>
-      <w:r>
-        <w:t>Capital humain qualifié et formé aux règles SST.</w:t>
-      </w:r>
-    </w:p>
-    <w:p>
-      <w:pPr>
-        <w:pStyle w:val="Heading3"/>
-        <w:spacing w:before="160" w:after="40"/>
+        <w:keepNext/>
+        <w:spacing w:before="200" w:after="40"/>
       </w:pPr>
       <w:r>
         <w:rPr>
@@ -469,37 +569,25 @@
     <w:p>
       <w:pPr>
         <w:pStyle w:val="ListBullet"/>
+        <w:spacing w:after="40"/>
       </w:pPr>
-      <w:r/>
       <w:r>
-        <w:rPr>
-          <w:b/>
-        </w:rPr>
-        <w:t>Pour les plasturgistes :</w:t>
-      </w:r>
-      <w:r>
-        <w:t xml:space="preserve"> Broyats de PP et PEHD purs à 98 %, exempts de contaminants métalliques et terreux, garantissant un taux de charge optimal des extrudeuses et une baisse de 35 % du coût de matière première par rapport à la résine vierge.</w:t>
+        <w:t>Pour les plasturgistes : Broyats purs à 98 %, réduction de 35 % du coût matière vs résine vierge.</w:t>
       </w:r>
     </w:p>
     <w:p>
       <w:pPr>
         <w:pStyle w:val="ListBullet"/>
+        <w:spacing w:after="40"/>
       </w:pPr>
-      <w:r/>
       <w:r>
-        <w:rPr>
-          <w:b/>
-        </w:rPr>
-        <w:t>Pour la collectivité :</w:t>
-      </w:r>
-      <w:r>
-        <w:t xml:space="preserve"> Assainissement territorial, création d'emplois locaux pérennes et structuration financière du secteur informel de la collecte.</w:t>
+        <w:t>Pour la collectivité : Assainissement territorial, création d'emplois locaux pérennes.</w:t>
       </w:r>
     </w:p>
     <w:p>
       <w:pPr>
-        <w:pStyle w:val="Heading3"/>
-        <w:spacing w:before="160" w:after="40"/>
+        <w:keepNext/>
+        <w:spacing w:before="200" w:after="40"/>
       </w:pPr>
       <w:r>
         <w:rPr>
@@ -514,31 +602,25 @@
     <w:p>
       <w:pPr>
         <w:pStyle w:val="ListBullet"/>
+        <w:spacing w:after="40"/>
       </w:pPr>
       <w:r>
-        <w:t>Contrats d'approvisionnement pluriannuels garantissant des volumes et prix stables.</w:t>
+        <w:t>Contrats d'approvisionnement pluriannuels à volumes et prix garantis.</w:t>
       </w:r>
     </w:p>
     <w:p>
       <w:pPr>
         <w:pStyle w:val="ListBullet"/>
+        <w:spacing w:after="40"/>
       </w:pPr>
       <w:r>
-        <w:t>Assistance technique et fourniture d'échantillons de test de granulométrie.</w:t>
+        <w:t>Assistance technique, fourniture d'échantillons et garantie de régularité.</w:t>
       </w:r>
     </w:p>
     <w:p>
       <w:pPr>
-        <w:pStyle w:val="ListBullet"/>
-      </w:pPr>
-      <w:r>
-        <w:t>Service après-vente et garantie de régularité des flux livrés.</w:t>
-      </w:r>
-    </w:p>
-    <w:p>
-      <w:pPr>
-        <w:pStyle w:val="Heading3"/>
-        <w:spacing w:before="160" w:after="40"/>
+        <w:keepNext/>
+        <w:spacing w:before="200" w:after="40"/>
       </w:pPr>
       <w:r>
         <w:rPr>
@@ -553,23 +635,25 @@
     <w:p>
       <w:pPr>
         <w:pStyle w:val="ListBullet"/>
+        <w:spacing w:after="40"/>
       </w:pPr>
       <w:r>
-        <w:t>Vente directe B2B (Équipe commerciale interne).</w:t>
+        <w:t>Vente directe B2B via l'équipe commerciale interne.</w:t>
       </w:r>
     </w:p>
     <w:p>
       <w:pPr>
         <w:pStyle w:val="ListBullet"/>
+        <w:spacing w:after="40"/>
       </w:pPr>
       <w:r>
-        <w:t>Livraisons directes par camionnage dédié vers les usines acheteuses à Cotonou et Porto-Novo.</w:t>
+        <w:t>Livraisons directes par camionnage dédié vers Cotonou et Porto-Novo.</w:t>
       </w:r>
     </w:p>
     <w:p>
       <w:pPr>
-        <w:pStyle w:val="Heading3"/>
-        <w:spacing w:before="160" w:after="40"/>
+        <w:keepNext/>
+        <w:spacing w:before="200" w:after="40"/>
       </w:pPr>
       <w:r>
         <w:rPr>
@@ -584,31 +668,34 @@
     <w:p>
       <w:pPr>
         <w:pStyle w:val="ListBullet"/>
+        <w:spacing w:after="40"/>
       </w:pPr>
       <w:r>
-        <w:t>Fabricants d'emballages plastiques rigides et de conduits BTP.</w:t>
+        <w:t>Fabricants d'emballages plastiques rigides et conduits BTP.</w:t>
       </w:r>
     </w:p>
     <w:p>
       <w:pPr>
         <w:pStyle w:val="ListBullet"/>
+        <w:spacing w:after="40"/>
       </w:pPr>
       <w:r>
-        <w:t>Unités d'injection et de soufflage d'ustensiles ménagers (bassines, seaux).</w:t>
+        <w:t>Unités d'injection/soufflage d'ustensiles ménagers (bassines, seaux).</w:t>
       </w:r>
     </w:p>
     <w:p>
       <w:pPr>
         <w:pStyle w:val="ListBullet"/>
+        <w:spacing w:after="40"/>
       </w:pPr>
       <w:r>
-        <w:t>Exportateurs de matières recyclées vers les marchés sous-régionaux.</w:t>
+        <w:t>Exportateurs sous-régionaux.</w:t>
       </w:r>
     </w:p>
     <w:p>
       <w:pPr>
-        <w:pStyle w:val="Heading3"/>
-        <w:spacing w:before="160" w:after="40"/>
+        <w:keepNext/>
+        <w:spacing w:before="200" w:after="40"/>
       </w:pPr>
       <w:r>
         <w:rPr>
@@ -623,6 +710,7 @@
     <w:p>
       <w:pPr>
         <w:pStyle w:val="ListBullet"/>
+        <w:spacing w:after="40"/>
       </w:pPr>
       <w:r>
         <w:t>Achats de matière brute plastique aux collecteurs (FCFA/kg).</w:t>
@@ -631,39 +719,25 @@
     <w:p>
       <w:pPr>
         <w:pStyle w:val="ListBullet"/>
+        <w:spacing w:after="40"/>
       </w:pPr>
       <w:r>
-        <w:t>Consommation d'énergie (électricité Sbee / groupe électrogène de secours et carburant).</w:t>
+        <w:t>Consommation d'énergie (Sbee triphasé + groupe secours) et carburant.</w:t>
       </w:r>
     </w:p>
     <w:p>
       <w:pPr>
         <w:pStyle w:val="ListBullet"/>
+        <w:spacing w:after="40"/>
       </w:pPr>
       <w:r>
-        <w:t>Masse salariale (opérateurs de tri, conducteurs de machine, encadrement).</w:t>
+        <w:t>Masse salariale (10 personnes) et maintenance préventive.</w:t>
       </w:r>
     </w:p>
     <w:p>
       <w:pPr>
-        <w:pStyle w:val="ListBullet"/>
-      </w:pPr>
-      <w:r>
-        <w:t>Transport et logistique d'approvisionnement et d'expédition.</w:t>
-      </w:r>
-    </w:p>
-    <w:p>
-      <w:pPr>
-        <w:pStyle w:val="ListBullet"/>
-      </w:pPr>
-      <w:r>
-        <w:t>Maintenance préventive et amortissements des équipements.</w:t>
-      </w:r>
-    </w:p>
-    <w:p>
-      <w:pPr>
-        <w:pStyle w:val="Heading3"/>
-        <w:spacing w:before="160" w:after="40"/>
+        <w:keepNext/>
+        <w:spacing w:before="200" w:after="40"/>
       </w:pPr>
       <w:r>
         <w:rPr>
@@ -678,386 +752,421 @@
     <w:p>
       <w:pPr>
         <w:pStyle w:val="ListBullet"/>
+        <w:spacing w:after="40"/>
       </w:pPr>
       <w:r>
-        <w:t>Vente au tonnage de broyat de Polypropylène (PP) calibré.</w:t>
+        <w:t>Vente au tonnage de broyat PP calibré.</w:t>
       </w:r>
     </w:p>
     <w:p>
       <w:pPr>
         <w:pStyle w:val="ListBullet"/>
+        <w:spacing w:after="40"/>
       </w:pPr>
       <w:r>
-        <w:t>Vente au tonnage de broyat de Polyéthylène Haute Densité (PEHD) calibré.</w:t>
+        <w:t>Vente au tonnage de broyat PEHD calibré.</w:t>
       </w:r>
     </w:p>
     <w:p>
       <w:pPr>
         <w:pStyle w:val="ListBullet"/>
+        <w:spacing w:after="40"/>
       </w:pPr>
       <w:r>
-        <w:t>Prestations de broyage à façon pour tiers (sous-traitance).</w:t>
+        <w:t>Prestations de broyage à façon pour tiers.</w:t>
       </w:r>
     </w:p>
     <w:p>
       <w:pPr>
-        <w:pStyle w:val="Heading2"/>
-        <w:spacing w:before="240" w:after="80"/>
+        <w:keepNext/>
+        <w:spacing w:before="280" w:after="80"/>
       </w:pPr>
       <w:r>
         <w:rPr>
           <w:rFonts w:ascii="Arial" w:hAnsi="Arial"/>
           <w:b/>
           <w:color w:val="B66A3F"/>
-          <w:sz w:val="26"/>
+          <w:sz w:val="24"/>
         </w:rPr>
-        <w:t>2.2 Cartographie des flux d'approvisionnement</w:t>
-      </w:r>
-    </w:p>
-    <w:p>
-      <w:pPr>
-        <w:spacing w:after="120"/>
-      </w:pPr>
-      <w:r>
-        <w:t>L'architecture logistique conçue par le pôle Supply Chain s'articule autour de 4 bassins de collecte stratégiques :</w:t>
+        <w:t>2.2 Cartographie des flux d'approvisionnement (4 Bassins Logistiques)</w:t>
       </w:r>
     </w:p>
     <w:p>
       <w:pPr>
         <w:pStyle w:val="ListBullet"/>
+        <w:spacing w:after="60"/>
       </w:pPr>
-      <w:r/>
       <w:r>
         <w:rPr>
           <w:b/>
+          <w:color w:val="0E2C43"/>
         </w:rPr>
-        <w:t>Zone 1 : Bassin Principal de Kétou &amp; Plateau</w:t>
+        <w:t xml:space="preserve">Zone 1 : Bassin Principal de Kétou &amp; Plateau : </w:t>
       </w:r>
       <w:r>
-        <w:t xml:space="preserve"> (Collecte directe, faible coût logistique)</w:t>
+        <w:t>Collecte directe, proximité immédiate, faible coût logistique.</w:t>
       </w:r>
     </w:p>
     <w:p>
       <w:pPr>
         <w:pStyle w:val="ListBullet"/>
+        <w:spacing w:after="60"/>
       </w:pPr>
-      <w:r/>
       <w:r>
         <w:rPr>
           <w:b/>
+          <w:color w:val="0E2C43"/>
         </w:rPr>
-        <w:t>Zone 2 : Bassin Sud - Littoral / Porto-Novo</w:t>
+        <w:t xml:space="preserve">Zone 2 : Bassin Sud - Littoral / Porto-Novo : </w:t>
       </w:r>
       <w:r>
-        <w:t xml:space="preserve"> (Rapatriement par retours à vide des camions de livraison)</w:t>
+        <w:t>Rapatriement optimisé par retours à vide des camions de livraison.</w:t>
       </w:r>
     </w:p>
     <w:p>
       <w:pPr>
         <w:pStyle w:val="ListBullet"/>
+        <w:spacing w:after="60"/>
       </w:pPr>
-      <w:r/>
       <w:r>
         <w:rPr>
           <w:b/>
+          <w:color w:val="0E2C43"/>
         </w:rPr>
-        <w:t>Zone 3 : Bassin Centre &amp; Ouest - Zou / Collines / Abomey / Bohicon</w:t>
+        <w:t xml:space="preserve">Zone 3 : Bassin Centre &amp; Ouest - Zou / Collines : </w:t>
       </w:r>
       <w:r>
-        <w:t xml:space="preserve"> (Points de regroupement partenaires)</w:t>
+        <w:t>Points de regroupement partenaires à Abomey, Bohicon et Dassa.</w:t>
       </w:r>
     </w:p>
     <w:p>
       <w:pPr>
         <w:pStyle w:val="ListBullet"/>
+        <w:spacing w:after="60"/>
       </w:pPr>
-      <w:r/>
       <w:r>
         <w:rPr>
           <w:b/>
+          <w:color w:val="0E2C43"/>
         </w:rPr>
-        <w:t>Zone 4 : Axe Transfrontalier Nigeria</w:t>
+        <w:t xml:space="preserve">Zone 4 : Axe Transfrontalier Nigeria : </w:t>
       </w:r>
       <w:r>
-        <w:t xml:space="preserve"> (Sourcing complémentaire sur opportunités de marché)</w:t>
+        <w:t>Sourcing complémentaire sur opportunités de marché à Ihara/Igangan.</w:t>
       </w:r>
     </w:p>
     <w:p>
       <w:pPr>
-        <w:pStyle w:val="Heading1"/>
-        <w:spacing w:before="280" w:after="120"/>
+        <w:keepNext/>
+        <w:spacing w:before="360" w:after="120"/>
+        <w:pBdr>
+          <w:bottom w:val="single" w:sz="12" w:space="4" w:color="C99B5B"/>
+        </w:pBdr>
       </w:pPr>
       <w:r>
         <w:rPr>
           <w:rFonts w:ascii="Arial" w:hAnsi="Arial"/>
           <w:b/>
           <w:color w:val="0E2C43"/>
-          <w:sz w:val="30"/>
+          <w:sz w:val="28"/>
         </w:rPr>
         <w:t>3. PROCESSUS TECHNIQUE &amp; INGÉNIERIE OPÉRATIONNELLE</w:t>
       </w:r>
     </w:p>
     <w:p>
       <w:pPr>
-        <w:pStyle w:val="Heading2"/>
-        <w:spacing w:before="240" w:after="80"/>
+        <w:keepNext/>
+        <w:spacing w:before="280" w:after="80"/>
       </w:pPr>
       <w:r>
         <w:rPr>
           <w:rFonts w:ascii="Arial" w:hAnsi="Arial"/>
           <w:b/>
           <w:color w:val="B66A3F"/>
-          <w:sz w:val="26"/>
+          <w:sz w:val="24"/>
         </w:rPr>
         <w:t>3.1 Description séquentielle du processus de production (7 Étapes)</w:t>
       </w:r>
     </w:p>
     <w:p>
       <w:pPr>
-        <w:pStyle w:val="ListNumber"/>
+        <w:spacing w:before="60" w:after="60"/>
       </w:pPr>
-      <w:r/>
       <w:r>
         <w:rPr>
           <w:b/>
+          <w:color w:val="0E2C43"/>
         </w:rPr>
-        <w:t>Réception et Pesée à l'Entrée :</w:t>
+        <w:t xml:space="preserve">• Étape 1 : Réception et Pesée à l'Entrée : </w:t>
       </w:r>
       <w:r>
-        <w:t xml:space="preserve"> Contrôle des lots entrants sur pont-bascule / pèse-essieu, enregistrement informatique de la provenance, du poids brut et du type de plastique présumé.</w:t>
+        <w:t>Contrôle des lots entrants sur pèse-essieu, enregistrement informatique de la provenance, du poids brut et de la catégorie de plastique.</w:t>
       </w:r>
     </w:p>
     <w:p>
       <w:pPr>
-        <w:pStyle w:val="ListNumber"/>
+        <w:spacing w:before="60" w:after="60"/>
       </w:pPr>
-      <w:r/>
       <w:r>
         <w:rPr>
           <w:b/>
+          <w:color w:val="0E2C43"/>
         </w:rPr>
-        <w:t>Tri Manuel Sélectif et Dépollution :</w:t>
+        <w:t xml:space="preserve">• Étape 2 : Tri Manuel Sélectif et Dépollution : </w:t>
       </w:r>
       <w:r>
-        <w:t xml:space="preserve"> Séparation rigoureuse par famille polymère (PP vs PEHD) et retrait systématique des corps étrangers (métaux, verre, étiquettes papier, plastiques souples PVC/PET).</w:t>
+        <w:t>Séparation rigoureuse par famille polymère (PP vs PEHD) et retrait systématique des corps étrangers (métaux, verre, papier, PVC/PET).</w:t>
       </w:r>
     </w:p>
     <w:p>
       <w:pPr>
-        <w:pStyle w:val="ListNumber"/>
+        <w:spacing w:before="60" w:after="60"/>
       </w:pPr>
-      <w:r/>
       <w:r>
         <w:rPr>
           <w:b/>
+          <w:color w:val="0E2C43"/>
         </w:rPr>
-        <w:t>Pré-lavage et Dégraissage :</w:t>
+        <w:t xml:space="preserve">• Étape 3 : Pré-lavage et Dégraissage : </w:t>
       </w:r>
       <w:r>
-        <w:t xml:space="preserve"> Trempage dans des bacs de décantation afin d'éliminer les boues, sables et matières organiques superficielles.</w:t>
+        <w:t>Trempage dans des bacs de décantation afin d'éliminer les boues, sables et matières organiques superficielles.</w:t>
       </w:r>
     </w:p>
     <w:p>
       <w:pPr>
-        <w:pStyle w:val="ListNumber"/>
+        <w:spacing w:before="60" w:after="60"/>
       </w:pPr>
-      <w:r/>
       <w:r>
         <w:rPr>
           <w:b/>
+          <w:color w:val="0E2C43"/>
         </w:rPr>
-        <w:t>Broyage Industriel Mécanique :</w:t>
+        <w:t xml:space="preserve">• Étape 4 : Broyage Industriel Mécanique : </w:t>
       </w:r>
       <w:r>
-        <w:t xml:space="preserve"> Alimentation continue du broyeur 15 HP équipé de lames en acier au chrome à haute résistance. Passage à travers une grille de calibrage standard de 8 mm à 10 mm.</w:t>
+        <w:t>Alimentation continue du broyeur 15 HP équipé de lames en acier au chrome à haute résistance. Passage à travers une grille de 8 à 10 mm.</w:t>
       </w:r>
     </w:p>
     <w:p>
       <w:pPr>
-        <w:pStyle w:val="ListNumber"/>
+        <w:spacing w:before="60" w:after="60"/>
       </w:pPr>
-      <w:r/>
       <w:r>
         <w:rPr>
           <w:b/>
+          <w:color w:val="0E2C43"/>
         </w:rPr>
-        <w:t>Lavage Continu &amp; Rinçage :</w:t>
+        <w:t xml:space="preserve">• Étape 5 : Lavage Continu &amp; Rinçage : </w:t>
       </w:r>
       <w:r>
-        <w:t xml:space="preserve"> Lavage haute efficacité des paillettes broyées avec système de clarification et de recyclage de l'eau en circuit fermé (économie de ressource en eau).</w:t>
+        <w:t>Lavage haute efficacité des paillettes broyées avec système de clarification et de recyclage de l'eau en circuit fermé.</w:t>
       </w:r>
     </w:p>
     <w:p>
       <w:pPr>
-        <w:pStyle w:val="ListNumber"/>
+        <w:spacing w:before="60" w:after="60"/>
       </w:pPr>
-      <w:r/>
       <w:r>
         <w:rPr>
           <w:b/>
+          <w:color w:val="0E2C43"/>
         </w:rPr>
-        <w:t>Séchage &amp; Dépoussiérage :</w:t>
+        <w:t xml:space="preserve">• Étape 6 : Séchage &amp; Dépoussiérage : </w:t>
       </w:r>
       <w:r>
-        <w:t xml:space="preserve"> Essorage mécanique suivi d'un passage en serre de séchage solaire renforcée pour ramener l'humidité résiduelle sous la barre des 1 %.</w:t>
+        <w:t>Essorage centrifuge mécanique suivi d'un passage en serre solaire thermiquement optimisée (&lt; 1 % d'humidité).</w:t>
       </w:r>
     </w:p>
     <w:p>
       <w:pPr>
-        <w:pStyle w:val="ListNumber"/>
+        <w:spacing w:before="60" w:after="60"/>
       </w:pPr>
-      <w:r/>
       <w:r>
         <w:rPr>
           <w:b/>
+          <w:color w:val="0E2C43"/>
         </w:rPr>
-        <w:t>Contrôle Qualité &amp; Conditionnement :</w:t>
+        <w:t xml:space="preserve">• Étape 7 : Contrôle Qualité &amp; Conditionnement : </w:t>
       </w:r>
       <w:r>
-        <w:t xml:space="preserve"> Inspection visuelle et granulométrique, ensachage sous Big Bags de 25 kg ou 50 kg, étiquetage (lot, date, type de résine, pureté) et stockage sur palettes.</w:t>
+        <w:t>Inspection visuelle et granulométrique, ensachage sous Big Bags de 25 kg ou 50 kg, étiquetage et stockage sur palettes.</w:t>
       </w:r>
     </w:p>
     <w:p>
       <w:pPr>
-        <w:pStyle w:val="Heading2"/>
-        <w:spacing w:before="240" w:after="80"/>
+        <w:keepNext/>
+        <w:spacing w:before="280" w:after="80"/>
       </w:pPr>
       <w:r>
         <w:rPr>
           <w:rFonts w:ascii="Arial" w:hAnsi="Arial"/>
           <w:b/>
           <w:color w:val="B66A3F"/>
-          <w:sz w:val="26"/>
+          <w:sz w:val="24"/>
         </w:rPr>
         <w:t>3.2 Fiche technique des équipements majeurs</w:t>
       </w:r>
     </w:p>
     <w:p>
       <w:pPr>
-        <w:pStyle w:val="ListBullet"/>
+        <w:keepNext/>
+        <w:spacing w:before="200" w:after="40"/>
       </w:pPr>
-      <w:r/>
       <w:r>
         <w:rPr>
+          <w:rFonts w:ascii="Arial" w:hAnsi="Arial"/>
           <w:b/>
+          <w:color w:val="1F2D3D"/>
+          <w:sz w:val="22"/>
         </w:rPr>
         <w:t>Broyeur Industriel 15 HP (Lame Heavy Duty)</w:t>
-      </w:r>
-      <w:r/>
-    </w:p>
-    <w:p>
-      <w:pPr>
-        <w:pStyle w:val="ListBullet"/>
-      </w:pPr>
-      <w:r>
-        <w:t>Puissance moteur : 11 kW (15 HP) - Triphasé 380V.</w:t>
       </w:r>
     </w:p>
     <w:p>
       <w:pPr>
         <w:pStyle w:val="ListBullet"/>
+        <w:spacing w:after="40"/>
       </w:pPr>
       <w:r>
-        <w:t>Capacité nominale : 250 kg/h à 350 kg/h selon la densité du matériau.</w:t>
+        <w:t>Moteur : 11 kW (15 HP) - Triphasé 380V</w:t>
       </w:r>
     </w:p>
     <w:p>
       <w:pPr>
         <w:pStyle w:val="ListBullet"/>
+        <w:spacing w:after="40"/>
       </w:pPr>
       <w:r>
-        <w:t>Rotor : 3 lames mobiles + 2 lames fixes en acier spécial résistant à l'abrasion.</w:t>
+        <w:t>Capacité nominale : 250 à 350 kg/heure</w:t>
       </w:r>
     </w:p>
     <w:p>
       <w:pPr>
         <w:pStyle w:val="ListBullet"/>
+        <w:spacing w:after="40"/>
       </w:pPr>
       <w:r>
-        <w:t>Diamètre de grille : 8 mm / 10 mm interchangeable.</w:t>
+        <w:t>Rotor : 3 lames mobiles + 2 lames fixes en acier spécial anti-abrasion</w:t>
       </w:r>
     </w:p>
     <w:p>
       <w:pPr>
         <w:pStyle w:val="ListBullet"/>
+        <w:spacing w:after="40"/>
       </w:pPr>
-      <w:r/>
       <w:r>
-        <w:rPr>
-          <w:b/>
-        </w:rPr>
-        <w:t>Système de Bacs de Lavage et Clarification</w:t>
+        <w:t>Grille de calibrage : 8 mm / 10 mm interchangeable</w:t>
       </w:r>
-      <w:r/>
     </w:p>
     <w:p>
       <w:pPr>
-        <w:pStyle w:val="ListBullet"/>
+        <w:keepNext/>
+        <w:spacing w:before="200" w:after="40"/>
       </w:pPr>
       <w:r>
-        <w:t>Capacité : Bacs inox / PEHD haute résistance de 3 000 Litres avec pompe de recirculation et filtres à débris.</w:t>
+        <w:rPr>
+          <w:rFonts w:ascii="Arial" w:hAnsi="Arial"/>
+          <w:b/>
+          <w:color w:val="1F2D3D"/>
+          <w:sz w:val="22"/>
+        </w:rPr>
+        <w:t>Système de Bacs de Lavage et Clarification</w:t>
       </w:r>
     </w:p>
     <w:p>
       <w:pPr>
         <w:pStyle w:val="ListBullet"/>
-      </w:pPr>
-      <w:r/>
-      <w:r>
-        <w:rPr>
-          <w:b/>
-        </w:rPr>
-        <w:t>Serres Solaire de Séchage et Séchoir centrifuge</w:t>
-      </w:r>
-      <w:r/>
-    </w:p>
-    <w:p>
-      <w:pPr>
-        <w:pStyle w:val="ListBullet"/>
+        <w:spacing w:after="40"/>
       </w:pPr>
       <w:r>
-        <w:t>Séchoir centrifuge rotatif 3 kW combiné à une zone de séchage sous serre thermiquement optimisée.</w:t>
+        <w:t>Bacs inox / PEHD haute résistance de 3 000 Litres</w:t>
       </w:r>
     </w:p>
     <w:p>
       <w:pPr>
         <w:pStyle w:val="ListBullet"/>
+        <w:spacing w:after="40"/>
       </w:pPr>
-      <w:r/>
+      <w:r>
+        <w:t>Pompe de recirculation et filtres à débris</w:t>
+      </w:r>
+    </w:p>
+    <w:p>
+      <w:pPr>
+        <w:keepNext/>
+        <w:spacing w:before="200" w:after="40"/>
+      </w:pPr>
       <w:r>
         <w:rPr>
+          <w:rFonts w:ascii="Arial" w:hAnsi="Arial"/>
           <w:b/>
+          <w:color w:val="1F2D3D"/>
+          <w:sz w:val="22"/>
         </w:rPr>
-        <w:t>Balances &amp; Ponts de Pesée</w:t>
+        <w:t>Serres Solaire de Séchage &amp; Centrifugeuse</w:t>
       </w:r>
-      <w:r/>
     </w:p>
     <w:p>
       <w:pPr>
         <w:pStyle w:val="ListBullet"/>
+        <w:spacing w:after="40"/>
       </w:pPr>
       <w:r>
-        <w:t>Pèse-palette électronique de précision (capacité 2 tonnes, précision 500 g).</w:t>
+        <w:t>Séchoir centrifuge rotatif 3 kW</w:t>
       </w:r>
     </w:p>
     <w:p>
       <w:pPr>
-        <w:pStyle w:val="Heading2"/>
-        <w:spacing w:before="240" w:after="80"/>
+        <w:pStyle w:val="ListBullet"/>
+        <w:spacing w:after="40"/>
+      </w:pPr>
+      <w:r>
+        <w:t>Zone de séchage sous serre thermiquement optimisée</w:t>
+      </w:r>
+    </w:p>
+    <w:p>
+      <w:pPr>
+        <w:keepNext/>
+        <w:spacing w:before="200" w:after="40"/>
+      </w:pPr>
+      <w:r>
+        <w:rPr>
+          <w:rFonts w:ascii="Arial" w:hAnsi="Arial"/>
+          <w:b/>
+          <w:color w:val="1F2D3D"/>
+          <w:sz w:val="22"/>
+        </w:rPr>
+        <w:t>Balances &amp; Pèse-Palettes</w:t>
+      </w:r>
+    </w:p>
+    <w:p>
+      <w:pPr>
+        <w:pStyle w:val="ListBullet"/>
+        <w:spacing w:after="40"/>
+      </w:pPr>
+      <w:r>
+        <w:t>Pèse-palette électronique de précision (capacité 2 tonnes, précision 500 g)</w:t>
+      </w:r>
+    </w:p>
+    <w:p>
+      <w:pPr>
+        <w:keepNext/>
+        <w:spacing w:before="280" w:after="80"/>
       </w:pPr>
       <w:r>
         <w:rPr>
           <w:rFonts w:ascii="Arial" w:hAnsi="Arial"/>
           <w:b/>
           <w:color w:val="B66A3F"/>
-          <w:sz w:val="26"/>
+          <w:sz w:val="24"/>
         </w:rPr>
         <w:t>3.3 Plan de gestion Santé, Sécurité au Travail (SST) et Ergonomie</w:t>
       </w:r>
     </w:p>
     <w:p>
       <w:pPr>
-        <w:spacing w:after="120"/>
+        <w:spacing w:after="80"/>
       </w:pPr>
       <w:r>
         <w:t>Conformément à l'expertise apportée par M. Pedro S. KPONON, l'unité de Kétou intègre les meilleurs standards ergonomiques et préventifs :</w:t>
@@ -1065,228 +1174,246 @@
     </w:p>
     <w:p>
       <w:pPr>
-        <w:pStyle w:val="ListBullet"/>
+        <w:keepNext/>
+        <w:spacing w:before="200" w:after="40"/>
       </w:pPr>
-      <w:r/>
       <w:r>
         <w:rPr>
+          <w:rFonts w:ascii="Arial" w:hAnsi="Arial"/>
           <w:b/>
+          <w:color w:val="1F2D3D"/>
+          <w:sz w:val="22"/>
         </w:rPr>
-        <w:t>Réduction de la Pénibilité Physique :</w:t>
-      </w:r>
-      <w:r/>
-    </w:p>
-    <w:p>
-      <w:pPr>
-        <w:pStyle w:val="ListBullet"/>
-      </w:pPr>
-      <w:r>
-        <w:t>Tables de tri surélevées à hauteur réglable évitant les courbures lombaires répétitives.</w:t>
+        <w:t>Réduction de la Pénibilité Physique</w:t>
       </w:r>
     </w:p>
     <w:p>
       <w:pPr>
         <w:pStyle w:val="ListBullet"/>
+        <w:spacing w:after="40"/>
       </w:pPr>
       <w:r>
-        <w:t>Utilisation de transpalettes hydrauliques et gerbeurs pour supprimer le port manuel de charges lourdes supérieur à 25 kg.</w:t>
+        <w:t>Tables de tri surélevées à hauteur réglable évitant les courbures lombaires.</w:t>
       </w:r>
     </w:p>
     <w:p>
       <w:pPr>
         <w:pStyle w:val="ListBullet"/>
+        <w:spacing w:after="40"/>
       </w:pPr>
-      <w:r/>
       <w:r>
-        <w:rPr>
-          <w:b/>
-        </w:rPr>
-        <w:t>Protection Biologique, Auditive et Respiratoire :</w:t>
+        <w:t>Utilisation de transpalettes hydrauliques et gerbeurs pour supprimer le port manuel &gt; 25 kg.</w:t>
       </w:r>
-      <w:r/>
     </w:p>
     <w:p>
       <w:pPr>
-        <w:pStyle w:val="ListBullet"/>
+        <w:keepNext/>
+        <w:spacing w:before="200" w:after="40"/>
       </w:pPr>
       <w:r>
-        <w:t>Équipements de Protection Individuelle (EPI) obligatoires : Masques FFP2 anti-poussière, casques anti-bruit / bouchons moulés (niveau sonore broyeur &lt; 85 dB à la source), gants anti-coupure et chaussures de sécurité S3.</w:t>
+        <w:rPr>
+          <w:rFonts w:ascii="Arial" w:hAnsi="Arial"/>
+          <w:b/>
+          <w:color w:val="1F2D3D"/>
+          <w:sz w:val="22"/>
+        </w:rPr>
+        <w:t>Protection Biologique, Auditive et Respiratoire</w:t>
       </w:r>
     </w:p>
     <w:p>
       <w:pPr>
         <w:pStyle w:val="ListBullet"/>
+        <w:spacing w:after="40"/>
       </w:pPr>
-      <w:r/>
       <w:r>
-        <w:rPr>
-          <w:b/>
-        </w:rPr>
-        <w:t>Aspiration à la source :</w:t>
+        <w:t>Port obligatoire des EPI : Masques FFP2, casques anti-bruit / bouchons moulés (&lt; 85 dB), gants anti-coupure et chaussures S3.</w:t>
       </w:r>
-      <w:r/>
     </w:p>
     <w:p>
       <w:pPr>
-        <w:pStyle w:val="ListBullet"/>
+        <w:keepNext/>
+        <w:spacing w:before="200" w:after="40"/>
       </w:pPr>
       <w:r>
-        <w:t>Aspiration centralisée des poussières légères de plastique au niveau de la sortie du broyeur.</w:t>
+        <w:rPr>
+          <w:rFonts w:ascii="Arial" w:hAnsi="Arial"/>
+          <w:b/>
+          <w:color w:val="1F2D3D"/>
+          <w:sz w:val="22"/>
+        </w:rPr>
+        <w:t>Aspiration à la source</w:t>
       </w:r>
     </w:p>
     <w:p>
       <w:pPr>
         <w:pStyle w:val="ListBullet"/>
+        <w:spacing w:after="40"/>
       </w:pPr>
-      <w:r/>
       <w:r>
-        <w:rPr>
-          <w:b/>
-        </w:rPr>
-        <w:t>Programme de Santé Mentale et Suivi Ergonomique :</w:t>
+        <w:t>Aspiration centralisée des poussières légères au niveau de la sortie du broyeur.</w:t>
       </w:r>
-      <w:r/>
     </w:p>
     <w:p>
       <w:pPr>
-        <w:pStyle w:val="ListBullet"/>
+        <w:keepNext/>
+        <w:spacing w:before="200" w:after="40"/>
       </w:pPr>
       <w:r>
-        <w:t>Rotation systématique des postes toutes les 2 heures entre le tri, le lavage et l'emballage afin de prévenir la fatigue visuelle et la monotonie.</w:t>
+        <w:rPr>
+          <w:rFonts w:ascii="Arial" w:hAnsi="Arial"/>
+          <w:b/>
+          <w:color w:val="1F2D3D"/>
+          <w:sz w:val="22"/>
+        </w:rPr>
+        <w:t>Programme de Santé Mentale et Suivi Ergonomique</w:t>
       </w:r>
     </w:p>
     <w:p>
       <w:pPr>
         <w:pStyle w:val="ListBullet"/>
+        <w:spacing w:after="40"/>
       </w:pPr>
       <w:r>
-        <w:t>Entretiens individuels réguliers de suivi psychologique du travail et gestion du stress opérationnel.</w:t>
+        <w:t>Rotation systématique des postes toutes les 2 heures entre le tri, le lavage et l'emballage.</w:t>
       </w:r>
     </w:p>
     <w:p>
       <w:pPr>
-        <w:pStyle w:val="Heading1"/>
-        <w:spacing w:before="280" w:after="120"/>
+        <w:pStyle w:val="ListBullet"/>
+        <w:spacing w:after="40"/>
+      </w:pPr>
+      <w:r>
+        <w:t>Entretiens individuels réguliers de suivi psychologique du travail et gestion du stress.</w:t>
+      </w:r>
+    </w:p>
+    <w:p>
+      <w:pPr>
+        <w:keepNext/>
+        <w:spacing w:before="360" w:after="120"/>
+        <w:pBdr>
+          <w:bottom w:val="single" w:sz="12" w:space="4" w:color="C99B5B"/>
+        </w:pBdr>
       </w:pPr>
       <w:r>
         <w:rPr>
           <w:rFonts w:ascii="Arial" w:hAnsi="Arial"/>
           <w:b/>
           <w:color w:val="0E2C43"/>
-          <w:sz w:val="30"/>
+          <w:sz w:val="28"/>
         </w:rPr>
         <w:t>4. PLAN D'EXÉCUTION &amp; CHRONOGRAMME DE DÉPLOIEMENT (12 SEMAINES)</w:t>
       </w:r>
     </w:p>
     <w:p>
       <w:pPr>
-        <w:spacing w:after="120"/>
+        <w:pStyle w:val="ListBullet"/>
+        <w:spacing w:after="60"/>
       </w:pPr>
       <w:r>
-        <w:t>Le déploiement industriel s'étale sur une période de 12 semaines calendaires réparties comme suit :</w:t>
+        <w:rPr>
+          <w:b/>
+          <w:color w:val="0E2C43"/>
+        </w:rPr>
+        <w:t xml:space="preserve">Semaines 1 à 2 : </w:t>
+      </w:r>
+      <w:r>
+        <w:t>Finalisation juridique, levée de fonds bancaires, signature du bail du site industriel de Kétou.</w:t>
       </w:r>
     </w:p>
     <w:p>
       <w:pPr>
         <w:pStyle w:val="ListBullet"/>
+        <w:spacing w:after="60"/>
       </w:pPr>
-      <w:r/>
       <w:r>
         <w:rPr>
           <w:b/>
+          <w:color w:val="0E2C43"/>
         </w:rPr>
-        <w:t>Semaines 1 à 2 :</w:t>
+        <w:t xml:space="preserve">Semaines 3 à 4 : </w:t>
       </w:r>
       <w:r>
-        <w:t xml:space="preserve"> Finalisation juridique, levée de fonds bancaires, signature du bail du site industriel de Kétou.</w:t>
+        <w:t>Aménagement du site (dalle béton, raccordement Sbee Triphasé, bassins de décantation water-recycling).</w:t>
       </w:r>
     </w:p>
     <w:p>
       <w:pPr>
         <w:pStyle w:val="ListBullet"/>
+        <w:spacing w:after="60"/>
       </w:pPr>
-      <w:r/>
       <w:r>
         <w:rPr>
           <w:b/>
+          <w:color w:val="0E2C43"/>
         </w:rPr>
-        <w:t>Semaines 3 à 4 :</w:t>
+        <w:t xml:space="preserve">Semaines 5 à 6 : </w:t>
       </w:r>
       <w:r>
-        <w:t xml:space="preserve"> Aménagement du site (dalle béton, raccordement Sbee Triphasé, bassins de décantation water-recycling).</w:t>
+        <w:t>Commande, réception et installation de la ligne de broyage 15 HP et des équipements annexes.</w:t>
       </w:r>
     </w:p>
     <w:p>
       <w:pPr>
         <w:pStyle w:val="ListBullet"/>
+        <w:spacing w:after="60"/>
       </w:pPr>
-      <w:r/>
       <w:r>
         <w:rPr>
           <w:b/>
+          <w:color w:val="0E2C43"/>
         </w:rPr>
-        <w:t>Semaines 5 à 6 :</w:t>
+        <w:t xml:space="preserve">Semaines 7 à 8 : </w:t>
       </w:r>
       <w:r>
-        <w:t xml:space="preserve"> Commande, réception et installation de la ligne de broyage 15 HP et des équipements annexes.</w:t>
+        <w:t>Essais à vide, calibrage des lames, mise en place des protocoles SST et formation du personnel.</w:t>
       </w:r>
     </w:p>
     <w:p>
       <w:pPr>
         <w:pStyle w:val="ListBullet"/>
+        <w:spacing w:after="60"/>
       </w:pPr>
-      <w:r/>
       <w:r>
         <w:rPr>
           <w:b/>
+          <w:color w:val="0E2C43"/>
         </w:rPr>
-        <w:t>Semaines 7 à 8 :</w:t>
+        <w:t xml:space="preserve">Semaines 9 à 10 : </w:t>
       </w:r>
       <w:r>
-        <w:t xml:space="preserve"> Essais à vide, calibrage des lames, mise en place des protocoles SST et formation du personnel d'exécution.</w:t>
+        <w:t>Lancement des campagnes d'achat de collecte de rodage (stock de sécurité de 20 tonnes de matière brute).</w:t>
       </w:r>
     </w:p>
     <w:p>
       <w:pPr>
         <w:pStyle w:val="ListBullet"/>
+        <w:spacing w:after="60"/>
       </w:pPr>
-      <w:r/>
       <w:r>
         <w:rPr>
           <w:b/>
+          <w:color w:val="0E2C43"/>
         </w:rPr>
-        <w:t>Semaines 9 à 10 :</w:t>
+        <w:t xml:space="preserve">Semaines 11 à 12 : </w:t>
       </w:r>
       <w:r>
-        <w:t xml:space="preserve"> Lancement des campagnes d'achat de collecte de rodage (stock de sécurité de 20 tonnes de matière brute).</w:t>
+        <w:t>Lancement de la production continue, livraison des premiers lots B2B et montée en puissance vers la capacité nominale.</w:t>
       </w:r>
     </w:p>
     <w:p>
       <w:pPr>
-        <w:pStyle w:val="ListBullet"/>
-      </w:pPr>
-      <w:r/>
-      <w:r>
-        <w:rPr>
-          <w:b/>
-        </w:rPr>
-        <w:t>Semaines 11 à 12 :</w:t>
-      </w:r>
-      <w:r>
-        <w:t xml:space="preserve"> Lancement de la production industrielle continue, livraison des premiers lots de test aux clients B2B et montée en puissance vers la capacité nominale.</w:t>
-      </w:r>
-    </w:p>
-    <w:p>
-      <w:pPr>
-        <w:pStyle w:val="Heading1"/>
-        <w:spacing w:before="280" w:after="120"/>
+        <w:keepNext/>
+        <w:spacing w:before="360" w:after="120"/>
+        <w:pBdr>
+          <w:bottom w:val="single" w:sz="12" w:space="4" w:color="C99B5B"/>
+        </w:pBdr>
       </w:pPr>
       <w:r>
         <w:rPr>
           <w:rFonts w:ascii="Arial" w:hAnsi="Arial"/>
           <w:b/>
           <w:color w:val="0E2C43"/>
-          <w:sz w:val="30"/>
+          <w:sz w:val="28"/>
         </w:rPr>
         <w:t>5. MODÉLISATION FINANCIÈRE &amp; RENTABILITÉ</w:t>
       </w:r>
@@ -1296,20 +1423,20 @@
         <w:spacing w:after="120"/>
       </w:pPr>
       <w:r>
-        <w:t>*(Tous les montants sont exprimés en Francs CFA - FCFA)*</w:t>
+        <w:t>(Tous les montants sont exprimés en Francs CFA - FCFA)</w:t>
       </w:r>
     </w:p>
     <w:p>
       <w:pPr>
-        <w:pStyle w:val="Heading2"/>
-        <w:spacing w:before="240" w:after="80"/>
+        <w:keepNext/>
+        <w:spacing w:before="280" w:after="80"/>
       </w:pPr>
       <w:r>
         <w:rPr>
           <w:rFonts w:ascii="Arial" w:hAnsi="Arial"/>
           <w:b/>
           <w:color w:val="B66A3F"/>
-          <w:sz w:val="26"/>
+          <w:sz w:val="24"/>
         </w:rPr>
         <w:t>5.1 Hypothèses de calcul et paramètres économiques</w:t>
       </w:r>
@@ -1317,104 +1444,104 @@
     <w:p>
       <w:pPr>
         <w:pStyle w:val="ListBullet"/>
+        <w:spacing w:after="40"/>
       </w:pPr>
-      <w:r/>
       <w:r>
         <w:rPr>
           <w:b/>
         </w:rPr>
-        <w:t>Capacité de traitement nominale :</w:t>
+        <w:t xml:space="preserve">Capacité de traitement nominale : </w:t>
       </w:r>
       <w:r>
-        <w:t xml:space="preserve"> 300 kg / heure.</w:t>
+        <w:t>300 kg / heure</w:t>
       </w:r>
     </w:p>
     <w:p>
       <w:pPr>
         <w:pStyle w:val="ListBullet"/>
+        <w:spacing w:after="40"/>
       </w:pPr>
-      <w:r/>
       <w:r>
         <w:rPr>
           <w:b/>
         </w:rPr>
-        <w:t>Temps de travail :</w:t>
+        <w:t xml:space="preserve">Temps de travail : </w:t>
       </w:r>
       <w:r>
-        <w:t xml:space="preserve"> 8 heures / jour, 22 jours / mois (soit 176 heures par mois).</w:t>
+        <w:t>8 heures / jour, 22 jours / mois (176 heures / mois)</w:t>
       </w:r>
     </w:p>
     <w:p>
       <w:pPr>
         <w:pStyle w:val="ListBullet"/>
+        <w:spacing w:after="40"/>
       </w:pPr>
-      <w:r/>
       <w:r>
         <w:rPr>
           <w:b/>
         </w:rPr>
-        <w:t>Volume mensuel traité :</w:t>
+        <w:t xml:space="preserve">Volume mensuel traité : </w:t>
       </w:r>
       <w:r>
-        <w:t xml:space="preserve"> ~52,8 Tonnes de matière brute.</w:t>
+        <w:t>52,8 Tonnes de matière brute</w:t>
       </w:r>
     </w:p>
     <w:p>
       <w:pPr>
         <w:pStyle w:val="ListBullet"/>
+        <w:spacing w:after="40"/>
       </w:pPr>
-      <w:r/>
       <w:r>
         <w:rPr>
           <w:b/>
         </w:rPr>
-        <w:t>Rendement de transformation (après tri et séchage) :</w:t>
+        <w:t xml:space="preserve">Rendement de transformation : </w:t>
       </w:r>
       <w:r>
-        <w:t xml:space="preserve"> 85 % (soit ~45 Tonnes de broyat marchand / mois).</w:t>
+        <w:t>85 % (soit 45 Tonnes de broyat marchand / mois)</w:t>
       </w:r>
     </w:p>
     <w:p>
       <w:pPr>
         <w:pStyle w:val="ListBullet"/>
+        <w:spacing w:after="40"/>
       </w:pPr>
-      <w:r/>
       <w:r>
         <w:rPr>
           <w:b/>
         </w:rPr>
-        <w:t>Prix moyen d'achat matière brute (plastique souillé/rigide) :</w:t>
+        <w:t xml:space="preserve">Prix moyen d'achat matière brute : </w:t>
       </w:r>
       <w:r>
-        <w:t xml:space="preserve"> 100 FCFA / kg.</w:t>
+        <w:t>100 FCFA / kg</w:t>
       </w:r>
     </w:p>
     <w:p>
       <w:pPr>
         <w:pStyle w:val="ListBullet"/>
+        <w:spacing w:after="40"/>
       </w:pPr>
-      <w:r/>
       <w:r>
         <w:rPr>
           <w:b/>
         </w:rPr>
-        <w:t>Prix moyen de vente broyat calibré et lavé (PP / PEHD) :</w:t>
+        <w:t xml:space="preserve">Prix moyen de vente broyat PP/PEHD : </w:t>
       </w:r>
       <w:r>
-        <w:t xml:space="preserve"> 450 FCFA / kg.</w:t>
+        <w:t>450 FCFA / kg (soit 450 000 FCFA / Tonne)</w:t>
       </w:r>
     </w:p>
     <w:p>
       <w:pPr>
-        <w:pStyle w:val="Heading2"/>
-        <w:spacing w:before="240" w:after="80"/>
+        <w:keepNext/>
+        <w:spacing w:before="280" w:after="80"/>
       </w:pPr>
       <w:r>
         <w:rPr>
           <w:rFonts w:ascii="Arial" w:hAnsi="Arial"/>
           <w:b/>
           <w:color w:val="B66A3F"/>
-          <w:sz w:val="26"/>
+          <w:sz w:val="24"/>
         </w:rPr>
         <w:t>5.2 Plan d'Investissement Initial (CAPEX)</w:t>
       </w:r>
@@ -1424,6 +1551,14 @@
         <w:tblW w:type="auto" w:w="0"/>
         <w:jc w:val="center"/>
         <w:tblLook w:firstColumn="1" w:firstRow="1" w:lastColumn="0" w:lastRow="0" w:noHBand="0" w:noVBand="1" w:val="04A0"/>
+        <w:tblBorders>
+          <w:top w:val="single" w:sz="4" w:space="0" w:color="D3D3D3"/>
+          <w:left w:val="none"/>
+          <w:bottom w:val="single" w:sz="4" w:space="0" w:color="D3D3D3"/>
+          <w:right w:val="none"/>
+          <w:insideH w:val="single" w:sz="4" w:space="0" w:color="D3D3D3"/>
+          <w:insideV w:val="none"/>
+        </w:tblBorders>
       </w:tblPr>
       <w:tblGrid>
         <w:gridCol w:w="3120"/>
@@ -1434,13 +1569,13 @@
         <w:tc>
           <w:tcPr>
             <w:tcW w:type="dxa" w:w="3120"/>
+            <w:shd w:fill="0E2C43"/>
             <w:tcMar>
-              <w:top w:w="120" w:type="dxa"/>
-              <w:bottom w:w="120" w:type="dxa"/>
-              <w:left w:w="150" w:type="dxa"/>
-              <w:right w:w="150" w:type="dxa"/>
+              <w:top w:w="140" w:type="dxa"/>
+              <w:bottom w:w="140" w:type="dxa"/>
+              <w:left w:w="160" w:type="dxa"/>
+              <w:right w:w="160" w:type="dxa"/>
             </w:tcMar>
-            <w:shd w:fill="0E2C43"/>
           </w:tcPr>
           <w:p>
             <w:pPr>
@@ -1448,7 +1583,7 @@
             </w:pPr>
             <w:r>
               <w:rPr>
-                <w:rFonts w:ascii="Calibri" w:hAnsi="Calibri"/>
+                <w:rFonts w:ascii="Arial" w:hAnsi="Arial"/>
                 <w:b/>
                 <w:color w:val="FFFFFF"/>
                 <w:sz w:val="20"/>
@@ -1460,13 +1595,13 @@
         <w:tc>
           <w:tcPr>
             <w:tcW w:type="dxa" w:w="3120"/>
+            <w:shd w:fill="0E2C43"/>
             <w:tcMar>
-              <w:top w:w="120" w:type="dxa"/>
-              <w:bottom w:w="120" w:type="dxa"/>
-              <w:left w:w="150" w:type="dxa"/>
-              <w:right w:w="150" w:type="dxa"/>
+              <w:top w:w="140" w:type="dxa"/>
+              <w:bottom w:w="140" w:type="dxa"/>
+              <w:left w:w="160" w:type="dxa"/>
+              <w:right w:w="160" w:type="dxa"/>
             </w:tcMar>
-            <w:shd w:fill="0E2C43"/>
           </w:tcPr>
           <w:p>
             <w:pPr>
@@ -1474,7 +1609,7 @@
             </w:pPr>
             <w:r>
               <w:rPr>
-                <w:rFonts w:ascii="Calibri" w:hAnsi="Calibri"/>
+                <w:rFonts w:ascii="Arial" w:hAnsi="Arial"/>
                 <w:b/>
                 <w:color w:val="FFFFFF"/>
                 <w:sz w:val="20"/>
@@ -1486,21 +1621,21 @@
         <w:tc>
           <w:tcPr>
             <w:tcW w:type="dxa" w:w="3120"/>
+            <w:shd w:fill="0E2C43"/>
             <w:tcMar>
-              <w:top w:w="120" w:type="dxa"/>
-              <w:bottom w:w="120" w:type="dxa"/>
-              <w:left w:w="150" w:type="dxa"/>
-              <w:right w:w="150" w:type="dxa"/>
+              <w:top w:w="140" w:type="dxa"/>
+              <w:bottom w:w="140" w:type="dxa"/>
+              <w:left w:w="160" w:type="dxa"/>
+              <w:right w:w="160" w:type="dxa"/>
             </w:tcMar>
-            <w:shd w:fill="0E2C43"/>
           </w:tcPr>
           <w:p>
             <w:pPr>
-              <w:jc w:val="left"/>
+              <w:jc w:val="right"/>
             </w:pPr>
             <w:r>
               <w:rPr>
-                <w:rFonts w:ascii="Calibri" w:hAnsi="Calibri"/>
+                <w:rFonts w:ascii="Arial" w:hAnsi="Arial"/>
                 <w:b/>
                 <w:color w:val="FFFFFF"/>
                 <w:sz w:val="20"/>
@@ -1514,13 +1649,38 @@
         <w:tc>
           <w:tcPr>
             <w:tcW w:type="dxa" w:w="3120"/>
+            <w:shd w:fill="FFFFFF"/>
             <w:tcMar>
               <w:top w:w="120" w:type="dxa"/>
               <w:bottom w:w="120" w:type="dxa"/>
-              <w:left w:w="150" w:type="dxa"/>
-              <w:right w:w="150" w:type="dxa"/>
+              <w:left w:w="160" w:type="dxa"/>
+              <w:right w:w="160" w:type="dxa"/>
             </w:tcMar>
-            <w:shd w:fill="F4EFE9"/>
+          </w:tcPr>
+          <w:p>
+            <w:pPr>
+              <w:jc w:val="left"/>
+            </w:pPr>
+            <w:r>
+              <w:rPr>
+                <w:rFonts w:ascii="Calibri" w:hAnsi="Calibri"/>
+                <w:b/>
+                <w:sz w:val="20"/>
+              </w:rPr>
+              <w:t>Aménagements du site &amp; Génie Civil</w:t>
+            </w:r>
+          </w:p>
+        </w:tc>
+        <w:tc>
+          <w:tcPr>
+            <w:tcW w:type="dxa" w:w="3120"/>
+            <w:shd w:fill="FFFFFF"/>
+            <w:tcMar>
+              <w:top w:w="120" w:type="dxa"/>
+              <w:bottom w:w="120" w:type="dxa"/>
+              <w:left w:w="160" w:type="dxa"/>
+              <w:right w:w="160" w:type="dxa"/>
+            </w:tcMar>
           </w:tcPr>
           <w:p>
             <w:pPr>
@@ -1531,48 +1691,24 @@
                 <w:rFonts w:ascii="Calibri" w:hAnsi="Calibri"/>
                 <w:sz w:val="20"/>
               </w:rPr>
-              <w:t>Aménagements du site &amp; Génie Civil</w:t>
+              <w:t>Dalle technique, bassins de lavage, bureau</w:t>
             </w:r>
           </w:p>
         </w:tc>
         <w:tc>
           <w:tcPr>
             <w:tcW w:type="dxa" w:w="3120"/>
+            <w:shd w:fill="FFFFFF"/>
             <w:tcMar>
               <w:top w:w="120" w:type="dxa"/>
               <w:bottom w:w="120" w:type="dxa"/>
-              <w:left w:w="150" w:type="dxa"/>
-              <w:right w:w="150" w:type="dxa"/>
+              <w:left w:w="160" w:type="dxa"/>
+              <w:right w:w="160" w:type="dxa"/>
             </w:tcMar>
-            <w:shd w:fill="F4EFE9"/>
           </w:tcPr>
           <w:p>
             <w:pPr>
-              <w:jc w:val="left"/>
-            </w:pPr>
-            <w:r>
-              <w:rPr>
-                <w:rFonts w:ascii="Calibri" w:hAnsi="Calibri"/>
-                <w:sz w:val="20"/>
-              </w:rPr>
-              <w:t>Dalle technique, bassins de lavage, clôture et bureau</w:t>
-            </w:r>
-          </w:p>
-        </w:tc>
-        <w:tc>
-          <w:tcPr>
-            <w:tcW w:type="dxa" w:w="3120"/>
-            <w:tcMar>
-              <w:top w:w="120" w:type="dxa"/>
-              <w:bottom w:w="120" w:type="dxa"/>
-              <w:left w:w="150" w:type="dxa"/>
-              <w:right w:w="150" w:type="dxa"/>
-            </w:tcMar>
-            <w:shd w:fill="F4EFE9"/>
-          </w:tcPr>
-          <w:p>
-            <w:pPr>
-              <w:jc w:val="left"/>
+              <w:jc w:val="right"/>
             </w:pPr>
             <w:r>
               <w:rPr>
@@ -1588,13 +1724,38 @@
         <w:tc>
           <w:tcPr>
             <w:tcW w:type="dxa" w:w="3120"/>
+            <w:shd w:fill="F9FAFC"/>
             <w:tcMar>
               <w:top w:w="120" w:type="dxa"/>
               <w:bottom w:w="120" w:type="dxa"/>
-              <w:left w:w="150" w:type="dxa"/>
-              <w:right w:w="150" w:type="dxa"/>
+              <w:left w:w="160" w:type="dxa"/>
+              <w:right w:w="160" w:type="dxa"/>
             </w:tcMar>
-            <w:shd w:fill="FFFFFF"/>
+          </w:tcPr>
+          <w:p>
+            <w:pPr>
+              <w:jc w:val="left"/>
+            </w:pPr>
+            <w:r>
+              <w:rPr>
+                <w:rFonts w:ascii="Calibri" w:hAnsi="Calibri"/>
+                <w:b/>
+                <w:sz w:val="20"/>
+              </w:rPr>
+              <w:t>Ligne de Broyage Industrielle 15 HP</w:t>
+            </w:r>
+          </w:p>
+        </w:tc>
+        <w:tc>
+          <w:tcPr>
+            <w:tcW w:type="dxa" w:w="3120"/>
+            <w:shd w:fill="F9FAFC"/>
+            <w:tcMar>
+              <w:top w:w="120" w:type="dxa"/>
+              <w:bottom w:w="120" w:type="dxa"/>
+              <w:left w:w="160" w:type="dxa"/>
+              <w:right w:w="160" w:type="dxa"/>
+            </w:tcMar>
           </w:tcPr>
           <w:p>
             <w:pPr>
@@ -1605,48 +1766,24 @@
                 <w:rFonts w:ascii="Calibri" w:hAnsi="Calibri"/>
                 <w:sz w:val="20"/>
               </w:rPr>
-              <w:t>Ligne de Broyage Industrielle 15 HP</w:t>
+              <w:t>Broyeur, jeux de lames, tableau électrique</w:t>
             </w:r>
           </w:p>
         </w:tc>
         <w:tc>
           <w:tcPr>
             <w:tcW w:type="dxa" w:w="3120"/>
+            <w:shd w:fill="F9FAFC"/>
             <w:tcMar>
               <w:top w:w="120" w:type="dxa"/>
               <w:bottom w:w="120" w:type="dxa"/>
-              <w:left w:w="150" w:type="dxa"/>
-              <w:right w:w="150" w:type="dxa"/>
+              <w:left w:w="160" w:type="dxa"/>
+              <w:right w:w="160" w:type="dxa"/>
             </w:tcMar>
-            <w:shd w:fill="FFFFFF"/>
           </w:tcPr>
           <w:p>
             <w:pPr>
-              <w:jc w:val="left"/>
-            </w:pPr>
-            <w:r>
-              <w:rPr>
-                <w:rFonts w:ascii="Calibri" w:hAnsi="Calibri"/>
-                <w:sz w:val="20"/>
-              </w:rPr>
-              <w:t>Broyeur, jeux de lames de rechange, tableau électrique</w:t>
-            </w:r>
-          </w:p>
-        </w:tc>
-        <w:tc>
-          <w:tcPr>
-            <w:tcW w:type="dxa" w:w="3120"/>
-            <w:tcMar>
-              <w:top w:w="120" w:type="dxa"/>
-              <w:bottom w:w="120" w:type="dxa"/>
-              <w:left w:w="150" w:type="dxa"/>
-              <w:right w:w="150" w:type="dxa"/>
-            </w:tcMar>
-            <w:shd w:fill="FFFFFF"/>
-          </w:tcPr>
-          <w:p>
-            <w:pPr>
-              <w:jc w:val="left"/>
+              <w:jc w:val="right"/>
             </w:pPr>
             <w:r>
               <w:rPr>
@@ -1662,13 +1799,38 @@
         <w:tc>
           <w:tcPr>
             <w:tcW w:type="dxa" w:w="3120"/>
+            <w:shd w:fill="FFFFFF"/>
             <w:tcMar>
               <w:top w:w="120" w:type="dxa"/>
               <w:bottom w:w="120" w:type="dxa"/>
-              <w:left w:w="150" w:type="dxa"/>
-              <w:right w:w="150" w:type="dxa"/>
+              <w:left w:w="160" w:type="dxa"/>
+              <w:right w:w="160" w:type="dxa"/>
             </w:tcMar>
-            <w:shd w:fill="F4EFE9"/>
+          </w:tcPr>
+          <w:p>
+            <w:pPr>
+              <w:jc w:val="left"/>
+            </w:pPr>
+            <w:r>
+              <w:rPr>
+                <w:rFonts w:ascii="Calibri" w:hAnsi="Calibri"/>
+                <w:b/>
+                <w:sz w:val="20"/>
+              </w:rPr>
+              <w:t>Équipements de Lavage &amp; Séchage</w:t>
+            </w:r>
+          </w:p>
+        </w:tc>
+        <w:tc>
+          <w:tcPr>
+            <w:tcW w:type="dxa" w:w="3120"/>
+            <w:shd w:fill="FFFFFF"/>
+            <w:tcMar>
+              <w:top w:w="120" w:type="dxa"/>
+              <w:bottom w:w="120" w:type="dxa"/>
+              <w:left w:w="160" w:type="dxa"/>
+              <w:right w:w="160" w:type="dxa"/>
+            </w:tcMar>
           </w:tcPr>
           <w:p>
             <w:pPr>
@@ -1679,48 +1841,24 @@
                 <w:rFonts w:ascii="Calibri" w:hAnsi="Calibri"/>
                 <w:sz w:val="20"/>
               </w:rPr>
-              <w:t>Équipements de Lavage &amp; Séchage</w:t>
+              <w:t>Bacs inox, pompes, centrifugeuse, serre solaire</w:t>
             </w:r>
           </w:p>
         </w:tc>
         <w:tc>
           <w:tcPr>
             <w:tcW w:type="dxa" w:w="3120"/>
+            <w:shd w:fill="FFFFFF"/>
             <w:tcMar>
               <w:top w:w="120" w:type="dxa"/>
               <w:bottom w:w="120" w:type="dxa"/>
-              <w:left w:w="150" w:type="dxa"/>
-              <w:right w:w="150" w:type="dxa"/>
+              <w:left w:w="160" w:type="dxa"/>
+              <w:right w:w="160" w:type="dxa"/>
             </w:tcMar>
-            <w:shd w:fill="F4EFE9"/>
           </w:tcPr>
           <w:p>
             <w:pPr>
-              <w:jc w:val="left"/>
-            </w:pPr>
-            <w:r>
-              <w:rPr>
-                <w:rFonts w:ascii="Calibri" w:hAnsi="Calibri"/>
-                <w:sz w:val="20"/>
-              </w:rPr>
-              <w:t>Bacs inox, pompes, centrifugeuse et serre solaire</w:t>
-            </w:r>
-          </w:p>
-        </w:tc>
-        <w:tc>
-          <w:tcPr>
-            <w:tcW w:type="dxa" w:w="3120"/>
-            <w:tcMar>
-              <w:top w:w="120" w:type="dxa"/>
-              <w:bottom w:w="120" w:type="dxa"/>
-              <w:left w:w="150" w:type="dxa"/>
-              <w:right w:w="150" w:type="dxa"/>
-            </w:tcMar>
-            <w:shd w:fill="F4EFE9"/>
-          </w:tcPr>
-          <w:p>
-            <w:pPr>
-              <w:jc w:val="left"/>
+              <w:jc w:val="right"/>
             </w:pPr>
             <w:r>
               <w:rPr>
@@ -1736,13 +1874,13 @@
         <w:tc>
           <w:tcPr>
             <w:tcW w:type="dxa" w:w="3120"/>
+            <w:shd w:fill="F9FAFC"/>
             <w:tcMar>
               <w:top w:w="120" w:type="dxa"/>
               <w:bottom w:w="120" w:type="dxa"/>
-              <w:left w:w="150" w:type="dxa"/>
-              <w:right w:w="150" w:type="dxa"/>
+              <w:left w:w="160" w:type="dxa"/>
+              <w:right w:w="160" w:type="dxa"/>
             </w:tcMar>
-            <w:shd w:fill="FFFFFF"/>
           </w:tcPr>
           <w:p>
             <w:pPr>
@@ -1751,6 +1889,7 @@
             <w:r>
               <w:rPr>
                 <w:rFonts w:ascii="Calibri" w:hAnsi="Calibri"/>
+                <w:b/>
                 <w:sz w:val="20"/>
               </w:rPr>
               <w:t>Matériel Logistique &amp; Manutention</w:t>
@@ -1760,13 +1899,13 @@
         <w:tc>
           <w:tcPr>
             <w:tcW w:type="dxa" w:w="3120"/>
+            <w:shd w:fill="F9FAFC"/>
             <w:tcMar>
               <w:top w:w="120" w:type="dxa"/>
               <w:bottom w:w="120" w:type="dxa"/>
-              <w:left w:w="150" w:type="dxa"/>
-              <w:right w:w="150" w:type="dxa"/>
+              <w:left w:w="160" w:type="dxa"/>
+              <w:right w:w="160" w:type="dxa"/>
             </w:tcMar>
-            <w:shd w:fill="FFFFFF"/>
           </w:tcPr>
           <w:p>
             <w:pPr>
@@ -1784,17 +1923,17 @@
         <w:tc>
           <w:tcPr>
             <w:tcW w:type="dxa" w:w="3120"/>
+            <w:shd w:fill="F9FAFC"/>
             <w:tcMar>
               <w:top w:w="120" w:type="dxa"/>
               <w:bottom w:w="120" w:type="dxa"/>
-              <w:left w:w="150" w:type="dxa"/>
-              <w:right w:w="150" w:type="dxa"/>
+              <w:left w:w="160" w:type="dxa"/>
+              <w:right w:w="160" w:type="dxa"/>
             </w:tcMar>
-            <w:shd w:fill="FFFFFF"/>
           </w:tcPr>
           <w:p>
             <w:pPr>
-              <w:jc w:val="left"/>
+              <w:jc w:val="right"/>
             </w:pPr>
             <w:r>
               <w:rPr>
@@ -1810,13 +1949,38 @@
         <w:tc>
           <w:tcPr>
             <w:tcW w:type="dxa" w:w="3120"/>
+            <w:shd w:fill="FFFFFF"/>
             <w:tcMar>
               <w:top w:w="120" w:type="dxa"/>
               <w:bottom w:w="120" w:type="dxa"/>
-              <w:left w:w="150" w:type="dxa"/>
-              <w:right w:w="150" w:type="dxa"/>
+              <w:left w:w="160" w:type="dxa"/>
+              <w:right w:w="160" w:type="dxa"/>
             </w:tcMar>
-            <w:shd w:fill="F4EFE9"/>
+          </w:tcPr>
+          <w:p>
+            <w:pPr>
+              <w:jc w:val="left"/>
+            </w:pPr>
+            <w:r>
+              <w:rPr>
+                <w:rFonts w:ascii="Calibri" w:hAnsi="Calibri"/>
+                <w:b/>
+                <w:sz w:val="20"/>
+              </w:rPr>
+              <w:t>Installation Électrique &amp; Groupe Sécurité</w:t>
+            </w:r>
+          </w:p>
+        </w:tc>
+        <w:tc>
+          <w:tcPr>
+            <w:tcW w:type="dxa" w:w="3120"/>
+            <w:shd w:fill="FFFFFF"/>
+            <w:tcMar>
+              <w:top w:w="120" w:type="dxa"/>
+              <w:bottom w:w="120" w:type="dxa"/>
+              <w:left w:w="160" w:type="dxa"/>
+              <w:right w:w="160" w:type="dxa"/>
+            </w:tcMar>
           </w:tcPr>
           <w:p>
             <w:pPr>
@@ -1827,48 +1991,24 @@
                 <w:rFonts w:ascii="Calibri" w:hAnsi="Calibri"/>
                 <w:sz w:val="20"/>
               </w:rPr>
-              <w:t>Installation Électrique &amp; Groupe Sécurité</w:t>
+              <w:t>Câblage triphasé, armoire, groupe 20 kVA</w:t>
             </w:r>
           </w:p>
         </w:tc>
         <w:tc>
           <w:tcPr>
             <w:tcW w:type="dxa" w:w="3120"/>
+            <w:shd w:fill="FFFFFF"/>
             <w:tcMar>
               <w:top w:w="120" w:type="dxa"/>
               <w:bottom w:w="120" w:type="dxa"/>
-              <w:left w:w="150" w:type="dxa"/>
-              <w:right w:w="150" w:type="dxa"/>
+              <w:left w:w="160" w:type="dxa"/>
+              <w:right w:w="160" w:type="dxa"/>
             </w:tcMar>
-            <w:shd w:fill="F4EFE9"/>
           </w:tcPr>
           <w:p>
             <w:pPr>
-              <w:jc w:val="left"/>
-            </w:pPr>
-            <w:r>
-              <w:rPr>
-                <w:rFonts w:ascii="Calibri" w:hAnsi="Calibri"/>
-                <w:sz w:val="20"/>
-              </w:rPr>
-              <w:t>Câblage triphasé, armoire de protection, groupe 20 kVA</w:t>
-            </w:r>
-          </w:p>
-        </w:tc>
-        <w:tc>
-          <w:tcPr>
-            <w:tcW w:type="dxa" w:w="3120"/>
-            <w:tcMar>
-              <w:top w:w="120" w:type="dxa"/>
-              <w:bottom w:w="120" w:type="dxa"/>
-              <w:left w:w="150" w:type="dxa"/>
-              <w:right w:w="150" w:type="dxa"/>
-            </w:tcMar>
-            <w:shd w:fill="F4EFE9"/>
-          </w:tcPr>
-          <w:p>
-            <w:pPr>
-              <w:jc w:val="left"/>
+              <w:jc w:val="right"/>
             </w:pPr>
             <w:r>
               <w:rPr>
@@ -1884,13 +2024,38 @@
         <w:tc>
           <w:tcPr>
             <w:tcW w:type="dxa" w:w="3120"/>
+            <w:shd w:fill="F9FAFC"/>
             <w:tcMar>
               <w:top w:w="120" w:type="dxa"/>
               <w:bottom w:w="120" w:type="dxa"/>
-              <w:left w:w="150" w:type="dxa"/>
-              <w:right w:w="150" w:type="dxa"/>
+              <w:left w:w="160" w:type="dxa"/>
+              <w:right w:w="160" w:type="dxa"/>
             </w:tcMar>
-            <w:shd w:fill="FFFFFF"/>
+          </w:tcPr>
+          <w:p>
+            <w:pPr>
+              <w:jc w:val="left"/>
+            </w:pPr>
+            <w:r>
+              <w:rPr>
+                <w:rFonts w:ascii="Calibri" w:hAnsi="Calibri"/>
+                <w:b/>
+                <w:sz w:val="20"/>
+              </w:rPr>
+              <w:t>Frais d'Établissement &amp; Licences</w:t>
+            </w:r>
+          </w:p>
+        </w:tc>
+        <w:tc>
+          <w:tcPr>
+            <w:tcW w:type="dxa" w:w="3120"/>
+            <w:shd w:fill="F9FAFC"/>
+            <w:tcMar>
+              <w:top w:w="120" w:type="dxa"/>
+              <w:bottom w:w="120" w:type="dxa"/>
+              <w:left w:w="160" w:type="dxa"/>
+              <w:right w:w="160" w:type="dxa"/>
+            </w:tcMar>
           </w:tcPr>
           <w:p>
             <w:pPr>
@@ -1901,48 +2066,24 @@
                 <w:rFonts w:ascii="Calibri" w:hAnsi="Calibri"/>
                 <w:sz w:val="20"/>
               </w:rPr>
-              <w:t>Frais d'Établissement &amp; Licences</w:t>
+              <w:t>Immatriculation, étude d'impact, conformité SST</w:t>
             </w:r>
           </w:p>
         </w:tc>
         <w:tc>
           <w:tcPr>
             <w:tcW w:type="dxa" w:w="3120"/>
+            <w:shd w:fill="F9FAFC"/>
             <w:tcMar>
               <w:top w:w="120" w:type="dxa"/>
               <w:bottom w:w="120" w:type="dxa"/>
-              <w:left w:w="150" w:type="dxa"/>
-              <w:right w:w="150" w:type="dxa"/>
+              <w:left w:w="160" w:type="dxa"/>
+              <w:right w:w="160" w:type="dxa"/>
             </w:tcMar>
-            <w:shd w:fill="FFFFFF"/>
           </w:tcPr>
           <w:p>
             <w:pPr>
-              <w:jc w:val="left"/>
-            </w:pPr>
-            <w:r>
-              <w:rPr>
-                <w:rFonts w:ascii="Calibri" w:hAnsi="Calibri"/>
-                <w:sz w:val="20"/>
-              </w:rPr>
-              <w:t>Immatriculation, étude d'impact environnemental, SST</w:t>
-            </w:r>
-          </w:p>
-        </w:tc>
-        <w:tc>
-          <w:tcPr>
-            <w:tcW w:type="dxa" w:w="3120"/>
-            <w:tcMar>
-              <w:top w:w="120" w:type="dxa"/>
-              <w:bottom w:w="120" w:type="dxa"/>
-              <w:left w:w="150" w:type="dxa"/>
-              <w:right w:w="150" w:type="dxa"/>
-            </w:tcMar>
-            <w:shd w:fill="FFFFFF"/>
-          </w:tcPr>
-          <w:p>
-            <w:pPr>
-              <w:jc w:val="left"/>
+              <w:jc w:val="right"/>
             </w:pPr>
             <w:r>
               <w:rPr>
@@ -1958,13 +2099,38 @@
         <w:tc>
           <w:tcPr>
             <w:tcW w:type="dxa" w:w="3120"/>
+            <w:shd w:fill="FFFFFF"/>
             <w:tcMar>
               <w:top w:w="120" w:type="dxa"/>
               <w:bottom w:w="120" w:type="dxa"/>
-              <w:left w:w="150" w:type="dxa"/>
-              <w:right w:w="150" w:type="dxa"/>
+              <w:left w:w="160" w:type="dxa"/>
+              <w:right w:w="160" w:type="dxa"/>
             </w:tcMar>
-            <w:shd w:fill="F4EFE9"/>
+          </w:tcPr>
+          <w:p>
+            <w:pPr>
+              <w:jc w:val="left"/>
+            </w:pPr>
+            <w:r>
+              <w:rPr>
+                <w:rFonts w:ascii="Calibri" w:hAnsi="Calibri"/>
+                <w:b/>
+                <w:sz w:val="20"/>
+              </w:rPr>
+              <w:t>Fonds de Roulement Initial (BFR)</w:t>
+            </w:r>
+          </w:p>
+        </w:tc>
+        <w:tc>
+          <w:tcPr>
+            <w:tcW w:type="dxa" w:w="3120"/>
+            <w:shd w:fill="FFFFFF"/>
+            <w:tcMar>
+              <w:top w:w="120" w:type="dxa"/>
+              <w:bottom w:w="120" w:type="dxa"/>
+              <w:left w:w="160" w:type="dxa"/>
+              <w:right w:w="160" w:type="dxa"/>
+            </w:tcMar>
           </w:tcPr>
           <w:p>
             <w:pPr>
@@ -1975,48 +2141,24 @@
                 <w:rFonts w:ascii="Calibri" w:hAnsi="Calibri"/>
                 <w:sz w:val="20"/>
               </w:rPr>
-              <w:t>Fonds de Roulement Initial (BFR)</w:t>
+              <w:t>Stock matière brute (1 mois) + trésorerie</w:t>
             </w:r>
           </w:p>
         </w:tc>
         <w:tc>
           <w:tcPr>
             <w:tcW w:type="dxa" w:w="3120"/>
+            <w:shd w:fill="FFFFFF"/>
             <w:tcMar>
               <w:top w:w="120" w:type="dxa"/>
               <w:bottom w:w="120" w:type="dxa"/>
-              <w:left w:w="150" w:type="dxa"/>
-              <w:right w:w="150" w:type="dxa"/>
+              <w:left w:w="160" w:type="dxa"/>
+              <w:right w:w="160" w:type="dxa"/>
             </w:tcMar>
-            <w:shd w:fill="F4EFE9"/>
           </w:tcPr>
           <w:p>
             <w:pPr>
-              <w:jc w:val="left"/>
-            </w:pPr>
-            <w:r>
-              <w:rPr>
-                <w:rFonts w:ascii="Calibri" w:hAnsi="Calibri"/>
-                <w:sz w:val="20"/>
-              </w:rPr>
-              <w:t>Stock de matière brute (1 mois) + trésorerie de démarrage</w:t>
-            </w:r>
-          </w:p>
-        </w:tc>
-        <w:tc>
-          <w:tcPr>
-            <w:tcW w:type="dxa" w:w="3120"/>
-            <w:tcMar>
-              <w:top w:w="120" w:type="dxa"/>
-              <w:bottom w:w="120" w:type="dxa"/>
-              <w:left w:w="150" w:type="dxa"/>
-              <w:right w:w="150" w:type="dxa"/>
-            </w:tcMar>
-            <w:shd w:fill="F4EFE9"/>
-          </w:tcPr>
-          <w:p>
-            <w:pPr>
-              <w:jc w:val="left"/>
+              <w:jc w:val="right"/>
             </w:pPr>
             <w:r>
               <w:rPr>
@@ -2032,13 +2174,13 @@
         <w:tc>
           <w:tcPr>
             <w:tcW w:type="dxa" w:w="3120"/>
+            <w:shd w:fill="EAEFF5"/>
             <w:tcMar>
               <w:top w:w="120" w:type="dxa"/>
               <w:bottom w:w="120" w:type="dxa"/>
-              <w:left w:w="150" w:type="dxa"/>
-              <w:right w:w="150" w:type="dxa"/>
+              <w:left w:w="160" w:type="dxa"/>
+              <w:right w:w="160" w:type="dxa"/>
             </w:tcMar>
-            <w:shd w:fill="FFFFFF"/>
           </w:tcPr>
           <w:p>
             <w:pPr>
@@ -2047,6 +2189,8 @@
             <w:r>
               <w:rPr>
                 <w:rFonts w:ascii="Calibri" w:hAnsi="Calibri"/>
+                <w:b/>
+                <w:color w:val="0E2C43"/>
                 <w:sz w:val="20"/>
               </w:rPr>
               <w:t>TOTAL CAPEX REQUIS</w:t>
@@ -2056,13 +2200,13 @@
         <w:tc>
           <w:tcPr>
             <w:tcW w:type="dxa" w:w="3120"/>
+            <w:shd w:fill="EAEFF5"/>
             <w:tcMar>
               <w:top w:w="120" w:type="dxa"/>
               <w:bottom w:w="120" w:type="dxa"/>
-              <w:left w:w="150" w:type="dxa"/>
-              <w:right w:w="150" w:type="dxa"/>
+              <w:left w:w="160" w:type="dxa"/>
+              <w:right w:w="160" w:type="dxa"/>
             </w:tcMar>
-            <w:shd w:fill="FFFFFF"/>
           </w:tcPr>
           <w:p>
             <w:pPr>
@@ -2071,6 +2215,8 @@
             <w:r>
               <w:rPr>
                 <w:rFonts w:ascii="Calibri" w:hAnsi="Calibri"/>
+                <w:b/>
+                <w:color w:val="0E2C43"/>
                 <w:sz w:val="20"/>
               </w:rPr>
               <w:t>Investissement Total Démarrage</w:t>
@@ -2080,21 +2226,23 @@
         <w:tc>
           <w:tcPr>
             <w:tcW w:type="dxa" w:w="3120"/>
+            <w:shd w:fill="EAEFF5"/>
             <w:tcMar>
               <w:top w:w="120" w:type="dxa"/>
               <w:bottom w:w="120" w:type="dxa"/>
-              <w:left w:w="150" w:type="dxa"/>
-              <w:right w:w="150" w:type="dxa"/>
+              <w:left w:w="160" w:type="dxa"/>
+              <w:right w:w="160" w:type="dxa"/>
             </w:tcMar>
-            <w:shd w:fill="FFFFFF"/>
           </w:tcPr>
           <w:p>
             <w:pPr>
-              <w:jc w:val="left"/>
+              <w:jc w:val="right"/>
             </w:pPr>
             <w:r>
               <w:rPr>
                 <w:rFonts w:ascii="Calibri" w:hAnsi="Calibri"/>
+                <w:b/>
+                <w:color w:val="0E2C43"/>
                 <w:sz w:val="20"/>
               </w:rPr>
               <w:t>28 000 000</w:t>
@@ -2103,18 +2251,22 @@
         </w:tc>
       </w:tr>
     </w:tbl>
-    <w:p/>
     <w:p>
       <w:pPr>
-        <w:pStyle w:val="Heading2"/>
-        <w:spacing w:before="240" w:after="80"/>
+        <w:spacing w:after="160"/>
+      </w:pPr>
+    </w:p>
+    <w:p>
+      <w:pPr>
+        <w:keepNext/>
+        <w:spacing w:before="280" w:after="80"/>
       </w:pPr>
       <w:r>
         <w:rPr>
           <w:rFonts w:ascii="Arial" w:hAnsi="Arial"/>
           <w:b/>
           <w:color w:val="B66A3F"/>
-          <w:sz w:val="26"/>
+          <w:sz w:val="24"/>
         </w:rPr>
         <w:t>5.3 Modélisation des Charges d'Exploitation Mensuelles (OPEX)</w:t>
       </w:r>
@@ -2124,6 +2276,14 @@
         <w:tblW w:type="auto" w:w="0"/>
         <w:jc w:val="center"/>
         <w:tblLook w:firstColumn="1" w:firstRow="1" w:lastColumn="0" w:lastRow="0" w:noHBand="0" w:noVBand="1" w:val="04A0"/>
+        <w:tblBorders>
+          <w:top w:val="single" w:sz="4" w:space="0" w:color="D3D3D3"/>
+          <w:left w:val="none"/>
+          <w:bottom w:val="single" w:sz="4" w:space="0" w:color="D3D3D3"/>
+          <w:right w:val="none"/>
+          <w:insideH w:val="single" w:sz="4" w:space="0" w:color="D3D3D3"/>
+          <w:insideV w:val="none"/>
+        </w:tblBorders>
       </w:tblPr>
       <w:tblGrid>
         <w:gridCol w:w="3120"/>
@@ -2134,13 +2294,13 @@
         <w:tc>
           <w:tcPr>
             <w:tcW w:type="dxa" w:w="3120"/>
+            <w:shd w:fill="0E2C43"/>
             <w:tcMar>
-              <w:top w:w="120" w:type="dxa"/>
-              <w:bottom w:w="120" w:type="dxa"/>
-              <w:left w:w="150" w:type="dxa"/>
-              <w:right w:w="150" w:type="dxa"/>
+              <w:top w:w="140" w:type="dxa"/>
+              <w:bottom w:w="140" w:type="dxa"/>
+              <w:left w:w="160" w:type="dxa"/>
+              <w:right w:w="160" w:type="dxa"/>
             </w:tcMar>
-            <w:shd w:fill="0E2C43"/>
           </w:tcPr>
           <w:p>
             <w:pPr>
@@ -2148,7 +2308,7 @@
             </w:pPr>
             <w:r>
               <w:rPr>
-                <w:rFonts w:ascii="Calibri" w:hAnsi="Calibri"/>
+                <w:rFonts w:ascii="Arial" w:hAnsi="Arial"/>
                 <w:b/>
                 <w:color w:val="FFFFFF"/>
                 <w:sz w:val="20"/>
@@ -2160,13 +2320,13 @@
         <w:tc>
           <w:tcPr>
             <w:tcW w:type="dxa" w:w="3120"/>
+            <w:shd w:fill="0E2C43"/>
             <w:tcMar>
-              <w:top w:w="120" w:type="dxa"/>
-              <w:bottom w:w="120" w:type="dxa"/>
-              <w:left w:w="150" w:type="dxa"/>
-              <w:right w:w="150" w:type="dxa"/>
+              <w:top w:w="140" w:type="dxa"/>
+              <w:bottom w:w="140" w:type="dxa"/>
+              <w:left w:w="160" w:type="dxa"/>
+              <w:right w:w="160" w:type="dxa"/>
             </w:tcMar>
-            <w:shd w:fill="0E2C43"/>
           </w:tcPr>
           <w:p>
             <w:pPr>
@@ -2174,33 +2334,33 @@
             </w:pPr>
             <w:r>
               <w:rPr>
-                <w:rFonts w:ascii="Calibri" w:hAnsi="Calibri"/>
+                <w:rFonts w:ascii="Arial" w:hAnsi="Arial"/>
                 <w:b/>
                 <w:color w:val="FFFFFF"/>
                 <w:sz w:val="20"/>
               </w:rPr>
-              <w:t>Base de Calcul / Détails Mensuels</w:t>
+              <w:t>Base de Calcul Mensuelle</w:t>
             </w:r>
           </w:p>
         </w:tc>
         <w:tc>
           <w:tcPr>
             <w:tcW w:type="dxa" w:w="3120"/>
+            <w:shd w:fill="0E2C43"/>
             <w:tcMar>
-              <w:top w:w="120" w:type="dxa"/>
-              <w:bottom w:w="120" w:type="dxa"/>
-              <w:left w:w="150" w:type="dxa"/>
-              <w:right w:w="150" w:type="dxa"/>
+              <w:top w:w="140" w:type="dxa"/>
+              <w:bottom w:w="140" w:type="dxa"/>
+              <w:left w:w="160" w:type="dxa"/>
+              <w:right w:w="160" w:type="dxa"/>
             </w:tcMar>
-            <w:shd w:fill="0E2C43"/>
           </w:tcPr>
           <w:p>
             <w:pPr>
-              <w:jc w:val="left"/>
+              <w:jc w:val="right"/>
             </w:pPr>
             <w:r>
               <w:rPr>
-                <w:rFonts w:ascii="Calibri" w:hAnsi="Calibri"/>
+                <w:rFonts w:ascii="Arial" w:hAnsi="Arial"/>
                 <w:b/>
                 <w:color w:val="FFFFFF"/>
                 <w:sz w:val="20"/>
@@ -2214,13 +2374,13 @@
         <w:tc>
           <w:tcPr>
             <w:tcW w:type="dxa" w:w="3120"/>
+            <w:shd w:fill="FFFFFF"/>
             <w:tcMar>
               <w:top w:w="120" w:type="dxa"/>
               <w:bottom w:w="120" w:type="dxa"/>
-              <w:left w:w="150" w:type="dxa"/>
-              <w:right w:w="150" w:type="dxa"/>
+              <w:left w:w="160" w:type="dxa"/>
+              <w:right w:w="160" w:type="dxa"/>
             </w:tcMar>
-            <w:shd w:fill="F4EFE9"/>
           </w:tcPr>
           <w:p>
             <w:pPr>
@@ -2229,6 +2389,7 @@
             <w:r>
               <w:rPr>
                 <w:rFonts w:ascii="Calibri" w:hAnsi="Calibri"/>
+                <w:b/>
                 <w:sz w:val="20"/>
               </w:rPr>
               <w:t>Achat Matière Première Brute</w:t>
@@ -2238,13 +2399,13 @@
         <w:tc>
           <w:tcPr>
             <w:tcW w:type="dxa" w:w="3120"/>
+            <w:shd w:fill="FFFFFF"/>
             <w:tcMar>
               <w:top w:w="120" w:type="dxa"/>
               <w:bottom w:w="120" w:type="dxa"/>
-              <w:left w:w="150" w:type="dxa"/>
-              <w:right w:w="150" w:type="dxa"/>
+              <w:left w:w="160" w:type="dxa"/>
+              <w:right w:w="160" w:type="dxa"/>
             </w:tcMar>
-            <w:shd w:fill="F4EFE9"/>
           </w:tcPr>
           <w:p>
             <w:pPr>
@@ -2262,17 +2423,17 @@
         <w:tc>
           <w:tcPr>
             <w:tcW w:type="dxa" w:w="3120"/>
+            <w:shd w:fill="FFFFFF"/>
             <w:tcMar>
               <w:top w:w="120" w:type="dxa"/>
               <w:bottom w:w="120" w:type="dxa"/>
-              <w:left w:w="150" w:type="dxa"/>
-              <w:right w:w="150" w:type="dxa"/>
+              <w:left w:w="160" w:type="dxa"/>
+              <w:right w:w="160" w:type="dxa"/>
             </w:tcMar>
-            <w:shd w:fill="F4EFE9"/>
           </w:tcPr>
           <w:p>
             <w:pPr>
-              <w:jc w:val="left"/>
+              <w:jc w:val="right"/>
             </w:pPr>
             <w:r>
               <w:rPr>
@@ -2288,13 +2449,38 @@
         <w:tc>
           <w:tcPr>
             <w:tcW w:type="dxa" w:w="3120"/>
+            <w:shd w:fill="F9FAFC"/>
             <w:tcMar>
               <w:top w:w="120" w:type="dxa"/>
               <w:bottom w:w="120" w:type="dxa"/>
-              <w:left w:w="150" w:type="dxa"/>
-              <w:right w:w="150" w:type="dxa"/>
+              <w:left w:w="160" w:type="dxa"/>
+              <w:right w:w="160" w:type="dxa"/>
             </w:tcMar>
-            <w:shd w:fill="FFFFFF"/>
+          </w:tcPr>
+          <w:p>
+            <w:pPr>
+              <w:jc w:val="left"/>
+            </w:pPr>
+            <w:r>
+              <w:rPr>
+                <w:rFonts w:ascii="Calibri" w:hAnsi="Calibri"/>
+                <w:b/>
+                <w:sz w:val="20"/>
+              </w:rPr>
+              <w:t>Consommation Énergie &amp; Eau</w:t>
+            </w:r>
+          </w:p>
+        </w:tc>
+        <w:tc>
+          <w:tcPr>
+            <w:tcW w:type="dxa" w:w="3120"/>
+            <w:shd w:fill="F9FAFC"/>
+            <w:tcMar>
+              <w:top w:w="120" w:type="dxa"/>
+              <w:bottom w:w="120" w:type="dxa"/>
+              <w:left w:w="160" w:type="dxa"/>
+              <w:right w:w="160" w:type="dxa"/>
+            </w:tcMar>
           </w:tcPr>
           <w:p>
             <w:pPr>
@@ -2305,48 +2491,24 @@
                 <w:rFonts w:ascii="Calibri" w:hAnsi="Calibri"/>
                 <w:sz w:val="20"/>
               </w:rPr>
-              <w:t>Consommation Énergie &amp; Eau</w:t>
+              <w:t>Sbee triphasé + carburant groupe secours</w:t>
             </w:r>
           </w:p>
         </w:tc>
         <w:tc>
           <w:tcPr>
             <w:tcW w:type="dxa" w:w="3120"/>
+            <w:shd w:fill="F9FAFC"/>
             <w:tcMar>
               <w:top w:w="120" w:type="dxa"/>
               <w:bottom w:w="120" w:type="dxa"/>
-              <w:left w:w="150" w:type="dxa"/>
-              <w:right w:w="150" w:type="dxa"/>
+              <w:left w:w="160" w:type="dxa"/>
+              <w:right w:w="160" w:type="dxa"/>
             </w:tcMar>
-            <w:shd w:fill="FFFFFF"/>
           </w:tcPr>
           <w:p>
             <w:pPr>
-              <w:jc w:val="left"/>
-            </w:pPr>
-            <w:r>
-              <w:rPr>
-                <w:rFonts w:ascii="Calibri" w:hAnsi="Calibri"/>
-                <w:sz w:val="20"/>
-              </w:rPr>
-              <w:t>Sbee triphasé + carburant secours + appointing eau</w:t>
-            </w:r>
-          </w:p>
-        </w:tc>
-        <w:tc>
-          <w:tcPr>
-            <w:tcW w:type="dxa" w:w="3120"/>
-            <w:tcMar>
-              <w:top w:w="120" w:type="dxa"/>
-              <w:bottom w:w="120" w:type="dxa"/>
-              <w:left w:w="150" w:type="dxa"/>
-              <w:right w:w="150" w:type="dxa"/>
-            </w:tcMar>
-            <w:shd w:fill="FFFFFF"/>
-          </w:tcPr>
-          <w:p>
-            <w:pPr>
-              <w:jc w:val="left"/>
+              <w:jc w:val="right"/>
             </w:pPr>
             <w:r>
               <w:rPr>
@@ -2362,13 +2524,38 @@
         <w:tc>
           <w:tcPr>
             <w:tcW w:type="dxa" w:w="3120"/>
+            <w:shd w:fill="FFFFFF"/>
             <w:tcMar>
               <w:top w:w="120" w:type="dxa"/>
               <w:bottom w:w="120" w:type="dxa"/>
-              <w:left w:w="150" w:type="dxa"/>
-              <w:right w:w="150" w:type="dxa"/>
+              <w:left w:w="160" w:type="dxa"/>
+              <w:right w:w="160" w:type="dxa"/>
             </w:tcMar>
-            <w:shd w:fill="F4EFE9"/>
+          </w:tcPr>
+          <w:p>
+            <w:pPr>
+              <w:jc w:val="left"/>
+            </w:pPr>
+            <w:r>
+              <w:rPr>
+                <w:rFonts w:ascii="Calibri" w:hAnsi="Calibri"/>
+                <w:b/>
+                <w:sz w:val="20"/>
+              </w:rPr>
+              <w:t>Masse Salariale (10 Personnes)</w:t>
+            </w:r>
+          </w:p>
+        </w:tc>
+        <w:tc>
+          <w:tcPr>
+            <w:tcW w:type="dxa" w:w="3120"/>
+            <w:shd w:fill="FFFFFF"/>
+            <w:tcMar>
+              <w:top w:w="120" w:type="dxa"/>
+              <w:bottom w:w="120" w:type="dxa"/>
+              <w:left w:w="160" w:type="dxa"/>
+              <w:right w:w="160" w:type="dxa"/>
+            </w:tcMar>
           </w:tcPr>
           <w:p>
             <w:pPr>
@@ -2379,48 +2566,24 @@
                 <w:rFonts w:ascii="Calibri" w:hAnsi="Calibri"/>
                 <w:sz w:val="20"/>
               </w:rPr>
-              <w:t>Masse Salariale (10 Personnes)</w:t>
+              <w:t>DG, Gérant SST, 6 Opérateurs, 2 Chauffeurs</w:t>
             </w:r>
           </w:p>
         </w:tc>
         <w:tc>
           <w:tcPr>
             <w:tcW w:type="dxa" w:w="3120"/>
+            <w:shd w:fill="FFFFFF"/>
             <w:tcMar>
               <w:top w:w="120" w:type="dxa"/>
               <w:bottom w:w="120" w:type="dxa"/>
-              <w:left w:w="150" w:type="dxa"/>
-              <w:right w:w="150" w:type="dxa"/>
+              <w:left w:w="160" w:type="dxa"/>
+              <w:right w:w="160" w:type="dxa"/>
             </w:tcMar>
-            <w:shd w:fill="F4EFE9"/>
           </w:tcPr>
           <w:p>
             <w:pPr>
-              <w:jc w:val="left"/>
-            </w:pPr>
-            <w:r>
-              <w:rPr>
-                <w:rFonts w:ascii="Calibri" w:hAnsi="Calibri"/>
-                <w:sz w:val="20"/>
-              </w:rPr>
-              <w:t>DG, Gérant SST, 6 Opérateurs, 2 Chauffeurs/Collecteurs</w:t>
-            </w:r>
-          </w:p>
-        </w:tc>
-        <w:tc>
-          <w:tcPr>
-            <w:tcW w:type="dxa" w:w="3120"/>
-            <w:tcMar>
-              <w:top w:w="120" w:type="dxa"/>
-              <w:bottom w:w="120" w:type="dxa"/>
-              <w:left w:w="150" w:type="dxa"/>
-              <w:right w:w="150" w:type="dxa"/>
-            </w:tcMar>
-            <w:shd w:fill="F4EFE9"/>
-          </w:tcPr>
-          <w:p>
-            <w:pPr>
-              <w:jc w:val="left"/>
+              <w:jc w:val="right"/>
             </w:pPr>
             <w:r>
               <w:rPr>
@@ -2436,13 +2599,13 @@
         <w:tc>
           <w:tcPr>
             <w:tcW w:type="dxa" w:w="3120"/>
+            <w:shd w:fill="F9FAFC"/>
             <w:tcMar>
               <w:top w:w="120" w:type="dxa"/>
               <w:bottom w:w="120" w:type="dxa"/>
-              <w:left w:w="150" w:type="dxa"/>
-              <w:right w:w="150" w:type="dxa"/>
+              <w:left w:w="160" w:type="dxa"/>
+              <w:right w:w="160" w:type="dxa"/>
             </w:tcMar>
-            <w:shd w:fill="FFFFFF"/>
           </w:tcPr>
           <w:p>
             <w:pPr>
@@ -2451,6 +2614,7 @@
             <w:r>
               <w:rPr>
                 <w:rFonts w:ascii="Calibri" w:hAnsi="Calibri"/>
+                <w:b/>
                 <w:sz w:val="20"/>
               </w:rPr>
               <w:t>Transport &amp; Logistique de collecte</w:t>
@@ -2460,13 +2624,13 @@
         <w:tc>
           <w:tcPr>
             <w:tcW w:type="dxa" w:w="3120"/>
+            <w:shd w:fill="F9FAFC"/>
             <w:tcMar>
               <w:top w:w="120" w:type="dxa"/>
               <w:bottom w:w="120" w:type="dxa"/>
-              <w:left w:w="150" w:type="dxa"/>
-              <w:right w:w="150" w:type="dxa"/>
+              <w:left w:w="160" w:type="dxa"/>
+              <w:right w:w="160" w:type="dxa"/>
             </w:tcMar>
-            <w:shd w:fill="FFFFFF"/>
           </w:tcPr>
           <w:p>
             <w:pPr>
@@ -2484,17 +2648,17 @@
         <w:tc>
           <w:tcPr>
             <w:tcW w:type="dxa" w:w="3120"/>
+            <w:shd w:fill="F9FAFC"/>
             <w:tcMar>
               <w:top w:w="120" w:type="dxa"/>
               <w:bottom w:w="120" w:type="dxa"/>
-              <w:left w:w="150" w:type="dxa"/>
-              <w:right w:w="150" w:type="dxa"/>
+              <w:left w:w="160" w:type="dxa"/>
+              <w:right w:w="160" w:type="dxa"/>
             </w:tcMar>
-            <w:shd w:fill="FFFFFF"/>
           </w:tcPr>
           <w:p>
             <w:pPr>
-              <w:jc w:val="left"/>
+              <w:jc w:val="right"/>
             </w:pPr>
             <w:r>
               <w:rPr>
@@ -2510,13 +2674,13 @@
         <w:tc>
           <w:tcPr>
             <w:tcW w:type="dxa" w:w="3120"/>
+            <w:shd w:fill="FFFFFF"/>
             <w:tcMar>
               <w:top w:w="120" w:type="dxa"/>
               <w:bottom w:w="120" w:type="dxa"/>
-              <w:left w:w="150" w:type="dxa"/>
-              <w:right w:w="150" w:type="dxa"/>
+              <w:left w:w="160" w:type="dxa"/>
+              <w:right w:w="160" w:type="dxa"/>
             </w:tcMar>
-            <w:shd w:fill="F4EFE9"/>
           </w:tcPr>
           <w:p>
             <w:pPr>
@@ -2525,6 +2689,7 @@
             <w:r>
               <w:rPr>
                 <w:rFonts w:ascii="Calibri" w:hAnsi="Calibri"/>
+                <w:b/>
                 <w:sz w:val="20"/>
               </w:rPr>
               <w:t>Maintenance Préventive &amp; Lames</w:t>
@@ -2534,13 +2699,13 @@
         <w:tc>
           <w:tcPr>
             <w:tcW w:type="dxa" w:w="3120"/>
+            <w:shd w:fill="FFFFFF"/>
             <w:tcMar>
               <w:top w:w="120" w:type="dxa"/>
               <w:bottom w:w="120" w:type="dxa"/>
-              <w:left w:w="150" w:type="dxa"/>
-              <w:right w:w="150" w:type="dxa"/>
+              <w:left w:w="160" w:type="dxa"/>
+              <w:right w:w="160" w:type="dxa"/>
             </w:tcMar>
-            <w:shd w:fill="F4EFE9"/>
           </w:tcPr>
           <w:p>
             <w:pPr>
@@ -2558,17 +2723,17 @@
         <w:tc>
           <w:tcPr>
             <w:tcW w:type="dxa" w:w="3120"/>
+            <w:shd w:fill="FFFFFF"/>
             <w:tcMar>
               <w:top w:w="120" w:type="dxa"/>
               <w:bottom w:w="120" w:type="dxa"/>
-              <w:left w:w="150" w:type="dxa"/>
-              <w:right w:w="150" w:type="dxa"/>
+              <w:left w:w="160" w:type="dxa"/>
+              <w:right w:w="160" w:type="dxa"/>
             </w:tcMar>
-            <w:shd w:fill="F4EFE9"/>
           </w:tcPr>
           <w:p>
             <w:pPr>
-              <w:jc w:val="left"/>
+              <w:jc w:val="right"/>
             </w:pPr>
             <w:r>
               <w:rPr>
@@ -2584,13 +2749,13 @@
         <w:tc>
           <w:tcPr>
             <w:tcW w:type="dxa" w:w="3120"/>
+            <w:shd w:fill="F9FAFC"/>
             <w:tcMar>
               <w:top w:w="120" w:type="dxa"/>
               <w:bottom w:w="120" w:type="dxa"/>
-              <w:left w:w="150" w:type="dxa"/>
-              <w:right w:w="150" w:type="dxa"/>
+              <w:left w:w="160" w:type="dxa"/>
+              <w:right w:w="160" w:type="dxa"/>
             </w:tcMar>
-            <w:shd w:fill="FFFFFF"/>
           </w:tcPr>
           <w:p>
             <w:pPr>
@@ -2599,6 +2764,7 @@
             <w:r>
               <w:rPr>
                 <w:rFonts w:ascii="Calibri" w:hAnsi="Calibri"/>
+                <w:b/>
                 <w:sz w:val="20"/>
               </w:rPr>
               <w:t>Frais Généraux &amp; Assurances</w:t>
@@ -2608,13 +2774,13 @@
         <w:tc>
           <w:tcPr>
             <w:tcW w:type="dxa" w:w="3120"/>
+            <w:shd w:fill="F9FAFC"/>
             <w:tcMar>
               <w:top w:w="120" w:type="dxa"/>
               <w:bottom w:w="120" w:type="dxa"/>
-              <w:left w:w="150" w:type="dxa"/>
-              <w:right w:w="150" w:type="dxa"/>
+              <w:left w:w="160" w:type="dxa"/>
+              <w:right w:w="160" w:type="dxa"/>
             </w:tcMar>
-            <w:shd w:fill="FFFFFF"/>
           </w:tcPr>
           <w:p>
             <w:pPr>
@@ -2632,17 +2798,17 @@
         <w:tc>
           <w:tcPr>
             <w:tcW w:type="dxa" w:w="3120"/>
+            <w:shd w:fill="F9FAFC"/>
             <w:tcMar>
               <w:top w:w="120" w:type="dxa"/>
               <w:bottom w:w="120" w:type="dxa"/>
-              <w:left w:w="150" w:type="dxa"/>
-              <w:right w:w="150" w:type="dxa"/>
+              <w:left w:w="160" w:type="dxa"/>
+              <w:right w:w="160" w:type="dxa"/>
             </w:tcMar>
-            <w:shd w:fill="FFFFFF"/>
           </w:tcPr>
           <w:p>
             <w:pPr>
-              <w:jc w:val="left"/>
+              <w:jc w:val="right"/>
             </w:pPr>
             <w:r>
               <w:rPr>
@@ -2658,13 +2824,13 @@
         <w:tc>
           <w:tcPr>
             <w:tcW w:type="dxa" w:w="3120"/>
+            <w:shd w:fill="EAEFF5"/>
             <w:tcMar>
               <w:top w:w="120" w:type="dxa"/>
               <w:bottom w:w="120" w:type="dxa"/>
-              <w:left w:w="150" w:type="dxa"/>
-              <w:right w:w="150" w:type="dxa"/>
+              <w:left w:w="160" w:type="dxa"/>
+              <w:right w:w="160" w:type="dxa"/>
             </w:tcMar>
-            <w:shd w:fill="F4EFE9"/>
           </w:tcPr>
           <w:p>
             <w:pPr>
@@ -2673,6 +2839,8 @@
             <w:r>
               <w:rPr>
                 <w:rFonts w:ascii="Calibri" w:hAnsi="Calibri"/>
+                <w:b/>
+                <w:color w:val="0E2C43"/>
                 <w:sz w:val="20"/>
               </w:rPr>
               <w:t>TOTAL OPEX MENSUEL</w:t>
@@ -2682,13 +2850,13 @@
         <w:tc>
           <w:tcPr>
             <w:tcW w:type="dxa" w:w="3120"/>
+            <w:shd w:fill="EAEFF5"/>
             <w:tcMar>
               <w:top w:w="120" w:type="dxa"/>
               <w:bottom w:w="120" w:type="dxa"/>
-              <w:left w:w="150" w:type="dxa"/>
-              <w:right w:w="150" w:type="dxa"/>
+              <w:left w:w="160" w:type="dxa"/>
+              <w:right w:w="160" w:type="dxa"/>
             </w:tcMar>
-            <w:shd w:fill="F4EFE9"/>
           </w:tcPr>
           <w:p>
             <w:pPr>
@@ -2697,6 +2865,8 @@
             <w:r>
               <w:rPr>
                 <w:rFonts w:ascii="Calibri" w:hAnsi="Calibri"/>
+                <w:b/>
+                <w:color w:val="0E2C43"/>
                 <w:sz w:val="20"/>
               </w:rPr>
               <w:t>Coût de Fonctionnement Mensuel</w:t>
@@ -2706,21 +2876,23 @@
         <w:tc>
           <w:tcPr>
             <w:tcW w:type="dxa" w:w="3120"/>
+            <w:shd w:fill="EAEFF5"/>
             <w:tcMar>
               <w:top w:w="120" w:type="dxa"/>
               <w:bottom w:w="120" w:type="dxa"/>
-              <w:left w:w="150" w:type="dxa"/>
-              <w:right w:w="150" w:type="dxa"/>
+              <w:left w:w="160" w:type="dxa"/>
+              <w:right w:w="160" w:type="dxa"/>
             </w:tcMar>
-            <w:shd w:fill="F4EFE9"/>
           </w:tcPr>
           <w:p>
             <w:pPr>
-              <w:jc w:val="left"/>
+              <w:jc w:val="right"/>
             </w:pPr>
             <w:r>
               <w:rPr>
                 <w:rFonts w:ascii="Calibri" w:hAnsi="Calibri"/>
+                <w:b/>
+                <w:color w:val="0E2C43"/>
                 <w:sz w:val="20"/>
               </w:rPr>
               <w:t>10 280 000</w:t>
@@ -2729,20 +2901,24 @@
         </w:tc>
       </w:tr>
     </w:tbl>
-    <w:p/>
     <w:p>
       <w:pPr>
-        <w:pStyle w:val="Heading2"/>
-        <w:spacing w:before="240" w:after="80"/>
+        <w:spacing w:after="160"/>
+      </w:pPr>
+    </w:p>
+    <w:p>
+      <w:pPr>
+        <w:keepNext/>
+        <w:spacing w:before="280" w:after="80"/>
       </w:pPr>
       <w:r>
         <w:rPr>
           <w:rFonts w:ascii="Arial" w:hAnsi="Arial"/>
           <w:b/>
           <w:color w:val="B66A3F"/>
-          <w:sz w:val="26"/>
+          <w:sz w:val="24"/>
         </w:rPr>
-        <w:t>5.4 Compte de Résultat Prévisionnel Mensuel et Annuel (Année 1)</w:t>
+        <w:t>5.4 Compte de Résultat Prévisionnel (Année 1)</w:t>
       </w:r>
     </w:p>
     <w:tbl>
@@ -2750,6 +2926,14 @@
         <w:tblW w:type="auto" w:w="0"/>
         <w:jc w:val="center"/>
         <w:tblLook w:firstColumn="1" w:firstRow="1" w:lastColumn="0" w:lastRow="0" w:noHBand="0" w:noVBand="1" w:val="04A0"/>
+        <w:tblBorders>
+          <w:top w:val="single" w:sz="4" w:space="0" w:color="D3D3D3"/>
+          <w:left w:val="none"/>
+          <w:bottom w:val="single" w:sz="4" w:space="0" w:color="D3D3D3"/>
+          <w:right w:val="none"/>
+          <w:insideH w:val="single" w:sz="4" w:space="0" w:color="D3D3D3"/>
+          <w:insideV w:val="none"/>
+        </w:tblBorders>
       </w:tblPr>
       <w:tblGrid>
         <w:gridCol w:w="3120"/>
@@ -2760,13 +2944,13 @@
         <w:tc>
           <w:tcPr>
             <w:tcW w:type="dxa" w:w="3120"/>
+            <w:shd w:fill="0E2C43"/>
             <w:tcMar>
-              <w:top w:w="120" w:type="dxa"/>
-              <w:bottom w:w="120" w:type="dxa"/>
-              <w:left w:w="150" w:type="dxa"/>
-              <w:right w:w="150" w:type="dxa"/>
+              <w:top w:w="140" w:type="dxa"/>
+              <w:bottom w:w="140" w:type="dxa"/>
+              <w:left w:w="160" w:type="dxa"/>
+              <w:right w:w="160" w:type="dxa"/>
             </w:tcMar>
-            <w:shd w:fill="0E2C43"/>
           </w:tcPr>
           <w:p>
             <w:pPr>
@@ -2774,25 +2958,25 @@
             </w:pPr>
             <w:r>
               <w:rPr>
-                <w:rFonts w:ascii="Calibri" w:hAnsi="Calibri"/>
+                <w:rFonts w:ascii="Arial" w:hAnsi="Arial"/>
                 <w:b/>
                 <w:color w:val="FFFFFF"/>
                 <w:sz w:val="20"/>
               </w:rPr>
-              <w:t>Compte de Résultat</w:t>
+              <w:t>Poste du Compte de Résultat</w:t>
             </w:r>
           </w:p>
         </w:tc>
         <w:tc>
           <w:tcPr>
             <w:tcW w:type="dxa" w:w="3120"/>
+            <w:shd w:fill="0E2C43"/>
             <w:tcMar>
-              <w:top w:w="120" w:type="dxa"/>
-              <w:bottom w:w="120" w:type="dxa"/>
-              <w:left w:w="150" w:type="dxa"/>
-              <w:right w:w="150" w:type="dxa"/>
+              <w:top w:w="140" w:type="dxa"/>
+              <w:bottom w:w="140" w:type="dxa"/>
+              <w:left w:w="160" w:type="dxa"/>
+              <w:right w:w="160" w:type="dxa"/>
             </w:tcMar>
-            <w:shd w:fill="0E2C43"/>
           </w:tcPr>
           <w:p>
             <w:pPr>
@@ -2800,7 +2984,7 @@
             </w:pPr>
             <w:r>
               <w:rPr>
-                <w:rFonts w:ascii="Calibri" w:hAnsi="Calibri"/>
+                <w:rFonts w:ascii="Arial" w:hAnsi="Arial"/>
                 <w:b/>
                 <w:color w:val="FFFFFF"/>
                 <w:sz w:val="20"/>
@@ -2812,21 +2996,21 @@
         <w:tc>
           <w:tcPr>
             <w:tcW w:type="dxa" w:w="3120"/>
+            <w:shd w:fill="0E2C43"/>
             <w:tcMar>
-              <w:top w:w="120" w:type="dxa"/>
-              <w:bottom w:w="120" w:type="dxa"/>
-              <w:left w:w="150" w:type="dxa"/>
-              <w:right w:w="150" w:type="dxa"/>
+              <w:top w:w="140" w:type="dxa"/>
+              <w:bottom w:w="140" w:type="dxa"/>
+              <w:left w:w="160" w:type="dxa"/>
+              <w:right w:w="160" w:type="dxa"/>
             </w:tcMar>
-            <w:shd w:fill="0E2C43"/>
           </w:tcPr>
           <w:p>
             <w:pPr>
-              <w:jc w:val="left"/>
+              <w:jc w:val="right"/>
             </w:pPr>
             <w:r>
               <w:rPr>
-                <w:rFonts w:ascii="Calibri" w:hAnsi="Calibri"/>
+                <w:rFonts w:ascii="Arial" w:hAnsi="Arial"/>
                 <w:b/>
                 <w:color w:val="FFFFFF"/>
                 <w:sz w:val="20"/>
@@ -2840,13 +3024,38 @@
         <w:tc>
           <w:tcPr>
             <w:tcW w:type="dxa" w:w="3120"/>
+            <w:shd w:fill="FFFFFF"/>
             <w:tcMar>
               <w:top w:w="120" w:type="dxa"/>
               <w:bottom w:w="120" w:type="dxa"/>
-              <w:left w:w="150" w:type="dxa"/>
-              <w:right w:w="150" w:type="dxa"/>
+              <w:left w:w="160" w:type="dxa"/>
+              <w:right w:w="160" w:type="dxa"/>
             </w:tcMar>
-            <w:shd w:fill="F4EFE9"/>
+          </w:tcPr>
+          <w:p>
+            <w:pPr>
+              <w:jc w:val="left"/>
+            </w:pPr>
+            <w:r>
+              <w:rPr>
+                <w:rFonts w:ascii="Calibri" w:hAnsi="Calibri"/>
+                <w:b/>
+                <w:sz w:val="20"/>
+              </w:rPr>
+              <w:t>CHIFFRE D'AFFAIRES (CA)</w:t>
+            </w:r>
+          </w:p>
+        </w:tc>
+        <w:tc>
+          <w:tcPr>
+            <w:tcW w:type="dxa" w:w="3120"/>
+            <w:shd w:fill="FFFFFF"/>
+            <w:tcMar>
+              <w:top w:w="120" w:type="dxa"/>
+              <w:bottom w:w="120" w:type="dxa"/>
+              <w:left w:w="160" w:type="dxa"/>
+              <w:right w:w="160" w:type="dxa"/>
+            </w:tcMar>
           </w:tcPr>
           <w:p>
             <w:pPr>
@@ -2857,48 +3066,24 @@
                 <w:rFonts w:ascii="Calibri" w:hAnsi="Calibri"/>
                 <w:sz w:val="20"/>
               </w:rPr>
-              <w:t>CHIFFRE D'AFFAIRES (CA)</w:t>
+              <w:t>45 T x 450 000 FCFA/T</w:t>
             </w:r>
           </w:p>
         </w:tc>
         <w:tc>
           <w:tcPr>
             <w:tcW w:type="dxa" w:w="3120"/>
+            <w:shd w:fill="FFFFFF"/>
             <w:tcMar>
               <w:top w:w="120" w:type="dxa"/>
               <w:bottom w:w="120" w:type="dxa"/>
-              <w:left w:w="150" w:type="dxa"/>
-              <w:right w:w="150" w:type="dxa"/>
+              <w:left w:w="160" w:type="dxa"/>
+              <w:right w:w="160" w:type="dxa"/>
             </w:tcMar>
-            <w:shd w:fill="F4EFE9"/>
           </w:tcPr>
           <w:p>
             <w:pPr>
-              <w:jc w:val="left"/>
-            </w:pPr>
-            <w:r>
-              <w:rPr>
-                <w:rFonts w:ascii="Calibri" w:hAnsi="Calibri"/>
-                <w:sz w:val="20"/>
-              </w:rPr>
-              <w:t>45 T Broyat x 450 000 FCFA/T = 20 250 000</w:t>
-            </w:r>
-          </w:p>
-        </w:tc>
-        <w:tc>
-          <w:tcPr>
-            <w:tcW w:type="dxa" w:w="3120"/>
-            <w:tcMar>
-              <w:top w:w="120" w:type="dxa"/>
-              <w:bottom w:w="120" w:type="dxa"/>
-              <w:left w:w="150" w:type="dxa"/>
-              <w:right w:w="150" w:type="dxa"/>
-            </w:tcMar>
-            <w:shd w:fill="F4EFE9"/>
-          </w:tcPr>
-          <w:p>
-            <w:pPr>
-              <w:jc w:val="left"/>
+              <w:jc w:val="right"/>
             </w:pPr>
             <w:r>
               <w:rPr>
@@ -2914,13 +3099,38 @@
         <w:tc>
           <w:tcPr>
             <w:tcW w:type="dxa" w:w="3120"/>
+            <w:shd w:fill="F9FAFC"/>
             <w:tcMar>
               <w:top w:w="120" w:type="dxa"/>
               <w:bottom w:w="120" w:type="dxa"/>
-              <w:left w:w="150" w:type="dxa"/>
-              <w:right w:w="150" w:type="dxa"/>
+              <w:left w:w="160" w:type="dxa"/>
+              <w:right w:w="160" w:type="dxa"/>
             </w:tcMar>
-            <w:shd w:fill="FFFFFF"/>
+          </w:tcPr>
+          <w:p>
+            <w:pPr>
+              <w:jc w:val="left"/>
+            </w:pPr>
+            <w:r>
+              <w:rPr>
+                <w:rFonts w:ascii="Calibri" w:hAnsi="Calibri"/>
+                <w:b/>
+                <w:sz w:val="20"/>
+              </w:rPr>
+              <w:t>Achats Matières Premières</w:t>
+            </w:r>
+          </w:p>
+        </w:tc>
+        <w:tc>
+          <w:tcPr>
+            <w:tcW w:type="dxa" w:w="3120"/>
+            <w:shd w:fill="F9FAFC"/>
+            <w:tcMar>
+              <w:top w:w="120" w:type="dxa"/>
+              <w:bottom w:w="120" w:type="dxa"/>
+              <w:left w:w="160" w:type="dxa"/>
+              <w:right w:w="160" w:type="dxa"/>
+            </w:tcMar>
           </w:tcPr>
           <w:p>
             <w:pPr>
@@ -2931,48 +3141,24 @@
                 <w:rFonts w:ascii="Calibri" w:hAnsi="Calibri"/>
                 <w:sz w:val="20"/>
               </w:rPr>
-              <w:t>Achats Matières Premières</w:t>
+              <w:t>-5 280 000 FCFA</w:t>
             </w:r>
           </w:p>
         </w:tc>
         <w:tc>
           <w:tcPr>
             <w:tcW w:type="dxa" w:w="3120"/>
+            <w:shd w:fill="F9FAFC"/>
             <w:tcMar>
               <w:top w:w="120" w:type="dxa"/>
               <w:bottom w:w="120" w:type="dxa"/>
-              <w:left w:w="150" w:type="dxa"/>
-              <w:right w:w="150" w:type="dxa"/>
+              <w:left w:w="160" w:type="dxa"/>
+              <w:right w:w="160" w:type="dxa"/>
             </w:tcMar>
-            <w:shd w:fill="FFFFFF"/>
           </w:tcPr>
           <w:p>
             <w:pPr>
-              <w:jc w:val="left"/>
-            </w:pPr>
-            <w:r>
-              <w:rPr>
-                <w:rFonts w:ascii="Calibri" w:hAnsi="Calibri"/>
-                <w:sz w:val="20"/>
-              </w:rPr>
-              <w:t>-5 280 000</w:t>
-            </w:r>
-          </w:p>
-        </w:tc>
-        <w:tc>
-          <w:tcPr>
-            <w:tcW w:type="dxa" w:w="3120"/>
-            <w:tcMar>
-              <w:top w:w="120" w:type="dxa"/>
-              <w:bottom w:w="120" w:type="dxa"/>
-              <w:left w:w="150" w:type="dxa"/>
-              <w:right w:w="150" w:type="dxa"/>
-            </w:tcMar>
-            <w:shd w:fill="FFFFFF"/>
-          </w:tcPr>
-          <w:p>
-            <w:pPr>
-              <w:jc w:val="left"/>
+              <w:jc w:val="right"/>
             </w:pPr>
             <w:r>
               <w:rPr>
@@ -2988,13 +3174,38 @@
         <w:tc>
           <w:tcPr>
             <w:tcW w:type="dxa" w:w="3120"/>
+            <w:shd w:fill="FFFFFF"/>
             <w:tcMar>
               <w:top w:w="120" w:type="dxa"/>
               <w:bottom w:w="120" w:type="dxa"/>
-              <w:left w:w="150" w:type="dxa"/>
-              <w:right w:w="150" w:type="dxa"/>
+              <w:left w:w="160" w:type="dxa"/>
+              <w:right w:w="160" w:type="dxa"/>
             </w:tcMar>
-            <w:shd w:fill="F4EFE9"/>
+          </w:tcPr>
+          <w:p>
+            <w:pPr>
+              <w:jc w:val="left"/>
+            </w:pPr>
+            <w:r>
+              <w:rPr>
+                <w:rFonts w:ascii="Calibri" w:hAnsi="Calibri"/>
+                <w:b/>
+                <w:sz w:val="20"/>
+              </w:rPr>
+              <w:t>MARGE BRUTE DE PRODUCTION</w:t>
+            </w:r>
+          </w:p>
+        </w:tc>
+        <w:tc>
+          <w:tcPr>
+            <w:tcW w:type="dxa" w:w="3120"/>
+            <w:shd w:fill="FFFFFF"/>
+            <w:tcMar>
+              <w:top w:w="120" w:type="dxa"/>
+              <w:bottom w:w="120" w:type="dxa"/>
+              <w:left w:w="160" w:type="dxa"/>
+              <w:right w:w="160" w:type="dxa"/>
+            </w:tcMar>
           </w:tcPr>
           <w:p>
             <w:pPr>
@@ -3005,48 +3216,24 @@
                 <w:rFonts w:ascii="Calibri" w:hAnsi="Calibri"/>
                 <w:sz w:val="20"/>
               </w:rPr>
-              <w:t>MARGE BRUTE DE PRODUCTION</w:t>
+              <w:t>14 970 000 FCFA</w:t>
             </w:r>
           </w:p>
         </w:tc>
         <w:tc>
           <w:tcPr>
             <w:tcW w:type="dxa" w:w="3120"/>
+            <w:shd w:fill="FFFFFF"/>
             <w:tcMar>
               <w:top w:w="120" w:type="dxa"/>
               <w:bottom w:w="120" w:type="dxa"/>
-              <w:left w:w="150" w:type="dxa"/>
-              <w:right w:w="150" w:type="dxa"/>
+              <w:left w:w="160" w:type="dxa"/>
+              <w:right w:w="160" w:type="dxa"/>
             </w:tcMar>
-            <w:shd w:fill="F4EFE9"/>
           </w:tcPr>
           <w:p>
             <w:pPr>
-              <w:jc w:val="left"/>
-            </w:pPr>
-            <w:r>
-              <w:rPr>
-                <w:rFonts w:ascii="Calibri" w:hAnsi="Calibri"/>
-                <w:sz w:val="20"/>
-              </w:rPr>
-              <w:t>14 970 000</w:t>
-            </w:r>
-          </w:p>
-        </w:tc>
-        <w:tc>
-          <w:tcPr>
-            <w:tcW w:type="dxa" w:w="3120"/>
-            <w:tcMar>
-              <w:top w:w="120" w:type="dxa"/>
-              <w:bottom w:w="120" w:type="dxa"/>
-              <w:left w:w="150" w:type="dxa"/>
-              <w:right w:w="150" w:type="dxa"/>
-            </w:tcMar>
-            <w:shd w:fill="F4EFE9"/>
-          </w:tcPr>
-          <w:p>
-            <w:pPr>
-              <w:jc w:val="left"/>
+              <w:jc w:val="right"/>
             </w:pPr>
             <w:r>
               <w:rPr>
@@ -3062,13 +3249,38 @@
         <w:tc>
           <w:tcPr>
             <w:tcW w:type="dxa" w:w="3120"/>
+            <w:shd w:fill="F9FAFC"/>
             <w:tcMar>
               <w:top w:w="120" w:type="dxa"/>
               <w:bottom w:w="120" w:type="dxa"/>
-              <w:left w:w="150" w:type="dxa"/>
-              <w:right w:w="150" w:type="dxa"/>
+              <w:left w:w="160" w:type="dxa"/>
+              <w:right w:w="160" w:type="dxa"/>
             </w:tcMar>
-            <w:shd w:fill="FFFFFF"/>
+          </w:tcPr>
+          <w:p>
+            <w:pPr>
+              <w:jc w:val="left"/>
+            </w:pPr>
+            <w:r>
+              <w:rPr>
+                <w:rFonts w:ascii="Calibri" w:hAnsi="Calibri"/>
+                <w:b/>
+                <w:sz w:val="20"/>
+              </w:rPr>
+              <w:t>Autres Charges Externe &amp; OPEX</w:t>
+            </w:r>
+          </w:p>
+        </w:tc>
+        <w:tc>
+          <w:tcPr>
+            <w:tcW w:type="dxa" w:w="3120"/>
+            <w:shd w:fill="F9FAFC"/>
+            <w:tcMar>
+              <w:top w:w="120" w:type="dxa"/>
+              <w:bottom w:w="120" w:type="dxa"/>
+              <w:left w:w="160" w:type="dxa"/>
+              <w:right w:w="160" w:type="dxa"/>
+            </w:tcMar>
           </w:tcPr>
           <w:p>
             <w:pPr>
@@ -3079,48 +3291,24 @@
                 <w:rFonts w:ascii="Calibri" w:hAnsi="Calibri"/>
                 <w:sz w:val="20"/>
               </w:rPr>
-              <w:t>Autres Charges Externe &amp; OPEX</w:t>
+              <w:t>-5 000 000 FCFA</w:t>
             </w:r>
           </w:p>
         </w:tc>
         <w:tc>
           <w:tcPr>
             <w:tcW w:type="dxa" w:w="3120"/>
+            <w:shd w:fill="F9FAFC"/>
             <w:tcMar>
               <w:top w:w="120" w:type="dxa"/>
               <w:bottom w:w="120" w:type="dxa"/>
-              <w:left w:w="150" w:type="dxa"/>
-              <w:right w:w="150" w:type="dxa"/>
+              <w:left w:w="160" w:type="dxa"/>
+              <w:right w:w="160" w:type="dxa"/>
             </w:tcMar>
-            <w:shd w:fill="FFFFFF"/>
           </w:tcPr>
           <w:p>
             <w:pPr>
-              <w:jc w:val="left"/>
-            </w:pPr>
-            <w:r>
-              <w:rPr>
-                <w:rFonts w:ascii="Calibri" w:hAnsi="Calibri"/>
-                <w:sz w:val="20"/>
-              </w:rPr>
-              <w:t>-5 000 000</w:t>
-            </w:r>
-          </w:p>
-        </w:tc>
-        <w:tc>
-          <w:tcPr>
-            <w:tcW w:type="dxa" w:w="3120"/>
-            <w:tcMar>
-              <w:top w:w="120" w:type="dxa"/>
-              <w:bottom w:w="120" w:type="dxa"/>
-              <w:left w:w="150" w:type="dxa"/>
-              <w:right w:w="150" w:type="dxa"/>
-            </w:tcMar>
-            <w:shd w:fill="FFFFFF"/>
-          </w:tcPr>
-          <w:p>
-            <w:pPr>
-              <w:jc w:val="left"/>
+              <w:jc w:val="right"/>
             </w:pPr>
             <w:r>
               <w:rPr>
@@ -3136,13 +3324,38 @@
         <w:tc>
           <w:tcPr>
             <w:tcW w:type="dxa" w:w="3120"/>
+            <w:shd w:fill="FFFFFF"/>
             <w:tcMar>
               <w:top w:w="120" w:type="dxa"/>
               <w:bottom w:w="120" w:type="dxa"/>
-              <w:left w:w="150" w:type="dxa"/>
-              <w:right w:w="150" w:type="dxa"/>
+              <w:left w:w="160" w:type="dxa"/>
+              <w:right w:w="160" w:type="dxa"/>
             </w:tcMar>
-            <w:shd w:fill="F4EFE9"/>
+          </w:tcPr>
+          <w:p>
+            <w:pPr>
+              <w:jc w:val="left"/>
+            </w:pPr>
+            <w:r>
+              <w:rPr>
+                <w:rFonts w:ascii="Calibri" w:hAnsi="Calibri"/>
+                <w:b/>
+                <w:sz w:val="20"/>
+              </w:rPr>
+              <w:t>EXCÉDENT BRUT D'EXPLOITATION (EBITDA)</w:t>
+            </w:r>
+          </w:p>
+        </w:tc>
+        <w:tc>
+          <w:tcPr>
+            <w:tcW w:type="dxa" w:w="3120"/>
+            <w:shd w:fill="FFFFFF"/>
+            <w:tcMar>
+              <w:top w:w="120" w:type="dxa"/>
+              <w:bottom w:w="120" w:type="dxa"/>
+              <w:left w:w="160" w:type="dxa"/>
+              <w:right w:w="160" w:type="dxa"/>
+            </w:tcMar>
           </w:tcPr>
           <w:p>
             <w:pPr>
@@ -3153,48 +3366,24 @@
                 <w:rFonts w:ascii="Calibri" w:hAnsi="Calibri"/>
                 <w:sz w:val="20"/>
               </w:rPr>
-              <w:t>EXCÉDENT BRUT D'EXPLOITATION (EBITDA)</w:t>
+              <w:t>9 970 000 FCFA</w:t>
             </w:r>
           </w:p>
         </w:tc>
         <w:tc>
           <w:tcPr>
             <w:tcW w:type="dxa" w:w="3120"/>
+            <w:shd w:fill="FFFFFF"/>
             <w:tcMar>
               <w:top w:w="120" w:type="dxa"/>
               <w:bottom w:w="120" w:type="dxa"/>
-              <w:left w:w="150" w:type="dxa"/>
-              <w:right w:w="150" w:type="dxa"/>
+              <w:left w:w="160" w:type="dxa"/>
+              <w:right w:w="160" w:type="dxa"/>
             </w:tcMar>
-            <w:shd w:fill="F4EFE9"/>
           </w:tcPr>
           <w:p>
             <w:pPr>
-              <w:jc w:val="left"/>
-            </w:pPr>
-            <w:r>
-              <w:rPr>
-                <w:rFonts w:ascii="Calibri" w:hAnsi="Calibri"/>
-                <w:sz w:val="20"/>
-              </w:rPr>
-              <w:t>9 970 000</w:t>
-            </w:r>
-          </w:p>
-        </w:tc>
-        <w:tc>
-          <w:tcPr>
-            <w:tcW w:type="dxa" w:w="3120"/>
-            <w:tcMar>
-              <w:top w:w="120" w:type="dxa"/>
-              <w:bottom w:w="120" w:type="dxa"/>
-              <w:left w:w="150" w:type="dxa"/>
-              <w:right w:w="150" w:type="dxa"/>
-            </w:tcMar>
-            <w:shd w:fill="F4EFE9"/>
-          </w:tcPr>
-          <w:p>
-            <w:pPr>
-              <w:jc w:val="left"/>
+              <w:jc w:val="right"/>
             </w:pPr>
             <w:r>
               <w:rPr>
@@ -3210,13 +3399,38 @@
         <w:tc>
           <w:tcPr>
             <w:tcW w:type="dxa" w:w="3120"/>
+            <w:shd w:fill="F9FAFC"/>
             <w:tcMar>
               <w:top w:w="120" w:type="dxa"/>
               <w:bottom w:w="120" w:type="dxa"/>
-              <w:left w:w="150" w:type="dxa"/>
-              <w:right w:w="150" w:type="dxa"/>
+              <w:left w:w="160" w:type="dxa"/>
+              <w:right w:w="160" w:type="dxa"/>
             </w:tcMar>
-            <w:shd w:fill="FFFFFF"/>
+          </w:tcPr>
+          <w:p>
+            <w:pPr>
+              <w:jc w:val="left"/>
+            </w:pPr>
+            <w:r>
+              <w:rPr>
+                <w:rFonts w:ascii="Calibri" w:hAnsi="Calibri"/>
+                <w:b/>
+                <w:sz w:val="20"/>
+              </w:rPr>
+              <w:t>Amortissements des Équipements (20%)</w:t>
+            </w:r>
+          </w:p>
+        </w:tc>
+        <w:tc>
+          <w:tcPr>
+            <w:tcW w:type="dxa" w:w="3120"/>
+            <w:shd w:fill="F9FAFC"/>
+            <w:tcMar>
+              <w:top w:w="120" w:type="dxa"/>
+              <w:bottom w:w="120" w:type="dxa"/>
+              <w:left w:w="160" w:type="dxa"/>
+              <w:right w:w="160" w:type="dxa"/>
+            </w:tcMar>
           </w:tcPr>
           <w:p>
             <w:pPr>
@@ -3227,48 +3441,24 @@
                 <w:rFonts w:ascii="Calibri" w:hAnsi="Calibri"/>
                 <w:sz w:val="20"/>
               </w:rPr>
-              <w:t>Amortissements des Équipements (20%)</w:t>
+              <w:t>-350 000 FCFA</w:t>
             </w:r>
           </w:p>
         </w:tc>
         <w:tc>
           <w:tcPr>
             <w:tcW w:type="dxa" w:w="3120"/>
+            <w:shd w:fill="F9FAFC"/>
             <w:tcMar>
               <w:top w:w="120" w:type="dxa"/>
               <w:bottom w:w="120" w:type="dxa"/>
-              <w:left w:w="150" w:type="dxa"/>
-              <w:right w:w="150" w:type="dxa"/>
+              <w:left w:w="160" w:type="dxa"/>
+              <w:right w:w="160" w:type="dxa"/>
             </w:tcMar>
-            <w:shd w:fill="FFFFFF"/>
           </w:tcPr>
           <w:p>
             <w:pPr>
-              <w:jc w:val="left"/>
-            </w:pPr>
-            <w:r>
-              <w:rPr>
-                <w:rFonts w:ascii="Calibri" w:hAnsi="Calibri"/>
-                <w:sz w:val="20"/>
-              </w:rPr>
-              <w:t>-350 000</w:t>
-            </w:r>
-          </w:p>
-        </w:tc>
-        <w:tc>
-          <w:tcPr>
-            <w:tcW w:type="dxa" w:w="3120"/>
-            <w:tcMar>
-              <w:top w:w="120" w:type="dxa"/>
-              <w:bottom w:w="120" w:type="dxa"/>
-              <w:left w:w="150" w:type="dxa"/>
-              <w:right w:w="150" w:type="dxa"/>
-            </w:tcMar>
-            <w:shd w:fill="FFFFFF"/>
-          </w:tcPr>
-          <w:p>
-            <w:pPr>
-              <w:jc w:val="left"/>
+              <w:jc w:val="right"/>
             </w:pPr>
             <w:r>
               <w:rPr>
@@ -3284,13 +3474,38 @@
         <w:tc>
           <w:tcPr>
             <w:tcW w:type="dxa" w:w="3120"/>
+            <w:shd w:fill="FFFFFF"/>
             <w:tcMar>
               <w:top w:w="120" w:type="dxa"/>
               <w:bottom w:w="120" w:type="dxa"/>
-              <w:left w:w="150" w:type="dxa"/>
-              <w:right w:w="150" w:type="dxa"/>
+              <w:left w:w="160" w:type="dxa"/>
+              <w:right w:w="160" w:type="dxa"/>
             </w:tcMar>
-            <w:shd w:fill="F4EFE9"/>
+          </w:tcPr>
+          <w:p>
+            <w:pPr>
+              <w:jc w:val="left"/>
+            </w:pPr>
+            <w:r>
+              <w:rPr>
+                <w:rFonts w:ascii="Calibri" w:hAnsi="Calibri"/>
+                <w:b/>
+                <w:sz w:val="20"/>
+              </w:rPr>
+              <w:t>RÉSULTAT NET AVANT IMPÔT</w:t>
+            </w:r>
+          </w:p>
+        </w:tc>
+        <w:tc>
+          <w:tcPr>
+            <w:tcW w:type="dxa" w:w="3120"/>
+            <w:shd w:fill="FFFFFF"/>
+            <w:tcMar>
+              <w:top w:w="120" w:type="dxa"/>
+              <w:bottom w:w="120" w:type="dxa"/>
+              <w:left w:w="160" w:type="dxa"/>
+              <w:right w:w="160" w:type="dxa"/>
+            </w:tcMar>
           </w:tcPr>
           <w:p>
             <w:pPr>
@@ -3301,48 +3516,24 @@
                 <w:rFonts w:ascii="Calibri" w:hAnsi="Calibri"/>
                 <w:sz w:val="20"/>
               </w:rPr>
-              <w:t>RÉSULTAT NET AVANT IMPÔT</w:t>
+              <w:t>9 620 000 FCFA</w:t>
             </w:r>
           </w:p>
         </w:tc>
         <w:tc>
           <w:tcPr>
             <w:tcW w:type="dxa" w:w="3120"/>
+            <w:shd w:fill="FFFFFF"/>
             <w:tcMar>
               <w:top w:w="120" w:type="dxa"/>
               <w:bottom w:w="120" w:type="dxa"/>
-              <w:left w:w="150" w:type="dxa"/>
-              <w:right w:w="150" w:type="dxa"/>
+              <w:left w:w="160" w:type="dxa"/>
+              <w:right w:w="160" w:type="dxa"/>
             </w:tcMar>
-            <w:shd w:fill="F4EFE9"/>
           </w:tcPr>
           <w:p>
             <w:pPr>
-              <w:jc w:val="left"/>
-            </w:pPr>
-            <w:r>
-              <w:rPr>
-                <w:rFonts w:ascii="Calibri" w:hAnsi="Calibri"/>
-                <w:sz w:val="20"/>
-              </w:rPr>
-              <w:t>9 620 000</w:t>
-            </w:r>
-          </w:p>
-        </w:tc>
-        <w:tc>
-          <w:tcPr>
-            <w:tcW w:type="dxa" w:w="3120"/>
-            <w:tcMar>
-              <w:top w:w="120" w:type="dxa"/>
-              <w:bottom w:w="120" w:type="dxa"/>
-              <w:left w:w="150" w:type="dxa"/>
-              <w:right w:w="150" w:type="dxa"/>
-            </w:tcMar>
-            <w:shd w:fill="F4EFE9"/>
-          </w:tcPr>
-          <w:p>
-            <w:pPr>
-              <w:jc w:val="left"/>
+              <w:jc w:val="right"/>
             </w:pPr>
             <w:r>
               <w:rPr>
@@ -3355,18 +3546,22 @@
         </w:tc>
       </w:tr>
     </w:tbl>
-    <w:p/>
     <w:p>
       <w:pPr>
-        <w:pStyle w:val="Heading2"/>
-        <w:spacing w:before="240" w:after="80"/>
+        <w:spacing w:after="160"/>
+      </w:pPr>
+    </w:p>
+    <w:p>
+      <w:pPr>
+        <w:keepNext/>
+        <w:spacing w:before="280" w:after="80"/>
       </w:pPr>
       <w:r>
         <w:rPr>
           <w:rFonts w:ascii="Arial" w:hAnsi="Arial"/>
           <w:b/>
           <w:color w:val="B66A3F"/>
-          <w:sz w:val="26"/>
+          <w:sz w:val="24"/>
         </w:rPr>
         <w:t>5.5 Indicateurs Clés de Rentabilité (KPIs)</w:t>
       </w:r>
@@ -3374,74 +3569,77 @@
     <w:p>
       <w:pPr>
         <w:pStyle w:val="ListBullet"/>
+        <w:spacing w:after="40"/>
       </w:pPr>
-      <w:r/>
       <w:r>
         <w:rPr>
           <w:b/>
         </w:rPr>
-        <w:t>Marge Brute :</w:t>
+        <w:t xml:space="preserve">Marge Brute de Production : </w:t>
       </w:r>
       <w:r>
-        <w:t xml:space="preserve"> 73.9 %</w:t>
+        <w:t>73.9 %</w:t>
       </w:r>
     </w:p>
     <w:p>
       <w:pPr>
         <w:pStyle w:val="ListBullet"/>
+        <w:spacing w:after="40"/>
       </w:pPr>
-      <w:r/>
       <w:r>
         <w:rPr>
           <w:b/>
         </w:rPr>
-        <w:t>Marge d'EBITDA :</w:t>
+        <w:t xml:space="preserve">Marge d'EBITDA : </w:t>
       </w:r>
       <w:r>
-        <w:t xml:space="preserve"> 59.1 %</w:t>
+        <w:t>59.1 %</w:t>
       </w:r>
     </w:p>
     <w:p>
       <w:pPr>
         <w:pStyle w:val="ListBullet"/>
+        <w:spacing w:after="40"/>
       </w:pPr>
-      <w:r/>
       <w:r>
         <w:rPr>
           <w:b/>
         </w:rPr>
-        <w:t>Retour sur Investissement (ROI) :</w:t>
+        <w:t xml:space="preserve">Retour sur Investissement (ROI) : </w:t>
       </w:r>
       <w:r>
-        <w:t xml:space="preserve"> Moins de 6 mois d'exploitation continue.</w:t>
+        <w:t>Moins de 6 mois d'exploitation continue</w:t>
       </w:r>
     </w:p>
     <w:p>
       <w:pPr>
         <w:pStyle w:val="ListBullet"/>
+        <w:spacing w:after="40"/>
       </w:pPr>
-      <w:r/>
       <w:r>
         <w:rPr>
           <w:b/>
         </w:rPr>
-        <w:t>Point Mort (Seuil de Rentabilité) :</w:t>
+        <w:t xml:space="preserve">Point Mort (Seuil de Rentabilité) : </w:t>
       </w:r>
       <w:r>
-        <w:t xml:space="preserve"> 18,5 Tonnes de broyat vendues par mois (soit 41 % de la capacité maximale).</w:t>
+        <w:t>18,5 Tonnes / mois (soit 41 % de la capacité maximale)</w:t>
       </w:r>
     </w:p>
     <w:p>
       <w:pPr>
-        <w:pStyle w:val="Heading1"/>
-        <w:spacing w:before="280" w:after="120"/>
+        <w:keepNext/>
+        <w:spacing w:before="360" w:after="120"/>
+        <w:pBdr>
+          <w:bottom w:val="single" w:sz="12" w:space="4" w:color="C99B5B"/>
+        </w:pBdr>
       </w:pPr>
       <w:r>
         <w:rPr>
           <w:rFonts w:ascii="Arial" w:hAnsi="Arial"/>
           <w:b/>
           <w:color w:val="0E2C43"/>
-          <w:sz w:val="30"/>
+          <w:sz w:val="28"/>
         </w:rPr>
         <w:t>6. ANALYSE CRITIQUE DES RISQUES ET PLAN DE MITIGATION</w:t>
       </w:r>
@@ -3451,6 +3649,14 @@
         <w:tblW w:type="auto" w:w="0"/>
         <w:jc w:val="center"/>
         <w:tblLook w:firstColumn="1" w:firstRow="1" w:lastColumn="0" w:lastRow="0" w:noHBand="0" w:noVBand="1" w:val="04A0"/>
+        <w:tblBorders>
+          <w:top w:val="single" w:sz="4" w:space="0" w:color="D3D3D3"/>
+          <w:left w:val="none"/>
+          <w:bottom w:val="single" w:sz="4" w:space="0" w:color="D3D3D3"/>
+          <w:right w:val="none"/>
+          <w:insideH w:val="single" w:sz="4" w:space="0" w:color="D3D3D3"/>
+          <w:insideV w:val="none"/>
+        </w:tblBorders>
       </w:tblPr>
       <w:tblGrid>
         <w:gridCol w:w="3120"/>
@@ -3461,13 +3667,13 @@
         <w:tc>
           <w:tcPr>
             <w:tcW w:type="dxa" w:w="3120"/>
+            <w:shd w:fill="0E2C43"/>
             <w:tcMar>
-              <w:top w:w="120" w:type="dxa"/>
-              <w:bottom w:w="120" w:type="dxa"/>
-              <w:left w:w="150" w:type="dxa"/>
-              <w:right w:w="150" w:type="dxa"/>
+              <w:top w:w="140" w:type="dxa"/>
+              <w:bottom w:w="140" w:type="dxa"/>
+              <w:left w:w="160" w:type="dxa"/>
+              <w:right w:w="160" w:type="dxa"/>
             </w:tcMar>
-            <w:shd w:fill="0E2C43"/>
           </w:tcPr>
           <w:p>
             <w:pPr>
@@ -3475,7 +3681,7 @@
             </w:pPr>
             <w:r>
               <w:rPr>
-                <w:rFonts w:ascii="Calibri" w:hAnsi="Calibri"/>
+                <w:rFonts w:ascii="Arial" w:hAnsi="Arial"/>
                 <w:b/>
                 <w:color w:val="FFFFFF"/>
                 <w:sz w:val="20"/>
@@ -3487,13 +3693,13 @@
         <w:tc>
           <w:tcPr>
             <w:tcW w:type="dxa" w:w="3120"/>
+            <w:shd w:fill="0E2C43"/>
             <w:tcMar>
-              <w:top w:w="120" w:type="dxa"/>
-              <w:bottom w:w="120" w:type="dxa"/>
-              <w:left w:w="150" w:type="dxa"/>
-              <w:right w:w="150" w:type="dxa"/>
+              <w:top w:w="140" w:type="dxa"/>
+              <w:bottom w:w="140" w:type="dxa"/>
+              <w:left w:w="160" w:type="dxa"/>
+              <w:right w:w="160" w:type="dxa"/>
             </w:tcMar>
-            <w:shd w:fill="0E2C43"/>
           </w:tcPr>
           <w:p>
             <w:pPr>
@@ -3501,33 +3707,33 @@
             </w:pPr>
             <w:r>
               <w:rPr>
-                <w:rFonts w:ascii="Calibri" w:hAnsi="Calibri"/>
+                <w:rFonts w:ascii="Arial" w:hAnsi="Arial"/>
                 <w:b/>
                 <w:color w:val="FFFFFF"/>
                 <w:sz w:val="20"/>
               </w:rPr>
-              <w:t>Niveau de Sévérité</w:t>
+              <w:t>Niveau</w:t>
             </w:r>
           </w:p>
         </w:tc>
         <w:tc>
           <w:tcPr>
             <w:tcW w:type="dxa" w:w="3120"/>
+            <w:shd w:fill="0E2C43"/>
             <w:tcMar>
-              <w:top w:w="120" w:type="dxa"/>
-              <w:bottom w:w="120" w:type="dxa"/>
-              <w:left w:w="150" w:type="dxa"/>
-              <w:right w:w="150" w:type="dxa"/>
+              <w:top w:w="140" w:type="dxa"/>
+              <w:bottom w:w="140" w:type="dxa"/>
+              <w:left w:w="160" w:type="dxa"/>
+              <w:right w:w="160" w:type="dxa"/>
             </w:tcMar>
-            <w:shd w:fill="0E2C43"/>
           </w:tcPr>
           <w:p>
             <w:pPr>
-              <w:jc w:val="left"/>
+              <w:jc w:val="right"/>
             </w:pPr>
             <w:r>
               <w:rPr>
-                <w:rFonts w:ascii="Calibri" w:hAnsi="Calibri"/>
+                <w:rFonts w:ascii="Arial" w:hAnsi="Arial"/>
                 <w:b/>
                 <w:color w:val="FFFFFF"/>
                 <w:sz w:val="20"/>
@@ -3541,13 +3747,13 @@
         <w:tc>
           <w:tcPr>
             <w:tcW w:type="dxa" w:w="3120"/>
+            <w:shd w:fill="FFFFFF"/>
             <w:tcMar>
               <w:top w:w="120" w:type="dxa"/>
               <w:bottom w:w="120" w:type="dxa"/>
-              <w:left w:w="150" w:type="dxa"/>
-              <w:right w:w="150" w:type="dxa"/>
+              <w:left w:w="160" w:type="dxa"/>
+              <w:right w:w="160" w:type="dxa"/>
             </w:tcMar>
-            <w:shd w:fill="F4EFE9"/>
           </w:tcPr>
           <w:p>
             <w:pPr>
@@ -3556,22 +3762,23 @@
             <w:r>
               <w:rPr>
                 <w:rFonts w:ascii="Calibri" w:hAnsi="Calibri"/>
+                <w:b/>
                 <w:sz w:val="20"/>
               </w:rPr>
-              <w:t>Saisonnalité / Penurie d'approvisionnement</w:t>
+              <w:t>Saisonnalité / Pénurie approvisionnement</w:t>
             </w:r>
           </w:p>
         </w:tc>
         <w:tc>
           <w:tcPr>
             <w:tcW w:type="dxa" w:w="3120"/>
+            <w:shd w:fill="FFFFFF"/>
             <w:tcMar>
               <w:top w:w="120" w:type="dxa"/>
               <w:bottom w:w="120" w:type="dxa"/>
-              <w:left w:w="150" w:type="dxa"/>
-              <w:right w:w="150" w:type="dxa"/>
+              <w:left w:w="160" w:type="dxa"/>
+              <w:right w:w="160" w:type="dxa"/>
             </w:tcMar>
-            <w:shd w:fill="F4EFE9"/>
           </w:tcPr>
           <w:p>
             <w:pPr>
@@ -3589,13 +3796,13 @@
         <w:tc>
           <w:tcPr>
             <w:tcW w:type="dxa" w:w="3120"/>
+            <w:shd w:fill="FFFFFF"/>
             <w:tcMar>
               <w:top w:w="120" w:type="dxa"/>
               <w:bottom w:w="120" w:type="dxa"/>
-              <w:left w:w="150" w:type="dxa"/>
-              <w:right w:w="150" w:type="dxa"/>
+              <w:left w:w="160" w:type="dxa"/>
+              <w:right w:w="160" w:type="dxa"/>
             </w:tcMar>
-            <w:shd w:fill="F4EFE9"/>
           </w:tcPr>
           <w:p>
             <w:pPr>
@@ -3606,7 +3813,7 @@
                 <w:rFonts w:ascii="Calibri" w:hAnsi="Calibri"/>
                 <w:sz w:val="20"/>
               </w:rPr>
-              <w:t>Constitution d'un stock de sécurité de 30 jours + diversification géographique de la collecte sur 4 départements.</w:t>
+              <w:t>Stock de sécurité de 30 jours + diversification géographique sur 4 départements.</w:t>
             </w:r>
           </w:p>
         </w:tc>
@@ -3615,13 +3822,13 @@
         <w:tc>
           <w:tcPr>
             <w:tcW w:type="dxa" w:w="3120"/>
+            <w:shd w:fill="F9FAFC"/>
             <w:tcMar>
               <w:top w:w="120" w:type="dxa"/>
               <w:bottom w:w="120" w:type="dxa"/>
-              <w:left w:w="150" w:type="dxa"/>
-              <w:right w:w="150" w:type="dxa"/>
+              <w:left w:w="160" w:type="dxa"/>
+              <w:right w:w="160" w:type="dxa"/>
             </w:tcMar>
-            <w:shd w:fill="FFFFFF"/>
           </w:tcPr>
           <w:p>
             <w:pPr>
@@ -3630,6 +3837,7 @@
             <w:r>
               <w:rPr>
                 <w:rFonts w:ascii="Calibri" w:hAnsi="Calibri"/>
+                <w:b/>
                 <w:sz w:val="20"/>
               </w:rPr>
               <w:t>Coupures d'électricité (Sbee)</w:t>
@@ -3639,13 +3847,13 @@
         <w:tc>
           <w:tcPr>
             <w:tcW w:type="dxa" w:w="3120"/>
+            <w:shd w:fill="F9FAFC"/>
             <w:tcMar>
               <w:top w:w="120" w:type="dxa"/>
               <w:bottom w:w="120" w:type="dxa"/>
-              <w:left w:w="150" w:type="dxa"/>
-              <w:right w:w="150" w:type="dxa"/>
+              <w:left w:w="160" w:type="dxa"/>
+              <w:right w:w="160" w:type="dxa"/>
             </w:tcMar>
-            <w:shd w:fill="FFFFFF"/>
           </w:tcPr>
           <w:p>
             <w:pPr>
@@ -3663,13 +3871,13 @@
         <w:tc>
           <w:tcPr>
             <w:tcW w:type="dxa" w:w="3120"/>
+            <w:shd w:fill="F9FAFC"/>
             <w:tcMar>
               <w:top w:w="120" w:type="dxa"/>
               <w:bottom w:w="120" w:type="dxa"/>
-              <w:left w:w="150" w:type="dxa"/>
-              <w:right w:w="150" w:type="dxa"/>
+              <w:left w:w="160" w:type="dxa"/>
+              <w:right w:w="160" w:type="dxa"/>
             </w:tcMar>
-            <w:shd w:fill="FFFFFF"/>
           </w:tcPr>
           <w:p>
             <w:pPr>
@@ -3680,7 +3888,7 @@
                 <w:rFonts w:ascii="Calibri" w:hAnsi="Calibri"/>
                 <w:sz w:val="20"/>
               </w:rPr>
-              <w:t>Acquisition d'un groupe électrogène industriel de secours 20 kVA dédié au broyeur.</w:t>
+              <w:t>Acquisition d'un groupe électrogène industriel de secours 20 kVA dédié.</w:t>
             </w:r>
           </w:p>
         </w:tc>
@@ -3689,13 +3897,13 @@
         <w:tc>
           <w:tcPr>
             <w:tcW w:type="dxa" w:w="3120"/>
+            <w:shd w:fill="FFFFFF"/>
             <w:tcMar>
               <w:top w:w="120" w:type="dxa"/>
               <w:bottom w:w="120" w:type="dxa"/>
-              <w:left w:w="150" w:type="dxa"/>
-              <w:right w:w="150" w:type="dxa"/>
+              <w:left w:w="160" w:type="dxa"/>
+              <w:right w:w="160" w:type="dxa"/>
             </w:tcMar>
-            <w:shd w:fill="F4EFE9"/>
           </w:tcPr>
           <w:p>
             <w:pPr>
@@ -3704,22 +3912,23 @@
             <w:r>
               <w:rPr>
                 <w:rFonts w:ascii="Calibri" w:hAnsi="Calibri"/>
+                <w:b/>
                 <w:sz w:val="20"/>
               </w:rPr>
-              <w:t>Contamination des plastiques (Mélange PP/PEHD)</w:t>
+              <w:t>Contamination des plastiques (PP/PEHD)</w:t>
             </w:r>
           </w:p>
         </w:tc>
         <w:tc>
           <w:tcPr>
             <w:tcW w:type="dxa" w:w="3120"/>
+            <w:shd w:fill="FFFFFF"/>
             <w:tcMar>
               <w:top w:w="120" w:type="dxa"/>
               <w:bottom w:w="120" w:type="dxa"/>
-              <w:left w:w="150" w:type="dxa"/>
-              <w:right w:w="150" w:type="dxa"/>
+              <w:left w:w="160" w:type="dxa"/>
+              <w:right w:w="160" w:type="dxa"/>
             </w:tcMar>
-            <w:shd w:fill="F4EFE9"/>
           </w:tcPr>
           <w:p>
             <w:pPr>
@@ -3737,13 +3946,13 @@
         <w:tc>
           <w:tcPr>
             <w:tcW w:type="dxa" w:w="3120"/>
+            <w:shd w:fill="FFFFFF"/>
             <w:tcMar>
               <w:top w:w="120" w:type="dxa"/>
               <w:bottom w:w="120" w:type="dxa"/>
-              <w:left w:w="150" w:type="dxa"/>
-              <w:right w:w="150" w:type="dxa"/>
+              <w:left w:w="160" w:type="dxa"/>
+              <w:right w:w="160" w:type="dxa"/>
             </w:tcMar>
-            <w:shd w:fill="F4EFE9"/>
           </w:tcPr>
           <w:p>
             <w:pPr>
@@ -3754,7 +3963,7 @@
                 <w:rFonts w:ascii="Calibri" w:hAnsi="Calibri"/>
                 <w:sz w:val="20"/>
               </w:rPr>
-              <w:t>Protocole de tri strict à 2 niveaux + test de densité par flottaison systématique avant broyage.</w:t>
+              <w:t>Tri à 2 niveaux + test de densité par flottaison systématique avant broyage.</w:t>
             </w:r>
           </w:p>
         </w:tc>
@@ -3763,13 +3972,13 @@
         <w:tc>
           <w:tcPr>
             <w:tcW w:type="dxa" w:w="3120"/>
+            <w:shd w:fill="F9FAFC"/>
             <w:tcMar>
               <w:top w:w="120" w:type="dxa"/>
               <w:bottom w:w="120" w:type="dxa"/>
-              <w:left w:w="150" w:type="dxa"/>
-              <w:right w:w="150" w:type="dxa"/>
+              <w:left w:w="160" w:type="dxa"/>
+              <w:right w:w="160" w:type="dxa"/>
             </w:tcMar>
-            <w:shd w:fill="FFFFFF"/>
           </w:tcPr>
           <w:p>
             <w:pPr>
@@ -3778,6 +3987,7 @@
             <w:r>
               <w:rPr>
                 <w:rFonts w:ascii="Calibri" w:hAnsi="Calibri"/>
+                <w:b/>
                 <w:sz w:val="20"/>
               </w:rPr>
               <w:t>Usure prématurée des lames de broyeur</w:t>
@@ -3787,13 +3997,13 @@
         <w:tc>
           <w:tcPr>
             <w:tcW w:type="dxa" w:w="3120"/>
+            <w:shd w:fill="F9FAFC"/>
             <w:tcMar>
               <w:top w:w="120" w:type="dxa"/>
               <w:bottom w:w="120" w:type="dxa"/>
-              <w:left w:w="150" w:type="dxa"/>
-              <w:right w:w="150" w:type="dxa"/>
+              <w:left w:w="160" w:type="dxa"/>
+              <w:right w:w="160" w:type="dxa"/>
             </w:tcMar>
-            <w:shd w:fill="FFFFFF"/>
           </w:tcPr>
           <w:p>
             <w:pPr>
@@ -3811,13 +4021,13 @@
         <w:tc>
           <w:tcPr>
             <w:tcW w:type="dxa" w:w="3120"/>
+            <w:shd w:fill="F9FAFC"/>
             <w:tcMar>
               <w:top w:w="120" w:type="dxa"/>
               <w:bottom w:w="120" w:type="dxa"/>
-              <w:left w:w="150" w:type="dxa"/>
-              <w:right w:w="150" w:type="dxa"/>
+              <w:left w:w="160" w:type="dxa"/>
+              <w:right w:w="160" w:type="dxa"/>
             </w:tcMar>
-            <w:shd w:fill="FFFFFF"/>
           </w:tcPr>
           <w:p>
             <w:pPr>
@@ -3828,7 +4038,7 @@
                 <w:rFonts w:ascii="Calibri" w:hAnsi="Calibri"/>
                 <w:sz w:val="20"/>
               </w:rPr>
-              <w:t>Contrat d'affûtage local + stock permanent de 2 jeux de lames de rechange à haute teneur en chrome.</w:t>
+              <w:t>Contrat d'affûtage local + stock permanent de 2 jeux de lames de rechange.</w:t>
             </w:r>
           </w:p>
         </w:tc>
@@ -3837,13 +4047,13 @@
         <w:tc>
           <w:tcPr>
             <w:tcW w:type="dxa" w:w="3120"/>
+            <w:shd w:fill="FFFFFF"/>
             <w:tcMar>
               <w:top w:w="120" w:type="dxa"/>
               <w:bottom w:w="120" w:type="dxa"/>
-              <w:left w:w="150" w:type="dxa"/>
-              <w:right w:w="150" w:type="dxa"/>
+              <w:left w:w="160" w:type="dxa"/>
+              <w:right w:w="160" w:type="dxa"/>
             </w:tcMar>
-            <w:shd w:fill="F4EFE9"/>
           </w:tcPr>
           <w:p>
             <w:pPr>
@@ -3852,6 +4062,7 @@
             <w:r>
               <w:rPr>
                 <w:rFonts w:ascii="Calibri" w:hAnsi="Calibri"/>
+                <w:b/>
                 <w:sz w:val="20"/>
               </w:rPr>
               <w:t>Accidents du travail / Pénibilité</w:t>
@@ -3861,13 +4072,13 @@
         <w:tc>
           <w:tcPr>
             <w:tcW w:type="dxa" w:w="3120"/>
+            <w:shd w:fill="FFFFFF"/>
             <w:tcMar>
               <w:top w:w="120" w:type="dxa"/>
               <w:bottom w:w="120" w:type="dxa"/>
-              <w:left w:w="150" w:type="dxa"/>
-              <w:right w:w="150" w:type="dxa"/>
+              <w:left w:w="160" w:type="dxa"/>
+              <w:right w:w="160" w:type="dxa"/>
             </w:tcMar>
-            <w:shd w:fill="F4EFE9"/>
           </w:tcPr>
           <w:p>
             <w:pPr>
@@ -3885,13 +4096,13 @@
         <w:tc>
           <w:tcPr>
             <w:tcW w:type="dxa" w:w="3120"/>
+            <w:shd w:fill="FFFFFF"/>
             <w:tcMar>
               <w:top w:w="120" w:type="dxa"/>
               <w:bottom w:w="120" w:type="dxa"/>
-              <w:left w:w="150" w:type="dxa"/>
-              <w:right w:w="150" w:type="dxa"/>
+              <w:left w:w="160" w:type="dxa"/>
+              <w:right w:w="160" w:type="dxa"/>
             </w:tcMar>
-            <w:shd w:fill="F4EFE9"/>
           </w:tcPr>
           <w:p>
             <w:pPr>
@@ -3902,24 +4113,31 @@
                 <w:rFonts w:ascii="Calibri" w:hAnsi="Calibri"/>
                 <w:sz w:val="20"/>
               </w:rPr>
-              <w:t>Supervision SST continue par M. Pedro KPONON, port des EPI obligatoire, rotation automatique des postes.</w:t>
+              <w:t>Supervision SST M. Pedro KPONON, port des EPI obligatoire, rotation des postes.</w:t>
             </w:r>
           </w:p>
         </w:tc>
       </w:tr>
     </w:tbl>
-    <w:p/>
     <w:p>
       <w:pPr>
-        <w:pStyle w:val="Heading1"/>
-        <w:spacing w:before="280" w:after="120"/>
+        <w:spacing w:after="160"/>
+      </w:pPr>
+    </w:p>
+    <w:p>
+      <w:pPr>
+        <w:keepNext/>
+        <w:spacing w:before="360" w:after="120"/>
+        <w:pBdr>
+          <w:bottom w:val="single" w:sz="12" w:space="4" w:color="C99B5B"/>
+        </w:pBdr>
       </w:pPr>
       <w:r>
         <w:rPr>
           <w:rFonts w:ascii="Arial" w:hAnsi="Arial"/>
           <w:b/>
           <w:color w:val="0E2C43"/>
-          <w:sz w:val="30"/>
+          <w:sz w:val="28"/>
         </w:rPr>
         <w:t>7. CONCLUSION &amp; DEMANDE DE FINANCEMENT</w:t>
       </w:r>
@@ -3929,63 +4147,93 @@
         <w:spacing w:after="120"/>
       </w:pPr>
       <w:r>
-        <w:t xml:space="preserve">Le projet porté par </w:t>
+        <w:t>Le projet porté par 18 EITHING SARL à Kétou combine une opportunité économique à haute rentabilité, une utilité écologique majeure pour la gestion des déchets au Bénin, et une gouvernance expérimentée et complémentaire.</w:t>
+      </w:r>
+    </w:p>
+    <w:tbl>
+      <w:tblPr>
+        <w:tblW w:type="auto" w:w="0"/>
+        <w:jc w:val="center"/>
+        <w:tblLook w:firstColumn="1" w:firstRow="1" w:lastColumn="0" w:lastRow="0" w:noHBand="0" w:noVBand="1" w:val="04A0"/>
+      </w:tblPr>
+      <w:tblGrid>
+        <w:gridCol w:w="9360"/>
+      </w:tblGrid>
+      <w:tr>
+        <w:tc>
+          <w:tcPr>
+            <w:tcW w:type="dxa" w:w="9360"/>
+            <w:shd w:fill="F4EFE9"/>
+            <w:tcMar>
+              <w:top w:w="180" w:type="dxa"/>
+              <w:bottom w:w="180" w:type="dxa"/>
+              <w:left w:w="240" w:type="dxa"/>
+              <w:right w:w="240" w:type="dxa"/>
+            </w:tcMar>
+            <w:tcBorders>
+              <w:left w:val="single" w:sz="24" w:space="0" w:color="0E2C43"/>
+              <w:top w:val="none"/>
+              <w:right w:val="none"/>
+              <w:bottom w:val="none"/>
+            </w:tcBorders>
+          </w:tcPr>
+          <w:p>
+            <w:pPr>
+              <w:spacing w:before="0" w:after="80"/>
+            </w:pPr>
+            <w:r>
+              <w:rPr>
+                <w:rFonts w:ascii="Arial" w:hAnsi="Arial"/>
+                <w:b/>
+                <w:color w:val="0E2C43"/>
+                <w:sz w:val="22"/>
+              </w:rPr>
+              <w:t>DEMANDE DE FINANCEMENT BANCAIRE / INVESTISSEUR</w:t>
+            </w:r>
+          </w:p>
+          <w:p>
+            <w:pPr>
+              <w:spacing w:before="40" w:after="0"/>
+            </w:pPr>
+            <w:r>
+              <w:rPr>
+                <w:rFonts w:ascii="Calibri" w:hAnsi="Calibri"/>
+                <w:i/>
+                <w:color w:val="2B2B2B"/>
+                <w:sz w:val="21"/>
+              </w:rPr>
+              <w:t>Pour soutenir le démarrage de l'unité industrielle et couvrir le besoin d'investissement (CAPEX) et de BFR de démarrage, 18 EITHING SARL sollicite un accompagnement financier à hauteur de 28 000 000 FCFA sous forme de concours bancaire ou d'apport en fonds propres.</w:t>
+            </w:r>
+          </w:p>
+        </w:tc>
+      </w:tr>
+    </w:tbl>
+    <w:p>
+      <w:pPr>
+        <w:spacing w:after="120"/>
+      </w:pPr>
+    </w:p>
+    <w:p>
+      <w:pPr>
+        <w:spacing w:before="320"/>
+        <w:jc w:val="right"/>
+      </w:pPr>
+      <w:r>
+        <w:rPr>
+          <w:i/>
+        </w:rPr>
+        <w:t>Dossier établi à Kétou, République du Bénin.</w:t>
+        <w:br/>
+        <w:t>Pour la Direction Générale,</w:t>
+        <w:br/>
       </w:r>
       <w:r>
         <w:rPr>
           <w:b/>
-        </w:rPr>
-        <w:t>18 EITHING SARL</w:t>
-      </w:r>
-      <w:r>
-        <w:t xml:space="preserve"> à Kétou combine une opportunité économique à haute rentabilité, une utilité écologique majeure pour la gestion des déchets au Bénin, et une gouvernance expérimentée et complémentaire.</w:t>
-      </w:r>
-    </w:p>
-    <w:p>
-      <w:pPr>
-        <w:spacing w:after="120"/>
-      </w:pPr>
-      <w:r>
-        <w:t xml:space="preserve">Pour soutenir le démarrage de l'unité industrielle et couvrir le besoin d'investissement (CAPEX) et de BFR de démarrage, </w:t>
-      </w:r>
-      <w:r>
-        <w:rPr>
-          <w:b/>
-        </w:rPr>
-        <w:t>18 EITHING SARL sollicite un accompagnement financier à hauteur de 28 000 000 FCFA</w:t>
-      </w:r>
-      <w:r>
-        <w:t xml:space="preserve"> sous forme de concours bancaire ou d'apport en fonds propres/quasi-fonds propres.</w:t>
-      </w:r>
-    </w:p>
-    <w:p>
-      <w:pPr>
-        <w:spacing w:after="120"/>
-      </w:pPr>
-      <w:r>
-        <w:t>*Dossier établi à Kétou, République du Bénin.*</w:t>
-      </w:r>
-    </w:p>
-    <w:p>
-      <w:pPr>
-        <w:spacing w:after="120"/>
-      </w:pPr>
-      <w:r>
-        <w:t>*Pour la Direction Générale,*</w:t>
-      </w:r>
-    </w:p>
-    <w:p>
-      <w:pPr>
-        <w:spacing w:after="120"/>
-      </w:pPr>
-      <w:r/>
-      <w:r>
-        <w:rPr>
-          <w:b/>
+          <w:color w:val="0E2C43"/>
         </w:rPr>
         <w:t>M. Hubert C. TOKPANOU &amp; M. Pedro S. KPONON</w:t>
       </w:r>
-      <w:r/>
     </w:p>
     <w:sectPr>
       <w:pgSz w:w="12240" w:h="15840"/>
@@ -4362,7 +4610,7 @@
     <w:rsid w:val="00FC693F"/>
     <w:rPr>
       <w:rFonts w:ascii="Calibri" w:hAnsi="Calibri"/>
-      <w:color w:val="333333"/>
+      <w:color w:val="2B2B2B"/>
       <w:sz w:val="22"/>
     </w:rPr>
   </w:style>

</xml_diff>

<commit_message>
Mise a jour du dossier strategique et du papier en-tete au format Microsoft Word et PDF
Co-authored-by: hosongwen2014-netizen <307543822+hosongwen2014-netizen@users.noreply.github.com>
</commit_message>
<xml_diff>
--- a/DOSSIER_STRATEGIQUE_18_EITHING.docx
+++ b/DOSSIER_STRATEGIQUE_18_EITHING.docx
@@ -9,12 +9,12 @@
         <w:tblLook w:firstColumn="1" w:firstRow="1" w:lastColumn="0" w:lastRow="0" w:noHBand="0" w:noVBand="1" w:val="04A0"/>
       </w:tblPr>
       <w:tblGrid>
-        <w:gridCol w:w="9360"/>
+        <w:gridCol w:w="9029"/>
       </w:tblGrid>
       <w:tr>
         <w:tc>
           <w:tcPr>
-            <w:tcW w:type="dxa" w:w="9360"/>
+            <w:tcW w:type="dxa" w:w="9029"/>
             <w:shd w:fill="0E2C43"/>
             <w:tcMar>
               <w:top w:w="280" w:type="dxa"/>
@@ -72,12 +72,12 @@
         <w:tblLook w:firstColumn="1" w:firstRow="1" w:lastColumn="0" w:lastRow="0" w:noHBand="0" w:noVBand="1" w:val="04A0"/>
       </w:tblPr>
       <w:tblGrid>
-        <w:gridCol w:w="9360"/>
+        <w:gridCol w:w="9029"/>
       </w:tblGrid>
       <w:tr>
         <w:tc>
           <w:tcPr>
-            <w:tcW w:type="dxa" w:w="9360"/>
+            <w:tcW w:type="dxa" w:w="9029"/>
             <w:shd w:fill="F4EFE9"/>
             <w:tcMar>
               <w:top w:w="180" w:type="dxa"/>
@@ -108,7 +108,7 @@
           </w:p>
           <w:p>
             <w:pPr>
-              <w:spacing w:before="40" w:after="0"/>
+              <w:spacing w:before="40" w:after="0" w:line="276" w:lineRule="auto"/>
             </w:pPr>
             <w:r>
               <w:rPr>
@@ -169,7 +169,7 @@
     </w:p>
     <w:p>
       <w:pPr>
-        <w:spacing w:after="120"/>
+        <w:spacing w:after="120" w:line="276" w:lineRule="auto"/>
       </w:pPr>
       <w:r>
         <w:t>La gestion des déchets solides ménagers et industriels constitue l'un des défis majeurs du développement urbain et économique en République du Bénin. Chaque année, plus de 100 000 tonnes de plastiques rigides et souples sont générées sur l'ensemble du territoire national, dont seule une fraction inférieure à 8 % fait l'objet d'un recyclage formel. Le reste s'accumule dans la nature, bouche les réseaux d'évacuation d'eaux pluviales ou brûle à l'air libre, générant des risques sanitaires et écologiques majeurs.</w:t>
@@ -177,7 +177,7 @@
     </w:p>
     <w:p>
       <w:pPr>
-        <w:spacing w:after="120"/>
+        <w:spacing w:after="120" w:line="276" w:lineRule="auto"/>
       </w:pPr>
       <w:r>
         <w:t>Parallèlement, l'industrie manufacturière régionale (plasturgie, emballages, BTP, canalisations) fait face à un coût d'approvisionnement élevé en résines vierges importées (PP, PEHD), directement impactées par la volatilité des cours mondiaux du pétrole et le coût du fret maritime.</w:t>
@@ -185,7 +185,7 @@
     </w:p>
     <w:p>
       <w:pPr>
-        <w:spacing w:after="120"/>
+        <w:spacing w:after="120" w:line="276" w:lineRule="auto"/>
       </w:pPr>
       <w:r>
         <w:t>18 EITHING SARL apporte une réponse industrielle concrète en structurant la filière de collecte et de transformation primaire des plastiques rigides (PP et PEHD) en broyats calibrés de haute qualité, répondant aux standards des plasturgistes béninois et sous-régionaux (Nigeria, Togo).</w:t>
@@ -208,7 +208,7 @@
     </w:p>
     <w:p>
       <w:pPr>
-        <w:spacing w:after="120"/>
+        <w:spacing w:after="120" w:line="276" w:lineRule="auto"/>
       </w:pPr>
       <w:r>
         <w:t>Contrairement aux rares initiatives concentrées dans la zone saturée du Littoral (Cotonou, Akpakpa) caractérisée par un coût du foncier exorbitant, des coûts salariaux élevés et une concurrence acharnée sur le gisement local de déchets, 18 EITHING SARL positionne son unité industrielle de broyage à Kétou (Plateau).</w:t>
@@ -216,7 +216,7 @@
     </w:p>
     <w:p>
       <w:pPr>
-        <w:spacing w:after="80"/>
+        <w:spacing w:after="80" w:line="276" w:lineRule="auto"/>
       </w:pPr>
       <w:r>
         <w:t>Ce choix d'implantation stratégique offre des avantages comparatifs déterminants :</w:t>
@@ -225,7 +225,7 @@
     <w:p>
       <w:pPr>
         <w:pStyle w:val="ListBullet"/>
-        <w:spacing w:after="60"/>
+        <w:spacing w:after="60" w:line="276" w:lineRule="auto"/>
       </w:pPr>
       <w:r>
         <w:rPr>
@@ -241,7 +241,7 @@
     <w:p>
       <w:pPr>
         <w:pStyle w:val="ListBullet"/>
-        <w:spacing w:after="60"/>
+        <w:spacing w:after="60" w:line="276" w:lineRule="auto"/>
       </w:pPr>
       <w:r>
         <w:rPr>
@@ -257,7 +257,7 @@
     <w:p>
       <w:pPr>
         <w:pStyle w:val="ListBullet"/>
-        <w:spacing w:after="60"/>
+        <w:spacing w:after="60" w:line="276" w:lineRule="auto"/>
       </w:pPr>
       <w:r>
         <w:rPr>
@@ -287,7 +287,7 @@
     </w:p>
     <w:p>
       <w:pPr>
-        <w:spacing w:after="120"/>
+        <w:spacing w:after="120" w:line="276" w:lineRule="auto"/>
       </w:pPr>
       <w:r>
         <w:t>La direction de 18 EITHING SARL repose sur un tandem exécutif hautement complémentaire, combinant rigueur financière, excellence logistique et maîtrise de la santé au travail :</w:t>
@@ -295,7 +295,7 @@
     </w:p>
     <w:p>
       <w:pPr>
-        <w:spacing w:before="80" w:after="40"/>
+        <w:spacing w:before="80" w:after="40" w:line="276" w:lineRule="auto"/>
       </w:pPr>
       <w:r>
         <w:rPr>
@@ -314,7 +314,7 @@
     <w:p>
       <w:pPr>
         <w:pStyle w:val="ListBullet2"/>
-        <w:spacing w:after="40"/>
+        <w:spacing w:after="40" w:line="276" w:lineRule="auto"/>
       </w:pPr>
       <w:r>
         <w:t>Expertise approfondie en ingénierie logistique, négociation commerciale, gestion financière et structuration de flux d'approvisionnement complexes.</w:t>
@@ -323,7 +323,7 @@
     <w:p>
       <w:pPr>
         <w:pStyle w:val="ListBullet2"/>
-        <w:spacing w:after="40"/>
+        <w:spacing w:after="40" w:line="276" w:lineRule="auto"/>
       </w:pPr>
       <w:r>
         <w:t>En charge du pilotage de la rentabilité, des relations bancaires et investisseurs, de l'optimisation des coûts de transport et de la sécurisation des contrats d'approvisionnement et de vente.</w:t>
@@ -331,7 +331,7 @@
     </w:p>
     <w:p>
       <w:pPr>
-        <w:spacing w:before="80" w:after="40"/>
+        <w:spacing w:before="80" w:after="40" w:line="276" w:lineRule="auto"/>
       </w:pPr>
       <w:r>
         <w:rPr>
@@ -350,7 +350,7 @@
     <w:p>
       <w:pPr>
         <w:pStyle w:val="ListBullet2"/>
-        <w:spacing w:after="40"/>
+        <w:spacing w:after="40" w:line="276" w:lineRule="auto"/>
       </w:pPr>
       <w:r>
         <w:t>Expert en Santé et Sécurité au Travail (SST), organisation ergonomique des postes et santé mentale/psychologie industrielle.</w:t>
@@ -359,7 +359,7 @@
     <w:p>
       <w:pPr>
         <w:pStyle w:val="ListBullet2"/>
-        <w:spacing w:after="40"/>
+        <w:spacing w:after="40" w:line="276" w:lineRule="auto"/>
       </w:pPr>
       <w:r>
         <w:t>En charge de la conception ergonomique du site, de la réduction de la pénibilité physique sur la chaîne de tri/broyage, de la conformité environnementale et de la politique Zéro Accident.</w:t>
@@ -416,7 +416,7 @@
     <w:p>
       <w:pPr>
         <w:pStyle w:val="ListBullet"/>
-        <w:spacing w:after="40"/>
+        <w:spacing w:after="40" w:line="276" w:lineRule="auto"/>
       </w:pPr>
       <w:r>
         <w:t>Associations de collecteurs informels et grossistes de déchets (Plateau/Zou).</w:t>
@@ -425,7 +425,7 @@
     <w:p>
       <w:pPr>
         <w:pStyle w:val="ListBullet"/>
-        <w:spacing w:after="40"/>
+        <w:spacing w:after="40" w:line="276" w:lineRule="auto"/>
       </w:pPr>
       <w:r>
         <w:t>Municipalités de Kétou, Pobè et Sakété (concessions de tri).</w:t>
@@ -434,7 +434,7 @@
     <w:p>
       <w:pPr>
         <w:pStyle w:val="ListBullet"/>
-        <w:spacing w:after="40"/>
+        <w:spacing w:after="40" w:line="276" w:lineRule="auto"/>
       </w:pPr>
       <w:r>
         <w:t>Fournisseurs d'équipements industriels et sous-traitants de maintenance.</w:t>
@@ -443,7 +443,7 @@
     <w:p>
       <w:pPr>
         <w:pStyle w:val="ListBullet"/>
-        <w:spacing w:after="40"/>
+        <w:spacing w:after="40" w:line="276" w:lineRule="auto"/>
       </w:pPr>
       <w:r>
         <w:t>Industriels plasturgistes locaux et régionaux (acheteurs de broyat PP/PEHD).</w:t>
@@ -467,7 +467,7 @@
     <w:p>
       <w:pPr>
         <w:pStyle w:val="ListBullet"/>
-        <w:spacing w:after="40"/>
+        <w:spacing w:after="40" w:line="276" w:lineRule="auto"/>
       </w:pPr>
       <w:r>
         <w:t>Sourcing, pesée et achat des déchets plastiques rigides.</w:t>
@@ -476,7 +476,7 @@
     <w:p>
       <w:pPr>
         <w:pStyle w:val="ListBullet"/>
-        <w:spacing w:after="40"/>
+        <w:spacing w:after="40" w:line="276" w:lineRule="auto"/>
       </w:pPr>
       <w:r>
         <w:t>Tri qualitatif par résine (PP vs PEHD) et par couleur.</w:t>
@@ -485,7 +485,7 @@
     <w:p>
       <w:pPr>
         <w:pStyle w:val="ListBullet"/>
-        <w:spacing w:after="40"/>
+        <w:spacing w:after="40" w:line="276" w:lineRule="auto"/>
       </w:pPr>
       <w:r>
         <w:t>Lavage, décontamination primaire et séchage.</w:t>
@@ -494,7 +494,7 @@
     <w:p>
       <w:pPr>
         <w:pStyle w:val="ListBullet"/>
-        <w:spacing w:after="40"/>
+        <w:spacing w:after="40" w:line="276" w:lineRule="auto"/>
       </w:pPr>
       <w:r>
         <w:t>Broyage industriel et calibrage (grilles 8-10 mm).</w:t>
@@ -503,7 +503,7 @@
     <w:p>
       <w:pPr>
         <w:pStyle w:val="ListBullet"/>
-        <w:spacing w:after="40"/>
+        <w:spacing w:after="40" w:line="276" w:lineRule="auto"/>
       </w:pPr>
       <w:r>
         <w:t>Conditionnement en Big Bags (25-50 kg) et livraison.</w:t>
@@ -527,7 +527,7 @@
     <w:p>
       <w:pPr>
         <w:pStyle w:val="ListBullet"/>
-        <w:spacing w:after="40"/>
+        <w:spacing w:after="40" w:line="276" w:lineRule="auto"/>
       </w:pPr>
       <w:r>
         <w:t>Ligne industrielle de broyage 15 HP et bacs de lavage à recirculation.</w:t>
@@ -536,7 +536,7 @@
     <w:p>
       <w:pPr>
         <w:pStyle w:val="ListBullet"/>
-        <w:spacing w:after="40"/>
+        <w:spacing w:after="40" w:line="276" w:lineRule="auto"/>
       </w:pPr>
       <w:r>
         <w:t>Terrain industriel sécurisé de 1 500 m² à Kétou.</w:t>
@@ -545,7 +545,7 @@
     <w:p>
       <w:pPr>
         <w:pStyle w:val="ListBullet"/>
-        <w:spacing w:after="40"/>
+        <w:spacing w:after="40" w:line="276" w:lineRule="auto"/>
       </w:pPr>
       <w:r>
         <w:t>Réseau logistique de collecte et capital humain formé aux règles SST.</w:t>
@@ -569,7 +569,7 @@
     <w:p>
       <w:pPr>
         <w:pStyle w:val="ListBullet"/>
-        <w:spacing w:after="40"/>
+        <w:spacing w:after="40" w:line="276" w:lineRule="auto"/>
       </w:pPr>
       <w:r>
         <w:t>Pour les plasturgistes : Broyats purs à 98 %, réduction de 35 % du coût matière vs résine vierge.</w:t>
@@ -578,7 +578,7 @@
     <w:p>
       <w:pPr>
         <w:pStyle w:val="ListBullet"/>
-        <w:spacing w:after="40"/>
+        <w:spacing w:after="40" w:line="276" w:lineRule="auto"/>
       </w:pPr>
       <w:r>
         <w:t>Pour la collectivité : Assainissement territorial, création d'emplois locaux pérennes.</w:t>
@@ -602,7 +602,7 @@
     <w:p>
       <w:pPr>
         <w:pStyle w:val="ListBullet"/>
-        <w:spacing w:after="40"/>
+        <w:spacing w:after="40" w:line="276" w:lineRule="auto"/>
       </w:pPr>
       <w:r>
         <w:t>Contrats d'approvisionnement pluriannuels à volumes et prix garantis.</w:t>
@@ -611,7 +611,7 @@
     <w:p>
       <w:pPr>
         <w:pStyle w:val="ListBullet"/>
-        <w:spacing w:after="40"/>
+        <w:spacing w:after="40" w:line="276" w:lineRule="auto"/>
       </w:pPr>
       <w:r>
         <w:t>Assistance technique, fourniture d'échantillons et garantie de régularité.</w:t>
@@ -635,7 +635,7 @@
     <w:p>
       <w:pPr>
         <w:pStyle w:val="ListBullet"/>
-        <w:spacing w:after="40"/>
+        <w:spacing w:after="40" w:line="276" w:lineRule="auto"/>
       </w:pPr>
       <w:r>
         <w:t>Vente directe B2B via l'équipe commerciale interne.</w:t>
@@ -644,7 +644,7 @@
     <w:p>
       <w:pPr>
         <w:pStyle w:val="ListBullet"/>
-        <w:spacing w:after="40"/>
+        <w:spacing w:after="40" w:line="276" w:lineRule="auto"/>
       </w:pPr>
       <w:r>
         <w:t>Livraisons directes par camionnage dédié vers Cotonou et Porto-Novo.</w:t>
@@ -668,7 +668,7 @@
     <w:p>
       <w:pPr>
         <w:pStyle w:val="ListBullet"/>
-        <w:spacing w:after="40"/>
+        <w:spacing w:after="40" w:line="276" w:lineRule="auto"/>
       </w:pPr>
       <w:r>
         <w:t>Fabricants d'emballages plastiques rigides et conduits BTP.</w:t>
@@ -677,7 +677,7 @@
     <w:p>
       <w:pPr>
         <w:pStyle w:val="ListBullet"/>
-        <w:spacing w:after="40"/>
+        <w:spacing w:after="40" w:line="276" w:lineRule="auto"/>
       </w:pPr>
       <w:r>
         <w:t>Unités d'injection/soufflage d'ustensiles ménagers (bassines, seaux).</w:t>
@@ -686,7 +686,7 @@
     <w:p>
       <w:pPr>
         <w:pStyle w:val="ListBullet"/>
-        <w:spacing w:after="40"/>
+        <w:spacing w:after="40" w:line="276" w:lineRule="auto"/>
       </w:pPr>
       <w:r>
         <w:t>Exportateurs sous-régionaux.</w:t>
@@ -710,7 +710,7 @@
     <w:p>
       <w:pPr>
         <w:pStyle w:val="ListBullet"/>
-        <w:spacing w:after="40"/>
+        <w:spacing w:after="40" w:line="276" w:lineRule="auto"/>
       </w:pPr>
       <w:r>
         <w:t>Achats de matière brute plastique aux collecteurs (FCFA/kg).</w:t>
@@ -719,7 +719,7 @@
     <w:p>
       <w:pPr>
         <w:pStyle w:val="ListBullet"/>
-        <w:spacing w:after="40"/>
+        <w:spacing w:after="40" w:line="276" w:lineRule="auto"/>
       </w:pPr>
       <w:r>
         <w:t>Consommation d'énergie (Sbee triphasé + groupe secours) et carburant.</w:t>
@@ -728,7 +728,7 @@
     <w:p>
       <w:pPr>
         <w:pStyle w:val="ListBullet"/>
-        <w:spacing w:after="40"/>
+        <w:spacing w:after="40" w:line="276" w:lineRule="auto"/>
       </w:pPr>
       <w:r>
         <w:t>Masse salariale (10 personnes) et maintenance préventive.</w:t>
@@ -752,7 +752,7 @@
     <w:p>
       <w:pPr>
         <w:pStyle w:val="ListBullet"/>
-        <w:spacing w:after="40"/>
+        <w:spacing w:after="40" w:line="276" w:lineRule="auto"/>
       </w:pPr>
       <w:r>
         <w:t>Vente au tonnage de broyat PP calibré.</w:t>
@@ -761,7 +761,7 @@
     <w:p>
       <w:pPr>
         <w:pStyle w:val="ListBullet"/>
-        <w:spacing w:after="40"/>
+        <w:spacing w:after="40" w:line="276" w:lineRule="auto"/>
       </w:pPr>
       <w:r>
         <w:t>Vente au tonnage de broyat PEHD calibré.</w:t>
@@ -770,7 +770,7 @@
     <w:p>
       <w:pPr>
         <w:pStyle w:val="ListBullet"/>
-        <w:spacing w:after="40"/>
+        <w:spacing w:after="40" w:line="276" w:lineRule="auto"/>
       </w:pPr>
       <w:r>
         <w:t>Prestations de broyage à façon pour tiers.</w:t>
@@ -794,7 +794,7 @@
     <w:p>
       <w:pPr>
         <w:pStyle w:val="ListBullet"/>
-        <w:spacing w:after="60"/>
+        <w:spacing w:after="60" w:line="276" w:lineRule="auto"/>
       </w:pPr>
       <w:r>
         <w:rPr>
@@ -810,7 +810,7 @@
     <w:p>
       <w:pPr>
         <w:pStyle w:val="ListBullet"/>
-        <w:spacing w:after="60"/>
+        <w:spacing w:after="60" w:line="276" w:lineRule="auto"/>
       </w:pPr>
       <w:r>
         <w:rPr>
@@ -826,7 +826,7 @@
     <w:p>
       <w:pPr>
         <w:pStyle w:val="ListBullet"/>
-        <w:spacing w:after="60"/>
+        <w:spacing w:after="60" w:line="276" w:lineRule="auto"/>
       </w:pPr>
       <w:r>
         <w:rPr>
@@ -842,7 +842,7 @@
     <w:p>
       <w:pPr>
         <w:pStyle w:val="ListBullet"/>
-        <w:spacing w:after="60"/>
+        <w:spacing w:after="60" w:line="276" w:lineRule="auto"/>
       </w:pPr>
       <w:r>
         <w:rPr>
@@ -890,7 +890,7 @@
     </w:p>
     <w:p>
       <w:pPr>
-        <w:spacing w:before="60" w:after="60"/>
+        <w:spacing w:before="60" w:after="60" w:line="276" w:lineRule="auto"/>
       </w:pPr>
       <w:r>
         <w:rPr>
@@ -905,7 +905,7 @@
     </w:p>
     <w:p>
       <w:pPr>
-        <w:spacing w:before="60" w:after="60"/>
+        <w:spacing w:before="60" w:after="60" w:line="276" w:lineRule="auto"/>
       </w:pPr>
       <w:r>
         <w:rPr>
@@ -920,7 +920,7 @@
     </w:p>
     <w:p>
       <w:pPr>
-        <w:spacing w:before="60" w:after="60"/>
+        <w:spacing w:before="60" w:after="60" w:line="276" w:lineRule="auto"/>
       </w:pPr>
       <w:r>
         <w:rPr>
@@ -935,7 +935,7 @@
     </w:p>
     <w:p>
       <w:pPr>
-        <w:spacing w:before="60" w:after="60"/>
+        <w:spacing w:before="60" w:after="60" w:line="276" w:lineRule="auto"/>
       </w:pPr>
       <w:r>
         <w:rPr>
@@ -950,7 +950,7 @@
     </w:p>
     <w:p>
       <w:pPr>
-        <w:spacing w:before="60" w:after="60"/>
+        <w:spacing w:before="60" w:after="60" w:line="276" w:lineRule="auto"/>
       </w:pPr>
       <w:r>
         <w:rPr>
@@ -965,7 +965,7 @@
     </w:p>
     <w:p>
       <w:pPr>
-        <w:spacing w:before="60" w:after="60"/>
+        <w:spacing w:before="60" w:after="60" w:line="276" w:lineRule="auto"/>
       </w:pPr>
       <w:r>
         <w:rPr>
@@ -980,7 +980,7 @@
     </w:p>
     <w:p>
       <w:pPr>
-        <w:spacing w:before="60" w:after="60"/>
+        <w:spacing w:before="60" w:after="60" w:line="276" w:lineRule="auto"/>
       </w:pPr>
       <w:r>
         <w:rPr>
@@ -1026,7 +1026,7 @@
     <w:p>
       <w:pPr>
         <w:pStyle w:val="ListBullet"/>
-        <w:spacing w:after="40"/>
+        <w:spacing w:after="40" w:line="276" w:lineRule="auto"/>
       </w:pPr>
       <w:r>
         <w:t>Moteur : 11 kW (15 HP) - Triphasé 380V</w:t>
@@ -1035,7 +1035,7 @@
     <w:p>
       <w:pPr>
         <w:pStyle w:val="ListBullet"/>
-        <w:spacing w:after="40"/>
+        <w:spacing w:after="40" w:line="276" w:lineRule="auto"/>
       </w:pPr>
       <w:r>
         <w:t>Capacité nominale : 250 à 350 kg/heure</w:t>
@@ -1044,7 +1044,7 @@
     <w:p>
       <w:pPr>
         <w:pStyle w:val="ListBullet"/>
-        <w:spacing w:after="40"/>
+        <w:spacing w:after="40" w:line="276" w:lineRule="auto"/>
       </w:pPr>
       <w:r>
         <w:t>Rotor : 3 lames mobiles + 2 lames fixes en acier spécial anti-abrasion</w:t>
@@ -1053,7 +1053,7 @@
     <w:p>
       <w:pPr>
         <w:pStyle w:val="ListBullet"/>
-        <w:spacing w:after="40"/>
+        <w:spacing w:after="40" w:line="276" w:lineRule="auto"/>
       </w:pPr>
       <w:r>
         <w:t>Grille de calibrage : 8 mm / 10 mm interchangeable</w:t>
@@ -1077,7 +1077,7 @@
     <w:p>
       <w:pPr>
         <w:pStyle w:val="ListBullet"/>
-        <w:spacing w:after="40"/>
+        <w:spacing w:after="40" w:line="276" w:lineRule="auto"/>
       </w:pPr>
       <w:r>
         <w:t>Bacs inox / PEHD haute résistance de 3 000 Litres</w:t>
@@ -1086,7 +1086,7 @@
     <w:p>
       <w:pPr>
         <w:pStyle w:val="ListBullet"/>
-        <w:spacing w:after="40"/>
+        <w:spacing w:after="40" w:line="276" w:lineRule="auto"/>
       </w:pPr>
       <w:r>
         <w:t>Pompe de recirculation et filtres à débris</w:t>
@@ -1110,7 +1110,7 @@
     <w:p>
       <w:pPr>
         <w:pStyle w:val="ListBullet"/>
-        <w:spacing w:after="40"/>
+        <w:spacing w:after="40" w:line="276" w:lineRule="auto"/>
       </w:pPr>
       <w:r>
         <w:t>Séchoir centrifuge rotatif 3 kW</w:t>
@@ -1119,7 +1119,7 @@
     <w:p>
       <w:pPr>
         <w:pStyle w:val="ListBullet"/>
-        <w:spacing w:after="40"/>
+        <w:spacing w:after="40" w:line="276" w:lineRule="auto"/>
       </w:pPr>
       <w:r>
         <w:t>Zone de séchage sous serre thermiquement optimisée</w:t>
@@ -1143,7 +1143,7 @@
     <w:p>
       <w:pPr>
         <w:pStyle w:val="ListBullet"/>
-        <w:spacing w:after="40"/>
+        <w:spacing w:after="40" w:line="276" w:lineRule="auto"/>
       </w:pPr>
       <w:r>
         <w:t>Pèse-palette électronique de précision (capacité 2 tonnes, précision 500 g)</w:t>
@@ -1166,7 +1166,7 @@
     </w:p>
     <w:p>
       <w:pPr>
-        <w:spacing w:after="80"/>
+        <w:spacing w:after="80" w:line="276" w:lineRule="auto"/>
       </w:pPr>
       <w:r>
         <w:t>Conformément à l'expertise apportée par M. Pedro S. KPONON, l'unité de Kétou intègre les meilleurs standards ergonomiques et préventifs :</w:t>
@@ -1190,7 +1190,7 @@
     <w:p>
       <w:pPr>
         <w:pStyle w:val="ListBullet"/>
-        <w:spacing w:after="40"/>
+        <w:spacing w:after="40" w:line="276" w:lineRule="auto"/>
       </w:pPr>
       <w:r>
         <w:t>Tables de tri surélevées à hauteur réglable évitant les courbures lombaires.</w:t>
@@ -1199,7 +1199,7 @@
     <w:p>
       <w:pPr>
         <w:pStyle w:val="ListBullet"/>
-        <w:spacing w:after="40"/>
+        <w:spacing w:after="40" w:line="276" w:lineRule="auto"/>
       </w:pPr>
       <w:r>
         <w:t>Utilisation de transpalettes hydrauliques et gerbeurs pour supprimer le port manuel &gt; 25 kg.</w:t>
@@ -1223,7 +1223,7 @@
     <w:p>
       <w:pPr>
         <w:pStyle w:val="ListBullet"/>
-        <w:spacing w:after="40"/>
+        <w:spacing w:after="40" w:line="276" w:lineRule="auto"/>
       </w:pPr>
       <w:r>
         <w:t>Port obligatoire des EPI : Masques FFP2, casques anti-bruit / bouchons moulés (&lt; 85 dB), gants anti-coupure et chaussures S3.</w:t>
@@ -1247,7 +1247,7 @@
     <w:p>
       <w:pPr>
         <w:pStyle w:val="ListBullet"/>
-        <w:spacing w:after="40"/>
+        <w:spacing w:after="40" w:line="276" w:lineRule="auto"/>
       </w:pPr>
       <w:r>
         <w:t>Aspiration centralisée des poussières légères au niveau de la sortie du broyeur.</w:t>
@@ -1271,7 +1271,7 @@
     <w:p>
       <w:pPr>
         <w:pStyle w:val="ListBullet"/>
-        <w:spacing w:after="40"/>
+        <w:spacing w:after="40" w:line="276" w:lineRule="auto"/>
       </w:pPr>
       <w:r>
         <w:t>Rotation systématique des postes toutes les 2 heures entre le tri, le lavage et l'emballage.</w:t>
@@ -1280,7 +1280,7 @@
     <w:p>
       <w:pPr>
         <w:pStyle w:val="ListBullet"/>
-        <w:spacing w:after="40"/>
+        <w:spacing w:after="40" w:line="276" w:lineRule="auto"/>
       </w:pPr>
       <w:r>
         <w:t>Entretiens individuels réguliers de suivi psychologique du travail et gestion du stress.</w:t>
@@ -1307,7 +1307,7 @@
     <w:p>
       <w:pPr>
         <w:pStyle w:val="ListBullet"/>
-        <w:spacing w:after="60"/>
+        <w:spacing w:after="60" w:line="276" w:lineRule="auto"/>
       </w:pPr>
       <w:r>
         <w:rPr>
@@ -1323,7 +1323,7 @@
     <w:p>
       <w:pPr>
         <w:pStyle w:val="ListBullet"/>
-        <w:spacing w:after="60"/>
+        <w:spacing w:after="60" w:line="276" w:lineRule="auto"/>
       </w:pPr>
       <w:r>
         <w:rPr>
@@ -1339,7 +1339,7 @@
     <w:p>
       <w:pPr>
         <w:pStyle w:val="ListBullet"/>
-        <w:spacing w:after="60"/>
+        <w:spacing w:after="60" w:line="276" w:lineRule="auto"/>
       </w:pPr>
       <w:r>
         <w:rPr>
@@ -1355,7 +1355,7 @@
     <w:p>
       <w:pPr>
         <w:pStyle w:val="ListBullet"/>
-        <w:spacing w:after="60"/>
+        <w:spacing w:after="60" w:line="276" w:lineRule="auto"/>
       </w:pPr>
       <w:r>
         <w:rPr>
@@ -1371,7 +1371,7 @@
     <w:p>
       <w:pPr>
         <w:pStyle w:val="ListBullet"/>
-        <w:spacing w:after="60"/>
+        <w:spacing w:after="60" w:line="276" w:lineRule="auto"/>
       </w:pPr>
       <w:r>
         <w:rPr>
@@ -1387,7 +1387,7 @@
     <w:p>
       <w:pPr>
         <w:pStyle w:val="ListBullet"/>
-        <w:spacing w:after="60"/>
+        <w:spacing w:after="60" w:line="276" w:lineRule="auto"/>
       </w:pPr>
       <w:r>
         <w:rPr>
@@ -1420,7 +1420,7 @@
     </w:p>
     <w:p>
       <w:pPr>
-        <w:spacing w:after="120"/>
+        <w:spacing w:after="120" w:line="276" w:lineRule="auto"/>
       </w:pPr>
       <w:r>
         <w:t>(Tous les montants sont exprimés en Francs CFA - FCFA)</w:t>
@@ -1444,7 +1444,7 @@
     <w:p>
       <w:pPr>
         <w:pStyle w:val="ListBullet"/>
-        <w:spacing w:after="40"/>
+        <w:spacing w:after="40" w:line="276" w:lineRule="auto"/>
       </w:pPr>
       <w:r>
         <w:rPr>
@@ -1459,7 +1459,7 @@
     <w:p>
       <w:pPr>
         <w:pStyle w:val="ListBullet"/>
-        <w:spacing w:after="40"/>
+        <w:spacing w:after="40" w:line="276" w:lineRule="auto"/>
       </w:pPr>
       <w:r>
         <w:rPr>
@@ -1474,7 +1474,7 @@
     <w:p>
       <w:pPr>
         <w:pStyle w:val="ListBullet"/>
-        <w:spacing w:after="40"/>
+        <w:spacing w:after="40" w:line="276" w:lineRule="auto"/>
       </w:pPr>
       <w:r>
         <w:rPr>
@@ -1489,7 +1489,7 @@
     <w:p>
       <w:pPr>
         <w:pStyle w:val="ListBullet"/>
-        <w:spacing w:after="40"/>
+        <w:spacing w:after="40" w:line="276" w:lineRule="auto"/>
       </w:pPr>
       <w:r>
         <w:rPr>
@@ -1504,7 +1504,7 @@
     <w:p>
       <w:pPr>
         <w:pStyle w:val="ListBullet"/>
-        <w:spacing w:after="40"/>
+        <w:spacing w:after="40" w:line="276" w:lineRule="auto"/>
       </w:pPr>
       <w:r>
         <w:rPr>
@@ -1519,7 +1519,7 @@
     <w:p>
       <w:pPr>
         <w:pStyle w:val="ListBullet"/>
-        <w:spacing w:after="40"/>
+        <w:spacing w:after="40" w:line="276" w:lineRule="auto"/>
       </w:pPr>
       <w:r>
         <w:rPr>
@@ -1561,14 +1561,14 @@
         </w:tblBorders>
       </w:tblPr>
       <w:tblGrid>
-        <w:gridCol w:w="3120"/>
-        <w:gridCol w:w="3120"/>
-        <w:gridCol w:w="3120"/>
+        <w:gridCol w:w="3010"/>
+        <w:gridCol w:w="3010"/>
+        <w:gridCol w:w="3010"/>
       </w:tblGrid>
       <w:tr>
         <w:tc>
           <w:tcPr>
-            <w:tcW w:type="dxa" w:w="3120"/>
+            <w:tcW w:type="dxa" w:w="3010"/>
             <w:shd w:fill="0E2C43"/>
             <w:tcMar>
               <w:top w:w="140" w:type="dxa"/>
@@ -1594,7 +1594,7 @@
         </w:tc>
         <w:tc>
           <w:tcPr>
-            <w:tcW w:type="dxa" w:w="3120"/>
+            <w:tcW w:type="dxa" w:w="3010"/>
             <w:shd w:fill="0E2C43"/>
             <w:tcMar>
               <w:top w:w="140" w:type="dxa"/>
@@ -1620,7 +1620,7 @@
         </w:tc>
         <w:tc>
           <w:tcPr>
-            <w:tcW w:type="dxa" w:w="3120"/>
+            <w:tcW w:type="dxa" w:w="3010"/>
             <w:shd w:fill="0E2C43"/>
             <w:tcMar>
               <w:top w:w="140" w:type="dxa"/>
@@ -1648,7 +1648,7 @@
       <w:tr>
         <w:tc>
           <w:tcPr>
-            <w:tcW w:type="dxa" w:w="3120"/>
+            <w:tcW w:type="dxa" w:w="3010"/>
             <w:shd w:fill="FFFFFF"/>
             <w:tcMar>
               <w:top w:w="120" w:type="dxa"/>
@@ -1673,7 +1673,7 @@
         </w:tc>
         <w:tc>
           <w:tcPr>
-            <w:tcW w:type="dxa" w:w="3120"/>
+            <w:tcW w:type="dxa" w:w="3010"/>
             <w:shd w:fill="FFFFFF"/>
             <w:tcMar>
               <w:top w:w="120" w:type="dxa"/>
@@ -1697,7 +1697,7 @@
         </w:tc>
         <w:tc>
           <w:tcPr>
-            <w:tcW w:type="dxa" w:w="3120"/>
+            <w:tcW w:type="dxa" w:w="3010"/>
             <w:shd w:fill="FFFFFF"/>
             <w:tcMar>
               <w:top w:w="120" w:type="dxa"/>
@@ -1723,7 +1723,7 @@
       <w:tr>
         <w:tc>
           <w:tcPr>
-            <w:tcW w:type="dxa" w:w="3120"/>
+            <w:tcW w:type="dxa" w:w="3010"/>
             <w:shd w:fill="F9FAFC"/>
             <w:tcMar>
               <w:top w:w="120" w:type="dxa"/>
@@ -1748,7 +1748,7 @@
         </w:tc>
         <w:tc>
           <w:tcPr>
-            <w:tcW w:type="dxa" w:w="3120"/>
+            <w:tcW w:type="dxa" w:w="3010"/>
             <w:shd w:fill="F9FAFC"/>
             <w:tcMar>
               <w:top w:w="120" w:type="dxa"/>
@@ -1772,7 +1772,7 @@
         </w:tc>
         <w:tc>
           <w:tcPr>
-            <w:tcW w:type="dxa" w:w="3120"/>
+            <w:tcW w:type="dxa" w:w="3010"/>
             <w:shd w:fill="F9FAFC"/>
             <w:tcMar>
               <w:top w:w="120" w:type="dxa"/>
@@ -1798,7 +1798,7 @@
       <w:tr>
         <w:tc>
           <w:tcPr>
-            <w:tcW w:type="dxa" w:w="3120"/>
+            <w:tcW w:type="dxa" w:w="3010"/>
             <w:shd w:fill="FFFFFF"/>
             <w:tcMar>
               <w:top w:w="120" w:type="dxa"/>
@@ -1823,7 +1823,7 @@
         </w:tc>
         <w:tc>
           <w:tcPr>
-            <w:tcW w:type="dxa" w:w="3120"/>
+            <w:tcW w:type="dxa" w:w="3010"/>
             <w:shd w:fill="FFFFFF"/>
             <w:tcMar>
               <w:top w:w="120" w:type="dxa"/>
@@ -1847,7 +1847,7 @@
         </w:tc>
         <w:tc>
           <w:tcPr>
-            <w:tcW w:type="dxa" w:w="3120"/>
+            <w:tcW w:type="dxa" w:w="3010"/>
             <w:shd w:fill="FFFFFF"/>
             <w:tcMar>
               <w:top w:w="120" w:type="dxa"/>
@@ -1873,7 +1873,7 @@
       <w:tr>
         <w:tc>
           <w:tcPr>
-            <w:tcW w:type="dxa" w:w="3120"/>
+            <w:tcW w:type="dxa" w:w="3010"/>
             <w:shd w:fill="F9FAFC"/>
             <w:tcMar>
               <w:top w:w="120" w:type="dxa"/>
@@ -1898,7 +1898,7 @@
         </w:tc>
         <w:tc>
           <w:tcPr>
-            <w:tcW w:type="dxa" w:w="3120"/>
+            <w:tcW w:type="dxa" w:w="3010"/>
             <w:shd w:fill="F9FAFC"/>
             <w:tcMar>
               <w:top w:w="120" w:type="dxa"/>
@@ -1922,7 +1922,7 @@
         </w:tc>
         <w:tc>
           <w:tcPr>
-            <w:tcW w:type="dxa" w:w="3120"/>
+            <w:tcW w:type="dxa" w:w="3010"/>
             <w:shd w:fill="F9FAFC"/>
             <w:tcMar>
               <w:top w:w="120" w:type="dxa"/>
@@ -1948,7 +1948,7 @@
       <w:tr>
         <w:tc>
           <w:tcPr>
-            <w:tcW w:type="dxa" w:w="3120"/>
+            <w:tcW w:type="dxa" w:w="3010"/>
             <w:shd w:fill="FFFFFF"/>
             <w:tcMar>
               <w:top w:w="120" w:type="dxa"/>
@@ -1973,7 +1973,7 @@
         </w:tc>
         <w:tc>
           <w:tcPr>
-            <w:tcW w:type="dxa" w:w="3120"/>
+            <w:tcW w:type="dxa" w:w="3010"/>
             <w:shd w:fill="FFFFFF"/>
             <w:tcMar>
               <w:top w:w="120" w:type="dxa"/>
@@ -1997,7 +1997,7 @@
         </w:tc>
         <w:tc>
           <w:tcPr>
-            <w:tcW w:type="dxa" w:w="3120"/>
+            <w:tcW w:type="dxa" w:w="3010"/>
             <w:shd w:fill="FFFFFF"/>
             <w:tcMar>
               <w:top w:w="120" w:type="dxa"/>
@@ -2023,7 +2023,7 @@
       <w:tr>
         <w:tc>
           <w:tcPr>
-            <w:tcW w:type="dxa" w:w="3120"/>
+            <w:tcW w:type="dxa" w:w="3010"/>
             <w:shd w:fill="F9FAFC"/>
             <w:tcMar>
               <w:top w:w="120" w:type="dxa"/>
@@ -2048,7 +2048,7 @@
         </w:tc>
         <w:tc>
           <w:tcPr>
-            <w:tcW w:type="dxa" w:w="3120"/>
+            <w:tcW w:type="dxa" w:w="3010"/>
             <w:shd w:fill="F9FAFC"/>
             <w:tcMar>
               <w:top w:w="120" w:type="dxa"/>
@@ -2072,7 +2072,7 @@
         </w:tc>
         <w:tc>
           <w:tcPr>
-            <w:tcW w:type="dxa" w:w="3120"/>
+            <w:tcW w:type="dxa" w:w="3010"/>
             <w:shd w:fill="F9FAFC"/>
             <w:tcMar>
               <w:top w:w="120" w:type="dxa"/>
@@ -2098,7 +2098,7 @@
       <w:tr>
         <w:tc>
           <w:tcPr>
-            <w:tcW w:type="dxa" w:w="3120"/>
+            <w:tcW w:type="dxa" w:w="3010"/>
             <w:shd w:fill="FFFFFF"/>
             <w:tcMar>
               <w:top w:w="120" w:type="dxa"/>
@@ -2123,7 +2123,7 @@
         </w:tc>
         <w:tc>
           <w:tcPr>
-            <w:tcW w:type="dxa" w:w="3120"/>
+            <w:tcW w:type="dxa" w:w="3010"/>
             <w:shd w:fill="FFFFFF"/>
             <w:tcMar>
               <w:top w:w="120" w:type="dxa"/>
@@ -2147,7 +2147,7 @@
         </w:tc>
         <w:tc>
           <w:tcPr>
-            <w:tcW w:type="dxa" w:w="3120"/>
+            <w:tcW w:type="dxa" w:w="3010"/>
             <w:shd w:fill="FFFFFF"/>
             <w:tcMar>
               <w:top w:w="120" w:type="dxa"/>
@@ -2173,7 +2173,7 @@
       <w:tr>
         <w:tc>
           <w:tcPr>
-            <w:tcW w:type="dxa" w:w="3120"/>
+            <w:tcW w:type="dxa" w:w="3010"/>
             <w:shd w:fill="EAEFF5"/>
             <w:tcMar>
               <w:top w:w="120" w:type="dxa"/>
@@ -2199,7 +2199,7 @@
         </w:tc>
         <w:tc>
           <w:tcPr>
-            <w:tcW w:type="dxa" w:w="3120"/>
+            <w:tcW w:type="dxa" w:w="3010"/>
             <w:shd w:fill="EAEFF5"/>
             <w:tcMar>
               <w:top w:w="120" w:type="dxa"/>
@@ -2225,7 +2225,7 @@
         </w:tc>
         <w:tc>
           <w:tcPr>
-            <w:tcW w:type="dxa" w:w="3120"/>
+            <w:tcW w:type="dxa" w:w="3010"/>
             <w:shd w:fill="EAEFF5"/>
             <w:tcMar>
               <w:top w:w="120" w:type="dxa"/>
@@ -2286,14 +2286,14 @@
         </w:tblBorders>
       </w:tblPr>
       <w:tblGrid>
-        <w:gridCol w:w="3120"/>
-        <w:gridCol w:w="3120"/>
-        <w:gridCol w:w="3120"/>
+        <w:gridCol w:w="3010"/>
+        <w:gridCol w:w="3010"/>
+        <w:gridCol w:w="3010"/>
       </w:tblGrid>
       <w:tr>
         <w:tc>
           <w:tcPr>
-            <w:tcW w:type="dxa" w:w="3120"/>
+            <w:tcW w:type="dxa" w:w="3010"/>
             <w:shd w:fill="0E2C43"/>
             <w:tcMar>
               <w:top w:w="140" w:type="dxa"/>
@@ -2319,7 +2319,7 @@
         </w:tc>
         <w:tc>
           <w:tcPr>
-            <w:tcW w:type="dxa" w:w="3120"/>
+            <w:tcW w:type="dxa" w:w="3010"/>
             <w:shd w:fill="0E2C43"/>
             <w:tcMar>
               <w:top w:w="140" w:type="dxa"/>
@@ -2345,7 +2345,7 @@
         </w:tc>
         <w:tc>
           <w:tcPr>
-            <w:tcW w:type="dxa" w:w="3120"/>
+            <w:tcW w:type="dxa" w:w="3010"/>
             <w:shd w:fill="0E2C43"/>
             <w:tcMar>
               <w:top w:w="140" w:type="dxa"/>
@@ -2373,7 +2373,7 @@
       <w:tr>
         <w:tc>
           <w:tcPr>
-            <w:tcW w:type="dxa" w:w="3120"/>
+            <w:tcW w:type="dxa" w:w="3010"/>
             <w:shd w:fill="FFFFFF"/>
             <w:tcMar>
               <w:top w:w="120" w:type="dxa"/>
@@ -2398,7 +2398,7 @@
         </w:tc>
         <w:tc>
           <w:tcPr>
-            <w:tcW w:type="dxa" w:w="3120"/>
+            <w:tcW w:type="dxa" w:w="3010"/>
             <w:shd w:fill="FFFFFF"/>
             <w:tcMar>
               <w:top w:w="120" w:type="dxa"/>
@@ -2422,7 +2422,7 @@
         </w:tc>
         <w:tc>
           <w:tcPr>
-            <w:tcW w:type="dxa" w:w="3120"/>
+            <w:tcW w:type="dxa" w:w="3010"/>
             <w:shd w:fill="FFFFFF"/>
             <w:tcMar>
               <w:top w:w="120" w:type="dxa"/>
@@ -2448,7 +2448,7 @@
       <w:tr>
         <w:tc>
           <w:tcPr>
-            <w:tcW w:type="dxa" w:w="3120"/>
+            <w:tcW w:type="dxa" w:w="3010"/>
             <w:shd w:fill="F9FAFC"/>
             <w:tcMar>
               <w:top w:w="120" w:type="dxa"/>
@@ -2473,7 +2473,7 @@
         </w:tc>
         <w:tc>
           <w:tcPr>
-            <w:tcW w:type="dxa" w:w="3120"/>
+            <w:tcW w:type="dxa" w:w="3010"/>
             <w:shd w:fill="F9FAFC"/>
             <w:tcMar>
               <w:top w:w="120" w:type="dxa"/>
@@ -2497,7 +2497,7 @@
         </w:tc>
         <w:tc>
           <w:tcPr>
-            <w:tcW w:type="dxa" w:w="3120"/>
+            <w:tcW w:type="dxa" w:w="3010"/>
             <w:shd w:fill="F9FAFC"/>
             <w:tcMar>
               <w:top w:w="120" w:type="dxa"/>
@@ -2523,7 +2523,7 @@
       <w:tr>
         <w:tc>
           <w:tcPr>
-            <w:tcW w:type="dxa" w:w="3120"/>
+            <w:tcW w:type="dxa" w:w="3010"/>
             <w:shd w:fill="FFFFFF"/>
             <w:tcMar>
               <w:top w:w="120" w:type="dxa"/>
@@ -2548,7 +2548,7 @@
         </w:tc>
         <w:tc>
           <w:tcPr>
-            <w:tcW w:type="dxa" w:w="3120"/>
+            <w:tcW w:type="dxa" w:w="3010"/>
             <w:shd w:fill="FFFFFF"/>
             <w:tcMar>
               <w:top w:w="120" w:type="dxa"/>
@@ -2572,7 +2572,7 @@
         </w:tc>
         <w:tc>
           <w:tcPr>
-            <w:tcW w:type="dxa" w:w="3120"/>
+            <w:tcW w:type="dxa" w:w="3010"/>
             <w:shd w:fill="FFFFFF"/>
             <w:tcMar>
               <w:top w:w="120" w:type="dxa"/>
@@ -2598,7 +2598,7 @@
       <w:tr>
         <w:tc>
           <w:tcPr>
-            <w:tcW w:type="dxa" w:w="3120"/>
+            <w:tcW w:type="dxa" w:w="3010"/>
             <w:shd w:fill="F9FAFC"/>
             <w:tcMar>
               <w:top w:w="120" w:type="dxa"/>
@@ -2623,7 +2623,7 @@
         </w:tc>
         <w:tc>
           <w:tcPr>
-            <w:tcW w:type="dxa" w:w="3120"/>
+            <w:tcW w:type="dxa" w:w="3010"/>
             <w:shd w:fill="F9FAFC"/>
             <w:tcMar>
               <w:top w:w="120" w:type="dxa"/>
@@ -2647,7 +2647,7 @@
         </w:tc>
         <w:tc>
           <w:tcPr>
-            <w:tcW w:type="dxa" w:w="3120"/>
+            <w:tcW w:type="dxa" w:w="3010"/>
             <w:shd w:fill="F9FAFC"/>
             <w:tcMar>
               <w:top w:w="120" w:type="dxa"/>
@@ -2673,7 +2673,7 @@
       <w:tr>
         <w:tc>
           <w:tcPr>
-            <w:tcW w:type="dxa" w:w="3120"/>
+            <w:tcW w:type="dxa" w:w="3010"/>
             <w:shd w:fill="FFFFFF"/>
             <w:tcMar>
               <w:top w:w="120" w:type="dxa"/>
@@ -2698,7 +2698,7 @@
         </w:tc>
         <w:tc>
           <w:tcPr>
-            <w:tcW w:type="dxa" w:w="3120"/>
+            <w:tcW w:type="dxa" w:w="3010"/>
             <w:shd w:fill="FFFFFF"/>
             <w:tcMar>
               <w:top w:w="120" w:type="dxa"/>
@@ -2722,7 +2722,7 @@
         </w:tc>
         <w:tc>
           <w:tcPr>
-            <w:tcW w:type="dxa" w:w="3120"/>
+            <w:tcW w:type="dxa" w:w="3010"/>
             <w:shd w:fill="FFFFFF"/>
             <w:tcMar>
               <w:top w:w="120" w:type="dxa"/>
@@ -2748,7 +2748,7 @@
       <w:tr>
         <w:tc>
           <w:tcPr>
-            <w:tcW w:type="dxa" w:w="3120"/>
+            <w:tcW w:type="dxa" w:w="3010"/>
             <w:shd w:fill="F9FAFC"/>
             <w:tcMar>
               <w:top w:w="120" w:type="dxa"/>
@@ -2773,7 +2773,7 @@
         </w:tc>
         <w:tc>
           <w:tcPr>
-            <w:tcW w:type="dxa" w:w="3120"/>
+            <w:tcW w:type="dxa" w:w="3010"/>
             <w:shd w:fill="F9FAFC"/>
             <w:tcMar>
               <w:top w:w="120" w:type="dxa"/>
@@ -2797,7 +2797,7 @@
         </w:tc>
         <w:tc>
           <w:tcPr>
-            <w:tcW w:type="dxa" w:w="3120"/>
+            <w:tcW w:type="dxa" w:w="3010"/>
             <w:shd w:fill="F9FAFC"/>
             <w:tcMar>
               <w:top w:w="120" w:type="dxa"/>
@@ -2823,7 +2823,7 @@
       <w:tr>
         <w:tc>
           <w:tcPr>
-            <w:tcW w:type="dxa" w:w="3120"/>
+            <w:tcW w:type="dxa" w:w="3010"/>
             <w:shd w:fill="EAEFF5"/>
             <w:tcMar>
               <w:top w:w="120" w:type="dxa"/>
@@ -2849,7 +2849,7 @@
         </w:tc>
         <w:tc>
           <w:tcPr>
-            <w:tcW w:type="dxa" w:w="3120"/>
+            <w:tcW w:type="dxa" w:w="3010"/>
             <w:shd w:fill="EAEFF5"/>
             <w:tcMar>
               <w:top w:w="120" w:type="dxa"/>
@@ -2875,7 +2875,7 @@
         </w:tc>
         <w:tc>
           <w:tcPr>
-            <w:tcW w:type="dxa" w:w="3120"/>
+            <w:tcW w:type="dxa" w:w="3010"/>
             <w:shd w:fill="EAEFF5"/>
             <w:tcMar>
               <w:top w:w="120" w:type="dxa"/>
@@ -2936,14 +2936,14 @@
         </w:tblBorders>
       </w:tblPr>
       <w:tblGrid>
-        <w:gridCol w:w="3120"/>
-        <w:gridCol w:w="3120"/>
-        <w:gridCol w:w="3120"/>
+        <w:gridCol w:w="3010"/>
+        <w:gridCol w:w="3010"/>
+        <w:gridCol w:w="3010"/>
       </w:tblGrid>
       <w:tr>
         <w:tc>
           <w:tcPr>
-            <w:tcW w:type="dxa" w:w="3120"/>
+            <w:tcW w:type="dxa" w:w="3010"/>
             <w:shd w:fill="0E2C43"/>
             <w:tcMar>
               <w:top w:w="140" w:type="dxa"/>
@@ -2969,7 +2969,7 @@
         </w:tc>
         <w:tc>
           <w:tcPr>
-            <w:tcW w:type="dxa" w:w="3120"/>
+            <w:tcW w:type="dxa" w:w="3010"/>
             <w:shd w:fill="0E2C43"/>
             <w:tcMar>
               <w:top w:w="140" w:type="dxa"/>
@@ -2995,7 +2995,7 @@
         </w:tc>
         <w:tc>
           <w:tcPr>
-            <w:tcW w:type="dxa" w:w="3120"/>
+            <w:tcW w:type="dxa" w:w="3010"/>
             <w:shd w:fill="0E2C43"/>
             <w:tcMar>
               <w:top w:w="140" w:type="dxa"/>
@@ -3023,7 +3023,7 @@
       <w:tr>
         <w:tc>
           <w:tcPr>
-            <w:tcW w:type="dxa" w:w="3120"/>
+            <w:tcW w:type="dxa" w:w="3010"/>
             <w:shd w:fill="FFFFFF"/>
             <w:tcMar>
               <w:top w:w="120" w:type="dxa"/>
@@ -3048,7 +3048,7 @@
         </w:tc>
         <w:tc>
           <w:tcPr>
-            <w:tcW w:type="dxa" w:w="3120"/>
+            <w:tcW w:type="dxa" w:w="3010"/>
             <w:shd w:fill="FFFFFF"/>
             <w:tcMar>
               <w:top w:w="120" w:type="dxa"/>
@@ -3072,7 +3072,7 @@
         </w:tc>
         <w:tc>
           <w:tcPr>
-            <w:tcW w:type="dxa" w:w="3120"/>
+            <w:tcW w:type="dxa" w:w="3010"/>
             <w:shd w:fill="FFFFFF"/>
             <w:tcMar>
               <w:top w:w="120" w:type="dxa"/>
@@ -3098,7 +3098,7 @@
       <w:tr>
         <w:tc>
           <w:tcPr>
-            <w:tcW w:type="dxa" w:w="3120"/>
+            <w:tcW w:type="dxa" w:w="3010"/>
             <w:shd w:fill="F9FAFC"/>
             <w:tcMar>
               <w:top w:w="120" w:type="dxa"/>
@@ -3123,7 +3123,7 @@
         </w:tc>
         <w:tc>
           <w:tcPr>
-            <w:tcW w:type="dxa" w:w="3120"/>
+            <w:tcW w:type="dxa" w:w="3010"/>
             <w:shd w:fill="F9FAFC"/>
             <w:tcMar>
               <w:top w:w="120" w:type="dxa"/>
@@ -3147,7 +3147,7 @@
         </w:tc>
         <w:tc>
           <w:tcPr>
-            <w:tcW w:type="dxa" w:w="3120"/>
+            <w:tcW w:type="dxa" w:w="3010"/>
             <w:shd w:fill="F9FAFC"/>
             <w:tcMar>
               <w:top w:w="120" w:type="dxa"/>
@@ -3173,7 +3173,7 @@
       <w:tr>
         <w:tc>
           <w:tcPr>
-            <w:tcW w:type="dxa" w:w="3120"/>
+            <w:tcW w:type="dxa" w:w="3010"/>
             <w:shd w:fill="FFFFFF"/>
             <w:tcMar>
               <w:top w:w="120" w:type="dxa"/>
@@ -3198,7 +3198,7 @@
         </w:tc>
         <w:tc>
           <w:tcPr>
-            <w:tcW w:type="dxa" w:w="3120"/>
+            <w:tcW w:type="dxa" w:w="3010"/>
             <w:shd w:fill="FFFFFF"/>
             <w:tcMar>
               <w:top w:w="120" w:type="dxa"/>
@@ -3222,7 +3222,7 @@
         </w:tc>
         <w:tc>
           <w:tcPr>
-            <w:tcW w:type="dxa" w:w="3120"/>
+            <w:tcW w:type="dxa" w:w="3010"/>
             <w:shd w:fill="FFFFFF"/>
             <w:tcMar>
               <w:top w:w="120" w:type="dxa"/>
@@ -3248,7 +3248,7 @@
       <w:tr>
         <w:tc>
           <w:tcPr>
-            <w:tcW w:type="dxa" w:w="3120"/>
+            <w:tcW w:type="dxa" w:w="3010"/>
             <w:shd w:fill="F9FAFC"/>
             <w:tcMar>
               <w:top w:w="120" w:type="dxa"/>
@@ -3273,7 +3273,7 @@
         </w:tc>
         <w:tc>
           <w:tcPr>
-            <w:tcW w:type="dxa" w:w="3120"/>
+            <w:tcW w:type="dxa" w:w="3010"/>
             <w:shd w:fill="F9FAFC"/>
             <w:tcMar>
               <w:top w:w="120" w:type="dxa"/>
@@ -3297,7 +3297,7 @@
         </w:tc>
         <w:tc>
           <w:tcPr>
-            <w:tcW w:type="dxa" w:w="3120"/>
+            <w:tcW w:type="dxa" w:w="3010"/>
             <w:shd w:fill="F9FAFC"/>
             <w:tcMar>
               <w:top w:w="120" w:type="dxa"/>
@@ -3323,7 +3323,7 @@
       <w:tr>
         <w:tc>
           <w:tcPr>
-            <w:tcW w:type="dxa" w:w="3120"/>
+            <w:tcW w:type="dxa" w:w="3010"/>
             <w:shd w:fill="FFFFFF"/>
             <w:tcMar>
               <w:top w:w="120" w:type="dxa"/>
@@ -3348,7 +3348,7 @@
         </w:tc>
         <w:tc>
           <w:tcPr>
-            <w:tcW w:type="dxa" w:w="3120"/>
+            <w:tcW w:type="dxa" w:w="3010"/>
             <w:shd w:fill="FFFFFF"/>
             <w:tcMar>
               <w:top w:w="120" w:type="dxa"/>
@@ -3372,7 +3372,7 @@
         </w:tc>
         <w:tc>
           <w:tcPr>
-            <w:tcW w:type="dxa" w:w="3120"/>
+            <w:tcW w:type="dxa" w:w="3010"/>
             <w:shd w:fill="FFFFFF"/>
             <w:tcMar>
               <w:top w:w="120" w:type="dxa"/>
@@ -3398,7 +3398,7 @@
       <w:tr>
         <w:tc>
           <w:tcPr>
-            <w:tcW w:type="dxa" w:w="3120"/>
+            <w:tcW w:type="dxa" w:w="3010"/>
             <w:shd w:fill="F9FAFC"/>
             <w:tcMar>
               <w:top w:w="120" w:type="dxa"/>
@@ -3423,7 +3423,7 @@
         </w:tc>
         <w:tc>
           <w:tcPr>
-            <w:tcW w:type="dxa" w:w="3120"/>
+            <w:tcW w:type="dxa" w:w="3010"/>
             <w:shd w:fill="F9FAFC"/>
             <w:tcMar>
               <w:top w:w="120" w:type="dxa"/>
@@ -3447,7 +3447,7 @@
         </w:tc>
         <w:tc>
           <w:tcPr>
-            <w:tcW w:type="dxa" w:w="3120"/>
+            <w:tcW w:type="dxa" w:w="3010"/>
             <w:shd w:fill="F9FAFC"/>
             <w:tcMar>
               <w:top w:w="120" w:type="dxa"/>
@@ -3473,7 +3473,7 @@
       <w:tr>
         <w:tc>
           <w:tcPr>
-            <w:tcW w:type="dxa" w:w="3120"/>
+            <w:tcW w:type="dxa" w:w="3010"/>
             <w:shd w:fill="FFFFFF"/>
             <w:tcMar>
               <w:top w:w="120" w:type="dxa"/>
@@ -3498,7 +3498,7 @@
         </w:tc>
         <w:tc>
           <w:tcPr>
-            <w:tcW w:type="dxa" w:w="3120"/>
+            <w:tcW w:type="dxa" w:w="3010"/>
             <w:shd w:fill="FFFFFF"/>
             <w:tcMar>
               <w:top w:w="120" w:type="dxa"/>
@@ -3522,7 +3522,7 @@
         </w:tc>
         <w:tc>
           <w:tcPr>
-            <w:tcW w:type="dxa" w:w="3120"/>
+            <w:tcW w:type="dxa" w:w="3010"/>
             <w:shd w:fill="FFFFFF"/>
             <w:tcMar>
               <w:top w:w="120" w:type="dxa"/>
@@ -3569,7 +3569,7 @@
     <w:p>
       <w:pPr>
         <w:pStyle w:val="ListBullet"/>
-        <w:spacing w:after="40"/>
+        <w:spacing w:after="40" w:line="276" w:lineRule="auto"/>
       </w:pPr>
       <w:r>
         <w:rPr>
@@ -3584,7 +3584,7 @@
     <w:p>
       <w:pPr>
         <w:pStyle w:val="ListBullet"/>
-        <w:spacing w:after="40"/>
+        <w:spacing w:after="40" w:line="276" w:lineRule="auto"/>
       </w:pPr>
       <w:r>
         <w:rPr>
@@ -3599,7 +3599,7 @@
     <w:p>
       <w:pPr>
         <w:pStyle w:val="ListBullet"/>
-        <w:spacing w:after="40"/>
+        <w:spacing w:after="40" w:line="276" w:lineRule="auto"/>
       </w:pPr>
       <w:r>
         <w:rPr>
@@ -3614,7 +3614,7 @@
     <w:p>
       <w:pPr>
         <w:pStyle w:val="ListBullet"/>
-        <w:spacing w:after="40"/>
+        <w:spacing w:after="40" w:line="276" w:lineRule="auto"/>
       </w:pPr>
       <w:r>
         <w:rPr>
@@ -3659,14 +3659,14 @@
         </w:tblBorders>
       </w:tblPr>
       <w:tblGrid>
-        <w:gridCol w:w="3120"/>
-        <w:gridCol w:w="3120"/>
-        <w:gridCol w:w="3120"/>
+        <w:gridCol w:w="3010"/>
+        <w:gridCol w:w="3010"/>
+        <w:gridCol w:w="3010"/>
       </w:tblGrid>
       <w:tr>
         <w:tc>
           <w:tcPr>
-            <w:tcW w:type="dxa" w:w="3120"/>
+            <w:tcW w:type="dxa" w:w="3010"/>
             <w:shd w:fill="0E2C43"/>
             <w:tcMar>
               <w:top w:w="140" w:type="dxa"/>
@@ -3692,7 +3692,7 @@
         </w:tc>
         <w:tc>
           <w:tcPr>
-            <w:tcW w:type="dxa" w:w="3120"/>
+            <w:tcW w:type="dxa" w:w="3010"/>
             <w:shd w:fill="0E2C43"/>
             <w:tcMar>
               <w:top w:w="140" w:type="dxa"/>
@@ -3718,7 +3718,7 @@
         </w:tc>
         <w:tc>
           <w:tcPr>
-            <w:tcW w:type="dxa" w:w="3120"/>
+            <w:tcW w:type="dxa" w:w="3010"/>
             <w:shd w:fill="0E2C43"/>
             <w:tcMar>
               <w:top w:w="140" w:type="dxa"/>
@@ -3746,7 +3746,7 @@
       <w:tr>
         <w:tc>
           <w:tcPr>
-            <w:tcW w:type="dxa" w:w="3120"/>
+            <w:tcW w:type="dxa" w:w="3010"/>
             <w:shd w:fill="FFFFFF"/>
             <w:tcMar>
               <w:top w:w="120" w:type="dxa"/>
@@ -3771,7 +3771,7 @@
         </w:tc>
         <w:tc>
           <w:tcPr>
-            <w:tcW w:type="dxa" w:w="3120"/>
+            <w:tcW w:type="dxa" w:w="3010"/>
             <w:shd w:fill="FFFFFF"/>
             <w:tcMar>
               <w:top w:w="120" w:type="dxa"/>
@@ -3795,7 +3795,7 @@
         </w:tc>
         <w:tc>
           <w:tcPr>
-            <w:tcW w:type="dxa" w:w="3120"/>
+            <w:tcW w:type="dxa" w:w="3010"/>
             <w:shd w:fill="FFFFFF"/>
             <w:tcMar>
               <w:top w:w="120" w:type="dxa"/>
@@ -3821,7 +3821,7 @@
       <w:tr>
         <w:tc>
           <w:tcPr>
-            <w:tcW w:type="dxa" w:w="3120"/>
+            <w:tcW w:type="dxa" w:w="3010"/>
             <w:shd w:fill="F9FAFC"/>
             <w:tcMar>
               <w:top w:w="120" w:type="dxa"/>
@@ -3846,7 +3846,7 @@
         </w:tc>
         <w:tc>
           <w:tcPr>
-            <w:tcW w:type="dxa" w:w="3120"/>
+            <w:tcW w:type="dxa" w:w="3010"/>
             <w:shd w:fill="F9FAFC"/>
             <w:tcMar>
               <w:top w:w="120" w:type="dxa"/>
@@ -3870,7 +3870,7 @@
         </w:tc>
         <w:tc>
           <w:tcPr>
-            <w:tcW w:type="dxa" w:w="3120"/>
+            <w:tcW w:type="dxa" w:w="3010"/>
             <w:shd w:fill="F9FAFC"/>
             <w:tcMar>
               <w:top w:w="120" w:type="dxa"/>
@@ -3896,7 +3896,7 @@
       <w:tr>
         <w:tc>
           <w:tcPr>
-            <w:tcW w:type="dxa" w:w="3120"/>
+            <w:tcW w:type="dxa" w:w="3010"/>
             <w:shd w:fill="FFFFFF"/>
             <w:tcMar>
               <w:top w:w="120" w:type="dxa"/>
@@ -3921,7 +3921,7 @@
         </w:tc>
         <w:tc>
           <w:tcPr>
-            <w:tcW w:type="dxa" w:w="3120"/>
+            <w:tcW w:type="dxa" w:w="3010"/>
             <w:shd w:fill="FFFFFF"/>
             <w:tcMar>
               <w:top w:w="120" w:type="dxa"/>
@@ -3945,7 +3945,7 @@
         </w:tc>
         <w:tc>
           <w:tcPr>
-            <w:tcW w:type="dxa" w:w="3120"/>
+            <w:tcW w:type="dxa" w:w="3010"/>
             <w:shd w:fill="FFFFFF"/>
             <w:tcMar>
               <w:top w:w="120" w:type="dxa"/>
@@ -3971,7 +3971,7 @@
       <w:tr>
         <w:tc>
           <w:tcPr>
-            <w:tcW w:type="dxa" w:w="3120"/>
+            <w:tcW w:type="dxa" w:w="3010"/>
             <w:shd w:fill="F9FAFC"/>
             <w:tcMar>
               <w:top w:w="120" w:type="dxa"/>
@@ -3996,7 +3996,7 @@
         </w:tc>
         <w:tc>
           <w:tcPr>
-            <w:tcW w:type="dxa" w:w="3120"/>
+            <w:tcW w:type="dxa" w:w="3010"/>
             <w:shd w:fill="F9FAFC"/>
             <w:tcMar>
               <w:top w:w="120" w:type="dxa"/>
@@ -4020,7 +4020,7 @@
         </w:tc>
         <w:tc>
           <w:tcPr>
-            <w:tcW w:type="dxa" w:w="3120"/>
+            <w:tcW w:type="dxa" w:w="3010"/>
             <w:shd w:fill="F9FAFC"/>
             <w:tcMar>
               <w:top w:w="120" w:type="dxa"/>
@@ -4046,7 +4046,7 @@
       <w:tr>
         <w:tc>
           <w:tcPr>
-            <w:tcW w:type="dxa" w:w="3120"/>
+            <w:tcW w:type="dxa" w:w="3010"/>
             <w:shd w:fill="FFFFFF"/>
             <w:tcMar>
               <w:top w:w="120" w:type="dxa"/>
@@ -4071,7 +4071,7 @@
         </w:tc>
         <w:tc>
           <w:tcPr>
-            <w:tcW w:type="dxa" w:w="3120"/>
+            <w:tcW w:type="dxa" w:w="3010"/>
             <w:shd w:fill="FFFFFF"/>
             <w:tcMar>
               <w:top w:w="120" w:type="dxa"/>
@@ -4095,7 +4095,7 @@
         </w:tc>
         <w:tc>
           <w:tcPr>
-            <w:tcW w:type="dxa" w:w="3120"/>
+            <w:tcW w:type="dxa" w:w="3010"/>
             <w:shd w:fill="FFFFFF"/>
             <w:tcMar>
               <w:top w:w="120" w:type="dxa"/>
@@ -4144,7 +4144,7 @@
     </w:p>
     <w:p>
       <w:pPr>
-        <w:spacing w:after="120"/>
+        <w:spacing w:after="120" w:line="276" w:lineRule="auto"/>
       </w:pPr>
       <w:r>
         <w:t>Le projet porté par 18 EITHING SARL à Kétou combine une opportunité économique à haute rentabilité, une utilité écologique majeure pour la gestion des déchets au Bénin, et une gouvernance expérimentée et complémentaire.</w:t>
@@ -4157,12 +4157,12 @@
         <w:tblLook w:firstColumn="1" w:firstRow="1" w:lastColumn="0" w:lastRow="0" w:noHBand="0" w:noVBand="1" w:val="04A0"/>
       </w:tblPr>
       <w:tblGrid>
-        <w:gridCol w:w="9360"/>
+        <w:gridCol w:w="9029"/>
       </w:tblGrid>
       <w:tr>
         <w:tc>
           <w:tcPr>
-            <w:tcW w:type="dxa" w:w="9360"/>
+            <w:tcW w:type="dxa" w:w="9029"/>
             <w:shd w:fill="F4EFE9"/>
             <w:tcMar>
               <w:top w:w="180" w:type="dxa"/>
@@ -4193,7 +4193,7 @@
           </w:p>
           <w:p>
             <w:pPr>
-              <w:spacing w:before="40" w:after="0"/>
+              <w:spacing w:before="40" w:after="0" w:line="276" w:lineRule="auto"/>
             </w:pPr>
             <w:r>
               <w:rPr>
@@ -4215,7 +4215,7 @@
     </w:p>
     <w:p>
       <w:pPr>
-        <w:spacing w:before="320"/>
+        <w:spacing w:before="320" w:line="276" w:lineRule="auto"/>
         <w:jc w:val="right"/>
       </w:pPr>
       <w:r>
@@ -4236,7 +4236,7 @@
       </w:r>
     </w:p>
     <w:sectPr>
-      <w:pgSz w:w="12240" w:h="15840"/>
+      <w:pgSz w:w="11909" w:h="16834"/>
       <w:pgMar w:top="1440" w:right="1440" w:bottom="1440" w:left="1440" w:header="720" w:footer="720" w:gutter="0"/>
       <w:cols w:space="720"/>
       <w:docGrid w:linePitch="360"/>

</xml_diff>